<commit_message>
docs: normalize F-02 measurement package and chained task reviews
</commit_message>
<xml_diff>
--- a/human/project-review.docx
+++ b/human/project-review.docx
@@ -53,17 +53,58 @@
         <w:pStyle w:val="Heading1"/>
       </w:pPr>
       <w:r>
+        <w:t>F-02 研究设计</w:t>
+      </w:r>
+    </w:p>
+    <w:p>
+      <w:r>
+        <w:t>F-02注册状态为DONE，覆盖候选测量材料和模型AC审查。本轮已建立当前适用入口，替换旧联合门使用规则，复测通过45项步骤测量测试。未取得F-02真实第二人签收或真人测量证据。</w:t>
+      </w:r>
+    </w:p>
+    <w:p>
+      <w:r>
+        <w:t>F-02没有任务前置。它消费F-01后续F-05步骤合同、U12-02材料与U12-04结果规格；候选构念继续交给Q-01/Q-02。</w:t>
+      </w:r>
+    </w:p>
+    <w:p>
+      <w:r>
+        <w:t>Q-01/Q-02承担真实内容与认知过程验证，S-02提供独立标注，U-02/U-07提供同源片段。具体人员领取以注册表为准，不由本Word补填。</w:t>
+      </w:r>
+    </w:p>
+    <w:p>
+      <w:r>
+        <w:t>F02-N01 FIXED_CURRENT_USAGE：历史有序联合门与v1.2情绪报告规则冲突，当前使用入口已改为PANAS主结果与SCCI操纵检查分开</w:t>
+      </w:r>
+    </w:p>
+    <w:p>
+      <w:r>
+        <w:t>F02-N02 FIXED_CURRENT_USAGE：旧粗相位关系题和常识累计题由U12-02步骤实例及片段变化候选替代</w:t>
+      </w:r>
+    </w:p>
+    <w:p>
+      <w:r>
+        <w:t>F02-N03 OPEN_HUMAN_REVIEW：历史验收仅模型候选审查，所读来源未取得F-02真实第二人签署；责任由团队总监安排</w:t>
+      </w:r>
+    </w:p>
+    <w:p>
+      <w:pPr>
+        <w:pStyle w:val="Heading1"/>
+      </w:pPr>
+      <w:r>
         <w:t>待整理队列</w:t>
       </w:r>
     </w:p>
     <w:p>
+      <w:pPr>
+        <w:keepNext/>
+      </w:pPr>
       <w:r>
-        <w:t>已整理1包，待整理70包。</w:t>
+        <w:t>已整理2包，待整理69包。</w:t>
       </w:r>
     </w:p>
     <w:p>
       <w:r>
-        <w:t>F-02、F-03、F-04、F-05、G-01、G-02、P-01、P-02、U-01、U-02、T-01、R-01、V-01、V-02、V-03、V-04、D-01、D-02、S-01、S-02、V-05、U-03、U-04、U-05、U-06、U-07、U-08、T-02、A-01、A-02、A-03、W-01、I-01、Q-01、Q-02、Q-03、X-01、X-02、X-03、Z-01、G-05、E-01、E-02、B-01、E-03、G-03、B-02、E-04、A-05、E-05、G-04、B-03、E-06、A-04、A-06、W-02、W-03、W-04、U12-01、U12-02、U12-03、U12-04、U12-05、U12-06、U12-07、U12-08、U12-09、U12-10、U12-11、U12-12</w:t>
+        <w:t>F-03、F-04、F-05、G-01、G-02、P-01、P-02、U-01、U-02、T-01、R-01、V-01、V-02、V-03、V-04、D-01、D-02、S-01、S-02、V-05、U-03、U-04、U-05、U-06、U-07、U-08、T-02、A-01、A-02、A-03、W-01、I-01、Q-01、Q-02、Q-03、X-01、X-02、X-03、Z-01、G-05、E-01、E-02、B-01、E-03、G-03、B-02、E-04、A-05、E-05、G-04、B-03、E-06、A-04、A-06、W-02、W-03、W-04、U12-01、U12-02、U12-03、U12-04、U12-05、U12-06、U12-07、U12-08、U12-09、U12-10、U12-11、U12-12</w:t>
       </w:r>
     </w:p>
     <w:p>

</xml_diff>

<commit_message>
docs: close F-03 normalization with current Unity evidence and Word review
</commit_message>
<xml_diff>
--- a/human/project-review.docx
+++ b/human/project-review.docx
@@ -91,6 +91,49 @@
         <w:pStyle w:val="Heading1"/>
       </w:pPr>
       <w:r>
+        <w:t>F-03 Unity</w:t>
+      </w:r>
+    </w:p>
+    <w:p>
+      <w:r>
+        <w:t>F-03历史已签收DONE。本轮将根Tools执行文件迁入Agent任务层，修正协调文档和负测试误报，完成真实Unity全流程复测。工程基线通过，正式资产许可门仍阻断。</w:t>
+      </w:r>
+    </w:p>
+    <w:p>
+      <w:r>
+        <w:t>F-03无注册前置。F-01/F-05提供接口版本，Python仍拥有流程与时钟权威。U-01/U-02/V-05分别消费测试构建基线，实现通信、四层适配及全旅程灰盒。</w:t>
+      </w:r>
+    </w:p>
+    <w:p>
+      <w:r>
+        <w:t>F03-N04：当前资产门为233项、259条阻断，正式发布仍不放行。许可处理交由对应资产与发布任务，不以F-03通过替代。</w:t>
+      </w:r>
+    </w:p>
+    <w:p>
+      <w:r>
+        <w:t>F03-N01 FIXED：根Tools/F03执行工具已迁入统一Agent任务层，旧活动入口移除</w:t>
+      </w:r>
+    </w:p>
+    <w:p>
+      <w:r>
+        <w:t>F03-N02 FIXED：现行Unity协调入口F-03 READY与签收DONE矛盾已修正</w:t>
+      </w:r>
+    </w:p>
+    <w:p>
+      <w:r>
+        <w:t>F03-N03 FIXED：未授权构建已被拦截但探针输出意外完成，已改为按实际结果报告并完整复测</w:t>
+      </w:r>
+    </w:p>
+    <w:p>
+      <w:r>
+        <w:t>F03-N04 OPEN_DOWNSTREAM_ASSET_GATE：当前同次资产报告为233项与259条阻断；对应资产、许可和发布任务需处理，不由本包放行</w:t>
+      </w:r>
+    </w:p>
+    <w:p>
+      <w:pPr>
+        <w:pStyle w:val="Heading1"/>
+      </w:pPr>
+      <w:r>
         <w:t>待整理队列</w:t>
       </w:r>
     </w:p>
@@ -99,12 +142,12 @@
         <w:keepNext/>
       </w:pPr>
       <w:r>
-        <w:t>已整理2包，待整理69包。</w:t>
+        <w:t>已整理3包，待整理68包。</w:t>
       </w:r>
     </w:p>
     <w:p>
       <w:r>
-        <w:t>F-03、F-04、F-05、G-01、G-02、P-01、P-02、U-01、U-02、T-01、R-01、V-01、V-02、V-03、V-04、D-01、D-02、S-01、S-02、V-05、U-03、U-04、U-05、U-06、U-07、U-08、T-02、A-01、A-02、A-03、W-01、I-01、Q-01、Q-02、Q-03、X-01、X-02、X-03、Z-01、G-05、E-01、E-02、B-01、E-03、G-03、B-02、E-04、A-05、E-05、G-04、B-03、E-06、A-04、A-06、W-02、W-03、W-04、U12-01、U12-02、U12-03、U12-04、U12-05、U12-06、U12-07、U12-08、U12-09、U12-10、U12-11、U12-12</w:t>
+        <w:t>F-04、F-05、G-01、G-02、P-01、P-02、U-01、U-02、T-01、R-01、V-01、V-02、V-03、V-04、D-01、D-02、S-01、S-02、V-05、U-03、U-04、U-05、U-06、U-07、U-08、T-02、A-01、A-02、A-03、W-01、I-01、Q-01、Q-02、Q-03、X-01、X-02、X-03、Z-01、G-05、E-01、E-02、B-01、E-03、G-03、B-02、E-04、A-05、E-05、G-04、B-03、E-06、A-04、A-06、W-02、W-03、W-04、U12-01、U12-02、U12-03、U12-04、U12-05、U12-06、U12-07、U12-08、U12-09、U12-10、U12-11、U12-12</w:t>
       </w:r>
     </w:p>
     <w:p>

</xml_diff>

<commit_message>
refactor(f04): normalize execution and review layers
</commit_message>
<xml_diff>
--- a/human/project-review.docx
+++ b/human/project-review.docx
@@ -134,6 +134,49 @@
         <w:pStyle w:val="Heading1"/>
       </w:pPr>
       <w:r>
+        <w:t>F-04 TouchDesigner</w:t>
+      </w:r>
+    </w:p>
+    <w:p>
+      <w:r>
+        <w:t>F-04历史状态为DONE。本轮迁移TD执行脚本、隔离新旧制品与证据，并完成38项主机回归及历史制品身份核验。静态壳不代替T-01真实遥测和T-02请求处理。</w:t>
+      </w:r>
+    </w:p>
+    <w:p>
+      <w:r>
+        <w:t>上游F-01提供v2.1遥测合同。T-01消费静态壳的快照与可视化思路并接入遥测；T-02负责操作者请求。F-04中的T-01 NOT ACTIVE只表示静态占位停用，不表示T-01任务未完成。</w:t>
+      </w:r>
+    </w:p>
+    <w:p>
+      <w:r>
+        <w:t>本轮与T-01联合主机测试通过；T-02是否完成及其功能签收在轮到该包时核验。TD不能替代Python会话权威，也不能用静态曲线替代设备记录。</w:t>
+      </w:r>
+    </w:p>
+    <w:p>
+      <w:r>
+        <w:t>F04-N01 FIXED：TD执行脚本已迁入Agent层，新制品与新证据不覆盖历史签收原件</w:t>
+      </w:r>
+    </w:p>
+    <w:p>
+      <w:r>
+        <w:t>F04-N02 FIXED_CURRENT_USAGE：当前fixture清单明确原始字节哈希，历史Git/LF口径不改写</w:t>
+      </w:r>
+    </w:p>
+    <w:p>
+      <w:r>
+        <w:t>F04-N03 FIXED：已签收静态基线与壳内未启用能力不再表述为项目任务未完成</w:t>
+      </w:r>
+    </w:p>
+    <w:p>
+      <w:r>
+        <w:t>F04-N04 OPEN_DOWNSTREAM_VISUAL_REVIEW：历史呼吸页说明覆盖曲线，需在T-01检查当前布局；本轮主机门不关闭画面可读性问题</w:t>
+      </w:r>
+    </w:p>
+    <w:p>
+      <w:pPr>
+        <w:pStyle w:val="Heading1"/>
+      </w:pPr>
+      <w:r>
         <w:t>待整理队列</w:t>
       </w:r>
     </w:p>
@@ -142,12 +185,12 @@
         <w:keepNext/>
       </w:pPr>
       <w:r>
-        <w:t>已整理3包，待整理68包。</w:t>
+        <w:t>已整理4包，待整理67包。</w:t>
       </w:r>
     </w:p>
     <w:p>
       <w:r>
-        <w:t>F-04、F-05、G-01、G-02、P-01、P-02、U-01、U-02、T-01、R-01、V-01、V-02、V-03、V-04、D-01、D-02、S-01、S-02、V-05、U-03、U-04、U-05、U-06、U-07、U-08、T-02、A-01、A-02、A-03、W-01、I-01、Q-01、Q-02、Q-03、X-01、X-02、X-03、Z-01、G-05、E-01、E-02、B-01、E-03、G-03、B-02、E-04、A-05、E-05、G-04、B-03、E-06、A-04、A-06、W-02、W-03、W-04、U12-01、U12-02、U12-03、U12-04、U12-05、U12-06、U12-07、U12-08、U12-09、U12-10、U12-11、U12-12</w:t>
+        <w:t>F-05、G-01、G-02、P-01、P-02、U-01、U-02、T-01、R-01、V-01、V-02、V-03、V-04、D-01、D-02、S-01、S-02、V-05、U-03、U-04、U-05、U-06、U-07、U-08、T-02、A-01、A-02、A-03、W-01、I-01、Q-01、Q-02、Q-03、X-01、X-02、X-03、Z-01、G-05、E-01、E-02、B-01、E-03、G-03、B-02、E-04、A-05、E-05、G-04、B-03、E-06、A-04、A-06、W-02、W-03、W-04、U12-01、U12-02、U12-03、U12-04、U12-05、U12-06、U12-07、U12-08、U12-09、U12-10、U12-11、U12-12</w:t>
       </w:r>
     </w:p>
     <w:p>

</xml_diff>

<commit_message>
docs(f05): publish normalized reviews and fresh contract evidence
</commit_message>
<xml_diff>
--- a/human/project-review.docx
+++ b/human/project-review.docx
@@ -177,6 +177,49 @@
         <w:pStyle w:val="Heading1"/>
       </w:pPr>
       <w:r>
+        <w:t>F-05 合同与协议</w:t>
+      </w:r>
+    </w:p>
+    <w:p>
+      <w:r>
+        <w:t>F-05已由傅钧烨签收DONE。本轮将执行工具迁入Agent层，修正当前指南的待签收表述，完成287项合同及P-01/P-02复测。新证据与历史封存分开，原签署不改写。</w:t>
+      </w:r>
+    </w:p>
+    <w:p>
+      <w:r>
+        <w:t>F-01不可变v2.1是上游。P-01按会话版本生成自包含步骤字段；P-02只保存和重放，不补值。U-01/U-02/T-01/U-07消费v2.2身份，各自核验网络、乱序和表示。</w:t>
+      </w:r>
+    </w:p>
+    <w:p>
+      <w:r>
+        <w:t>F-04保留v2.1静态壳，不代表正式v2.2消费。F-05步骤身份不是实时改序接口，不能用它证明阶段三策略路径；顺序策略扩展仍由X-03承担。</w:t>
+      </w:r>
+    </w:p>
+    <w:p>
+      <w:r>
+        <w:t>当前合同README变化触发T-02未领取包快照漂移，已重新生成其快照并通过分发校验；已领取及复核中的四包输入保持不变。</w:t>
+      </w:r>
+    </w:p>
+    <w:p>
+      <w:r>
+        <w:t>F05-N01 FIXED：根Tools工具迁入固定任务层，默认新运行不覆盖历史封存</w:t>
+      </w:r>
+    </w:p>
+    <w:p>
+      <w:r>
+        <w:t>F05-N02 FIXED：当前接口基线和迁移指南已按真实签收修正DONE及下游范围</w:t>
+      </w:r>
+    </w:p>
+    <w:p>
+      <w:r>
+        <w:t>F05-N03 FIXED：合同入口兼容规则明确限定v2.1，不再误读为全版本拒绝v2.2</w:t>
+      </w:r>
+    </w:p>
+    <w:p>
+      <w:pPr>
+        <w:pStyle w:val="Heading1"/>
+      </w:pPr>
+      <w:r>
         <w:t>待整理队列</w:t>
       </w:r>
     </w:p>
@@ -185,12 +228,12 @@
         <w:keepNext/>
       </w:pPr>
       <w:r>
-        <w:t>已整理4包，待整理67包。</w:t>
+        <w:t>已整理5包，待整理66包。</w:t>
       </w:r>
     </w:p>
     <w:p>
       <w:r>
-        <w:t>F-05、G-01、G-02、P-01、P-02、U-01、U-02、T-01、R-01、V-01、V-02、V-03、V-04、D-01、D-02、S-01、S-02、V-05、U-03、U-04、U-05、U-06、U-07、U-08、T-02、A-01、A-02、A-03、W-01、I-01、Q-01、Q-02、Q-03、X-01、X-02、X-03、Z-01、G-05、E-01、E-02、B-01、E-03、G-03、B-02、E-04、A-05、E-05、G-04、B-03、E-06、A-04、A-06、W-02、W-03、W-04、U12-01、U12-02、U12-03、U12-04、U12-05、U12-06、U12-07、U12-08、U12-09、U12-10、U12-11、U12-12</w:t>
+        <w:t>G-01、G-02、P-01、P-02、U-01、U-02、T-01、R-01、V-01、V-02、V-03、V-04、D-01、D-02、S-01、S-02、V-05、U-03、U-04、U-05、U-06、U-07、U-08、T-02、A-01、A-02、A-03、W-01、I-01、Q-01、Q-02、Q-03、X-01、X-02、X-03、Z-01、G-05、E-01、E-02、B-01、E-03、G-03、B-02、E-04、A-05、E-05、G-04、B-03、E-06、A-04、A-06、W-02、W-03、W-04、U12-01、U12-02、U12-03、U12-04、U12-05、U12-06、U12-07、U12-08、U12-09、U12-10、U12-11、U12-12</w:t>
       </w:r>
     </w:p>
     <w:p>

</xml_diff>

<commit_message>
docs: normalize G-01 review and current research governance usage
</commit_message>
<xml_diff>
--- a/human/project-review.docx
+++ b/human/project-review.docx
@@ -220,6 +220,54 @@
         <w:pStyle w:val="Heading1"/>
       </w:pPr>
       <w:r>
+        <w:t>G-01 研究治理</w:t>
+      </w:r>
+    </w:p>
+    <w:p>
+      <w:r>
+        <w:t>G-01已签收DONE，范围为候选材料、资源模型与模板。本轮补齐固定Agent结构与新版内部使用稿，修正步骤五过期状态、教学时序和资源口径；历史签署保留，实际准入仍未完成。</w:t>
+      </w:r>
+    </w:p>
+    <w:p>
+      <w:r>
+        <w:t>F-02当前使用入口与U12-02提供测量，U12-03提供尚在IN_REVIEW的公平教学候选；U12-04/U12-11冻结时序、预算、统计与新版材料。工具完成不证明短时负性情绪比较已获得证据。</w:t>
+      </w:r>
+    </w:p>
+    <w:p>
+      <w:r>
+        <w:t>G-05取得真实机构、M-001许可、正式机器、资产用途、人员和现场产能；早期静态/回放由U12-05按活动批准范围推进，不被未实施阶段三资格一概阻断。</w:t>
+      </w:r>
+    </w:p>
+    <w:p>
+      <w:r>
+        <w:t>G-05当前未领取，角色编号不代表真人责任已落实。团队总监须安排实际责任人；准入回执、培训签名和演练结果不能由Agent代填。下一包G-02继续核对权限与去重实现。</w:t>
+      </w:r>
+    </w:p>
+    <w:p>
+      <w:r>
+        <w:t>G01-N01 FIXED：步骤五入口已按真实签收DONE与G-05责任范围订正</w:t>
+      </w:r>
+    </w:p>
+    <w:p>
+      <w:r>
+        <w:t>G01-N02 FIXED_CURRENT_USAGE：当前稿按v1.2前测先于分条件教学、当前测量与G-02/P-02口径编制；正式冻结仍待后续任务</w:t>
+      </w:r>
+    </w:p>
+    <w:p>
+      <w:r>
+        <w:t>G01-N03 FIXED_CURRENT_USAGE：528与112保留历史情景，人员和日产能矛盾不再作为当前承诺</w:t>
+      </w:r>
+    </w:p>
+    <w:p>
+      <w:r>
+        <w:t>G01-N04 OPEN_EXTERNAL_OWNER_AND_EVIDENCE：G-05未领取，真实角色、机构许可与现场占用/值班能力尚无回执，由团队总监安排真实负责人</w:t>
+      </w:r>
+    </w:p>
+    <w:p>
+      <w:pPr>
+        <w:pStyle w:val="Heading1"/>
+      </w:pPr>
+      <w:r>
         <w:t>待整理队列</w:t>
       </w:r>
     </w:p>
@@ -228,12 +276,12 @@
         <w:keepNext/>
       </w:pPr>
       <w:r>
-        <w:t>已整理5包，待整理66包。</w:t>
+        <w:t>已整理6包，待整理65包。</w:t>
       </w:r>
     </w:p>
     <w:p>
       <w:r>
-        <w:t>G-01、G-02、P-01、P-02、U-01、U-02、T-01、R-01、V-01、V-02、V-03、V-04、D-01、D-02、S-01、S-02、V-05、U-03、U-04、U-05、U-06、U-07、U-08、T-02、A-01、A-02、A-03、W-01、I-01、Q-01、Q-02、Q-03、X-01、X-02、X-03、Z-01、G-05、E-01、E-02、B-01、E-03、G-03、B-02、E-04、A-05、E-05、G-04、B-03、E-06、A-04、A-06、W-02、W-03、W-04、U12-01、U12-02、U12-03、U12-04、U12-05、U12-06、U12-07、U12-08、U12-09、U12-10、U12-11、U12-12</w:t>
+        <w:t>G-02、P-01、P-02、U-01、U-02、T-01、R-01、V-01、V-02、V-03、V-04、D-01、D-02、S-01、S-02、V-05、U-03、U-04、U-05、U-06、U-07、U-08、T-02、A-01、A-02、A-03、W-01、I-01、Q-01、Q-02、Q-03、X-01、X-02、X-03、Z-01、G-05、E-01、E-02、B-01、E-03、G-03、B-02、E-04、A-05、E-05、G-04、B-03、E-06、A-04、A-06、W-02、W-03、W-04、U12-01、U12-02、U12-03、U12-04、U12-05、U12-06、U12-07、U12-08、U12-09、U12-10、U12-11、U12-12</w:t>
       </w:r>
     </w:p>
     <w:p>

</xml_diff>

<commit_message>
refactor: normalize G-02 execution and privacy evidence review
</commit_message>
<xml_diff>
--- a/human/project-review.docx
+++ b/human/project-review.docx
@@ -268,6 +268,54 @@
         <w:pStyle w:val="Heading1"/>
       </w:pPr>
       <w:r>
+        <w:t>G-02 数据治理</w:t>
+      </w:r>
+    </w:p>
+    <w:p>
+      <w:r>
+        <w:t>G-02已签收DONE，覆盖治理实现与合成技术路径。本轮将隐私工具迁入Agent执行层，新增新目录负测试并完成139项专项及233项Python消费者回归；正式环境六项缺失、资产259条阻断仍开放。</w:t>
+      </w:r>
+    </w:p>
+    <w:p>
+      <w:r>
+        <w:t>G-01角色表应消费实际G-02的HMAC和隔离规则；P-01先查manifest隐私，P-02仅追加受限L0/L1，X-01仅使用公开不透明决策。Z-01受资产门约束，W-03仅按实际授权与披露范围发布。</w:t>
+      </w:r>
+    </w:p>
+    <w:p>
+      <w:r>
+        <w:t>新版分条件教学发生在核心之前，首次研究暴露登记不能仅等到核心start；P-01/U12-11须冻结边界、接入登记，并验证教学后退出仍不可重复参与。本轮只订正消费合同，233项既有测试不证明这个新流程已闭环。</w:t>
+      </w:r>
+    </w:p>
+    <w:p>
+      <w:r>
+        <w:t>G-05仍未领取，正式配置、保留期限、资产用途和现场证据由真实责任人落实。下一包P-01核对编排与暴露接口，不替代真实研究或论文比较证据。</w:t>
+      </w:r>
+    </w:p>
+    <w:p>
+      <w:r>
+        <w:t>G02-N01 FIXED：隐私工具实际迁入固定执行层，新运行不覆盖历史证据</w:t>
+      </w:r>
+    </w:p>
+    <w:p>
+      <w:r>
+        <w:t>G02-N02 FIXED：新G-02证据目录纳入隐私扫描并通过负测试</w:t>
+      </w:r>
+    </w:p>
+    <w:p>
+      <w:r>
+        <w:t>G02-N03 FIXED：当前资产计数与本轮233/259对齐，DONE与外部责任分开</w:t>
+      </w:r>
+    </w:p>
+    <w:p>
+      <w:r>
+        <w:t>G02-N04 OPEN_DOWNSTREAM_TEACHING_EXPOSURE：P-01仅在核心start登记暴露，新版条件教学接入与退出阻断由P-01/U12-11完成，当前尚未正式闭环</w:t>
+      </w:r>
+    </w:p>
+    <w:p>
+      <w:pPr>
+        <w:pStyle w:val="Heading1"/>
+      </w:pPr>
+      <w:r>
         <w:t>待整理队列</w:t>
       </w:r>
     </w:p>
@@ -276,12 +324,12 @@
         <w:keepNext/>
       </w:pPr>
       <w:r>
-        <w:t>已整理6包，待整理65包。</w:t>
+        <w:t>已整理7包，待整理64包。</w:t>
       </w:r>
     </w:p>
     <w:p>
       <w:r>
-        <w:t>G-02、P-01、P-02、U-01、U-02、T-01、R-01、V-01、V-02、V-03、V-04、D-01、D-02、S-01、S-02、V-05、U-03、U-04、U-05、U-06、U-07、U-08、T-02、A-01、A-02、A-03、W-01、I-01、Q-01、Q-02、Q-03、X-01、X-02、X-03、Z-01、G-05、E-01、E-02、B-01、E-03、G-03、B-02、E-04、A-05、E-05、G-04、B-03、E-06、A-04、A-06、W-02、W-03、W-04、U12-01、U12-02、U12-03、U12-04、U12-05、U12-06、U12-07、U12-08、U12-09、U12-10、U12-11、U12-12</w:t>
+        <w:t>P-01、P-02、U-01、U-02、T-01、R-01、V-01、V-02、V-03、V-04、D-01、D-02、S-01、S-02、V-05、U-03、U-04、U-05、U-06、U-07、U-08、T-02、A-01、A-02、A-03、W-01、I-01、Q-01、Q-02、Q-03、X-01、X-02、X-03、Z-01、G-05、E-01、E-02、B-01、E-03、G-03、B-02、E-04、A-05、E-05、G-04、B-03、E-06、A-04、A-06、W-02、W-03、W-04、U12-01、U12-02、U12-03、U12-04、U12-05、U12-06、U12-07、U12-08、U12-09、U12-10、U12-11、U12-12</w:t>
       </w:r>
     </w:p>
     <w:p>

</xml_diff>

<commit_message>
Normalize P-01 execution tools and human review
</commit_message>
<xml_diff>
--- a/human/project-review.docx
+++ b/human/project-review.docx
@@ -316,6 +316,49 @@
         <w:pStyle w:val="Heading1"/>
       </w:pPr>
       <w:r>
+        <w:t>P-01 Python核心</w:t>
+      </w:r>
+    </w:p>
+    <w:p>
+      <w:r>
+        <w:t>P-01历史DONE及傅钧烨真实签收保持不变。本轮将golden生成器迁入Agent执行层，434项核心及消费者回归通过，四模块800秒轨迹与历史样例一致；核心前条件教学尚未接入，不作为本包已完成范围。</w:t>
+      </w:r>
+    </w:p>
+    <w:p>
+      <w:r>
+        <w:t>F-01/F-05决定消息版本；G-02提供隐私与暴露，X-01提供分配，P-02提供耐久追加与重放。Unity维护镜像而非流程时钟，TD不自行推进研究状态。</w:t>
+      </w:r>
+    </w:p>
+    <w:p>
+      <w:r>
+        <w:t>U12-06继续阻断未冻结正式运行。条件教学位于前测之后、核心之前的候选安排须由U12-11冻结；在展示条件教学前登记，并补教学后退出、未启动核心和再次预约负测。当前不能提前展示后再依赖核心start补登记。</w:t>
+      </w:r>
+    </w:p>
+    <w:p>
+      <w:r>
+        <w:t>T-02接收当前模块说明和新golden执行入口，P-02下一轮核对完整记录与确定性重放。I-01仍承担真实全链，研究情绪比较由真实前后测和研究分析支持，不能由本包工具结果替代。</w:t>
+      </w:r>
+    </w:p>
+    <w:p>
+      <w:r>
+        <w:t>P01-N01 FIXED：golden工具实际迁入execution，新运行不覆盖历史样例，434项及轨迹一致性通过</w:t>
+      </w:r>
+    </w:p>
+    <w:p>
+      <w:r>
+        <w:t>P01-N02 FIXED：当前入口按F-05/P-02实际DONE、固定顺序范围和有效目录订正</w:t>
+      </w:r>
+    </w:p>
+    <w:p>
+      <w:r>
+        <w:t>P01-N03 OPEN_DOWNSTREAM_TEACHING_EXPOSURE：核心前条件教学尚未接入；P-01/U12-11冻结后登记首次暴露并补退出再预约负测，本轮未关闭</w:t>
+      </w:r>
+    </w:p>
+    <w:p>
+      <w:pPr>
+        <w:pStyle w:val="Heading1"/>
+      </w:pPr>
+      <w:r>
         <w:t>待整理队列</w:t>
       </w:r>
     </w:p>
@@ -324,12 +367,12 @@
         <w:keepNext/>
       </w:pPr>
       <w:r>
-        <w:t>已整理7包，待整理64包。</w:t>
+        <w:t>已整理8包，待整理63包。</w:t>
       </w:r>
     </w:p>
     <w:p>
       <w:r>
-        <w:t>P-01、P-02、U-01、U-02、T-01、R-01、V-01、V-02、V-03、V-04、D-01、D-02、S-01、S-02、V-05、U-03、U-04、U-05、U-06、U-07、U-08、T-02、A-01、A-02、A-03、W-01、I-01、Q-01、Q-02、Q-03、X-01、X-02、X-03、Z-01、G-05、E-01、E-02、B-01、E-03、G-03、B-02、E-04、A-05、E-05、G-04、B-03、E-06、A-04、A-06、W-02、W-03、W-04、U12-01、U12-02、U12-03、U12-04、U12-05、U12-06、U12-07、U12-08、U12-09、U12-10、U12-11、U12-12</w:t>
+        <w:t>P-02、U-01、U-02、T-01、R-01、V-01、V-02、V-03、V-04、D-01、D-02、S-01、S-02、V-05、U-03、U-04、U-05、U-06、U-07、U-08、T-02、A-01、A-02、A-03、W-01、I-01、Q-01、Q-02、Q-03、X-01、X-02、X-03、Z-01、G-05、E-01、E-02、B-01、E-03、G-03、B-02、E-04、A-05、E-05、G-04、B-03、E-06、A-04、A-06、W-02、W-03、W-04、U12-01、U12-02、U12-03、U12-04、U12-05、U12-06、U12-07、U12-08、U12-09、U12-10、U12-11、U12-12</w:t>
       </w:r>
     </w:p>
     <w:p>

</xml_diff>

<commit_message>
Normalize P-02 storage evidence and human review
</commit_message>
<xml_diff>
--- a/human/project-review.docx
+++ b/human/project-review.docx
@@ -359,6 +359,54 @@
         <w:pStyle w:val="Heading1"/>
       </w:pPr>
       <w:r>
+        <w:t>P-02 数据记录</w:t>
+      </w:r>
+    </w:p>
+    <w:p>
+      <w:r>
+        <w:t>P-02历史DONE与傅钧烨真实签收保持不变。本轮迁移两个生成器，467项相关回归通过；800秒合成负载及46次核心调用重放通过，新归档与历史证据一致。补齐LF保存规则后6项golden专项复测通过；真实原件、正式环境与设备链仍由下游验证。</w:t>
+      </w:r>
+    </w:p>
+    <w:p>
+      <w:r>
+        <w:t>F-01/F-05提供消息合同，P-01提供完整提交操作，G-02提供隐私与正式存储资格，X-01提供分配。设备适配器写原始通知包，同步和质量模块写L1，存储层不补零、不推断步骤。</w:t>
+      </w:r>
+    </w:p>
+    <w:p>
+      <w:r>
+        <w:t>A-01须先验证归档完整性，再在获授权环境读取束原件。restricted_ref不读取原件，束返回不授权；真实波形、问卷、分配、人工标注和运行事实缺失不能靠清单或合成golden补齐。真实证据重建仍待A-01/S-02。</w:t>
+      </w:r>
+    </w:p>
+    <w:p>
+      <w:r>
+        <w:t>教学流程冻结并接入后，由P-01/U12-11交接真实教学与首次暴露记录。本轮46操作只证明核心路径重放；I-01真实全链及正式环境继续独立验收。下一包U-01核对控制与渲染镜像消费。</w:t>
+      </w:r>
+    </w:p>
+    <w:p>
+      <w:r>
+        <w:t>P02-N01 FIXED：两个生成器实际迁入固定execution，新归档与压力不覆盖历史证据</w:t>
+      </w:r>
+    </w:p>
+    <w:p>
+      <w:r>
+        <w:t>P02-N02 FIXED：新归档目录LF规则及实际字节哈希与重放验证通过</w:t>
+      </w:r>
+    </w:p>
+    <w:p>
+      <w:r>
+        <w:t>P02-N03 FIXED_CURRENT_USAGE：Agent当前入口使用新目录及F-05已签收状态，明确束不授权、不读取受限原件；U12-06冻结README保留</w:t>
+      </w:r>
+    </w:p>
+    <w:p>
+      <w:r>
+        <w:t>P02-N04 OPEN_DOWNSTREAM_REAL_EVIDENCE：A-01须获授权读取实际六类原件；核心前教学需冻结后交接真实记录，本轮合成归档不能关闭这些事项</w:t>
+      </w:r>
+    </w:p>
+    <w:p>
+      <w:pPr>
+        <w:pStyle w:val="Heading1"/>
+      </w:pPr>
+      <w:r>
         <w:t>待整理队列</w:t>
       </w:r>
     </w:p>
@@ -367,12 +415,12 @@
         <w:keepNext/>
       </w:pPr>
       <w:r>
-        <w:t>已整理8包，待整理63包。</w:t>
+        <w:t>已整理9包，待整理62包。</w:t>
       </w:r>
     </w:p>
     <w:p>
       <w:r>
-        <w:t>P-02、U-01、U-02、T-01、R-01、V-01、V-02、V-03、V-04、D-01、D-02、S-01、S-02、V-05、U-03、U-04、U-05、U-06、U-07、U-08、T-02、A-01、A-02、A-03、W-01、I-01、Q-01、Q-02、Q-03、X-01、X-02、X-03、Z-01、G-05、E-01、E-02、B-01、E-03、G-03、B-02、E-04、A-05、E-05、G-04、B-03、E-06、A-04、A-06、W-02、W-03、W-04、U12-01、U12-02、U12-03、U12-04、U12-05、U12-06、U12-07、U12-08、U12-09、U12-10、U12-11、U12-12</w:t>
+        <w:t>U-01、U-02、T-01、R-01、V-01、V-02、V-03、V-04、D-01、D-02、S-01、S-02、V-05、U-03、U-04、U-05、U-06、U-07、U-08、T-02、A-01、A-02、A-03、W-01、I-01、Q-01、Q-02、Q-03、X-01、X-02、X-03、Z-01、G-05、E-01、E-02、B-01、E-03、G-03、B-02、E-04、A-05、E-05、G-04、B-03、E-06、A-04、A-06、W-02、W-03、W-04、U12-01、U12-02、U12-03、U12-04、U12-05、U12-06、U12-07、U12-08、U12-09、U12-10、U12-11、U12-12</w:t>
       </w:r>
     </w:p>
     <w:p>

</xml_diff>

<commit_message>
Normalize U-01 control execution and Word review
</commit_message>
<xml_diff>
--- a/human/project-review.docx
+++ b/human/project-review.docx
@@ -407,6 +407,49 @@
         <w:pStyle w:val="Heading1"/>
       </w:pPr>
       <w:r>
+        <w:t>U-01 Unity</w:t>
+      </w:r>
+    </w:p>
+    <w:p>
+      <w:r>
+        <w:t>U-01历史DONE与真实签收保持不变。本轮迁移主机校验入口、隔离新证据并实际重跑Unity：14项EditMode、3项PlayMode通过；19控制、19ACK、12回执及故障矩阵与历史语义一致。实际场景呈现、正式装配和真实设备链仍由下游验证。</w:t>
+      </w:r>
+    </w:p>
+    <w:p>
+      <w:r>
+        <w:t>F-03供工程基线，F-01/F-05供消息合同，P-01供控制和时间。P-02保存实际ACK与回执，不由golden推测实际画面。TD缺席不改变本组件。</w:t>
+      </w:r>
+    </w:p>
+    <w:p>
+      <w:r>
+        <w:t>U-02/U-03在对应帧呈现后调用ConfirmRendered；真实全链由I-01、正式制品由装配与构建任务验证。核心前教学需U12-11冻结及P-01登记暴露，本包不新增教学消息或正式资格。下一包U-02检查四层实现与实际接入。</w:t>
+      </w:r>
+    </w:p>
+    <w:p>
+      <w:r>
+        <w:t>U01-N01 FIXED：Editor证据写入本包runtime，不再覆盖历史签收目录</w:t>
+      </w:r>
+    </w:p>
+    <w:p>
+      <w:r>
+        <w:t>U01-N02 FIXED：主机校验入口实际迁入execution，新旧证据验证及17项Unity复测通过</w:t>
+      </w:r>
+    </w:p>
+    <w:p>
+      <w:r>
+        <w:t>U01-N03 FIXED_CURRENT_USAGE：当前说明区分ACK、确认生成、发送失败与实际呈现；历史签署原字节保留</w:t>
+      </w:r>
+    </w:p>
+    <w:p>
+      <w:r>
+        <w:t>U01-N04 OPEN_DOWNSTREAM_RENDER_INTEGRATION：适配器实际呈现、核心前教学接入和正式全链仍待下游；golden不能替代这些证据</w:t>
+      </w:r>
+    </w:p>
+    <w:p>
+      <w:pPr>
+        <w:pStyle w:val="Heading1"/>
+      </w:pPr>
+      <w:r>
         <w:t>待整理队列</w:t>
       </w:r>
     </w:p>
@@ -415,12 +458,12 @@
         <w:keepNext/>
       </w:pPr>
       <w:r>
-        <w:t>已整理9包，待整理62包。</w:t>
+        <w:t>已整理10包，待整理61包。</w:t>
       </w:r>
     </w:p>
     <w:p>
       <w:r>
-        <w:t>U-01、U-02、T-01、R-01、V-01、V-02、V-03、V-04、D-01、D-02、S-01、S-02、V-05、U-03、U-04、U-05、U-06、U-07、U-08、T-02、A-01、A-02、A-03、W-01、I-01、Q-01、Q-02、Q-03、X-01、X-02、X-03、Z-01、G-05、E-01、E-02、B-01、E-03、G-03、B-02、E-04、A-05、E-05、G-04、B-03、E-06、A-04、A-06、W-02、W-03、W-04、U12-01、U12-02、U12-03、U12-04、U12-05、U12-06、U12-07、U12-08、U12-09、U12-10、U12-11、U12-12</w:t>
+        <w:t>U-02、T-01、R-01、V-01、V-02、V-03、V-04、D-01、D-02、S-01、S-02、V-05、U-03、U-04、U-05、U-06、U-07、U-08、T-02、A-01、A-02、A-03、W-01、I-01、Q-01、Q-02、Q-03、X-01、X-02、X-03、Z-01、G-05、E-01、E-02、B-01、E-03、G-03、B-02、E-04、A-05、E-05、G-04、B-03、E-06、A-04、A-06、W-02、W-03、W-04、U12-01、U12-02、U12-03、U12-04、U12-05、U12-06、U12-07、U12-08、U12-09、U12-10、U12-11、U12-12</w:t>
       </w:r>
     </w:p>
     <w:p>

</xml_diff>

<commit_message>
refactor: normalize U-02 package and fix layer lifecycle evidence
</commit_message>
<xml_diff>
--- a/human/project-review.docx
+++ b/human/project-review.docx
@@ -450,6 +450,54 @@
         <w:pStyle w:val="Heading1"/>
       </w:pPr>
       <w:r>
+        <w:t>U-02 Unity</w:t>
+      </w:r>
+    </w:p>
+    <w:p>
+      <w:r>
+        <w:t>U-02历史DONE及真实签收保留原范围。本轮固定执行目录、取回127份原证据，修复累计锁定生命周期、合同合法空步骤和开发录像链。实际Unity回归105项EditMode、3项PlayMode通过；120帧新演示非空且五阶段可读，独立复审无开放P0-P3。新补丁未追加真人签署。</w:t>
+      </w:r>
+    </w:p>
+    <w:p>
+      <w:r>
+        <w:t>P-01掌握研究顺序和时间，U-01负责网络身份及陈旧帧门；本包只消费IV03TelemetrySource并投影四层，不自行推进流程。NotifyLinkDown不制造成功帧。</w:t>
+      </w:r>
+    </w:p>
+    <w:p>
+      <w:r>
+        <w:t>V-05/U-03接入固定镜头天气画面，实际呈现对应帧后调用U-01 ConfirmRendered；I-01验证真实链。旧参数候选不自动等于V-04最终美术。两条件、教学暴露、800秒和正式制品仍由各自下游完成。</w:t>
+      </w:r>
+    </w:p>
+    <w:p>
+      <w:r>
+        <w:t>U02-N01 FIXED：Recovery按模块/会话边界重置，锁定换段保持；新增生命周期回归通过</w:t>
+      </w:r>
+    </w:p>
+    <w:p>
+      <w:r>
+        <w:t>U02-N02 FIXED：四天气合法空步骤与F-05对齐；非空缺实例仍拒绝</w:t>
+      </w:r>
+    </w:p>
+    <w:p>
+      <w:r>
+        <w:t>U02-N03 FIXED：开发驱动条件编译，构建取得F-03作用域授权；正式门未放宽</w:t>
+      </w:r>
+    </w:p>
+    <w:p>
+      <w:r>
+        <w:t>U02-N04 FIXED：历史原件可读取；新显式渲染演示120帧像素通过且五阶段可读，不再使用零图/黑帧成功计数</w:t>
+      </w:r>
+    </w:p>
+    <w:p>
+      <w:r>
+        <w:t>U02-N05 OPEN_DOWNSTREAM_INTEGRATION_AND_PATCH_SIGNOFF：最终天气接线、实际回执、真实设备与正式运行仍待下游；本轮新补丁未追加真人签署</w:t>
+      </w:r>
+    </w:p>
+    <w:p>
+      <w:pPr>
+        <w:pStyle w:val="Heading1"/>
+      </w:pPr>
+      <w:r>
         <w:t>待整理队列</w:t>
       </w:r>
     </w:p>
@@ -458,12 +506,12 @@
         <w:keepNext/>
       </w:pPr>
       <w:r>
-        <w:t>已整理10包，待整理61包。</w:t>
+        <w:t>已整理11包，待整理60包。</w:t>
       </w:r>
     </w:p>
     <w:p>
       <w:r>
-        <w:t>U-02、T-01、R-01、V-01、V-02、V-03、V-04、D-01、D-02、S-01、S-02、V-05、U-03、U-04、U-05、U-06、U-07、U-08、T-02、A-01、A-02、A-03、W-01、I-01、Q-01、Q-02、Q-03、X-01、X-02、X-03、Z-01、G-05、E-01、E-02、B-01、E-03、G-03、B-02、E-04、A-05、E-05、G-04、B-03、E-06、A-04、A-06、W-02、W-03、W-04、U12-01、U12-02、U12-03、U12-04、U12-05、U12-06、U12-07、U12-08、U12-09、U12-10、U12-11、U12-12</w:t>
+        <w:t>T-01、R-01、V-01、V-02、V-03、V-04、D-01、D-02、S-01、S-02、V-05、U-03、U-04、U-05、U-06、U-07、U-08、T-02、A-01、A-02、A-03、W-01、I-01、Q-01、Q-02、Q-03、X-01、X-02、X-03、Z-01、G-05、E-01、E-02、B-01、E-03、G-03、B-02、E-04、A-05、E-05、G-04、B-03、E-06、A-04、A-06、W-02、W-03、W-04、U12-01、U12-02、U12-03、U12-04、U12-05、U12-06、U12-07、U12-08、U12-09、U12-10、U12-11、U12-12</w:t>
       </w:r>
     </w:p>
     <w:p>

</xml_diff>

<commit_message>
refactor: normalize T-01 execution and verify readable TD candidate
</commit_message>
<xml_diff>
--- a/human/project-review.docx
+++ b/human/project-review.docx
@@ -498,6 +498,59 @@
         <w:pStyle w:val="Heading1"/>
       </w:pPr>
       <w:r>
+        <w:t>T-01 TouchDesigner</w:t>
+      </w:r>
+    </w:p>
+    <w:p>
+      <w:r>
+        <w:t>T-01历史DONE与原签收范围保留。执行脚本已迁入Agent层，57项专项及验证器回归通过；实际TD重开与五阶段UDP行为通过。旧界面文字裁切已在独立可读性候选修复并逐张检查；新候选未代签，A主题和真实设备链不由本轮关闭。</w:t>
+      </w:r>
+    </w:p>
+    <w:p>
+      <w:r>
+        <w:t>P-01发布只读遥测，P-02记录运行事实；TD不推进流程、不估算呼吸步骤、不写回顺序，TD缺席不影响Unity体验。帧龄与管线字段不代表设备到屏幕延迟。</w:t>
+      </w:r>
+    </w:p>
+    <w:p>
+      <w:r>
+        <w:t>T-02完成请求/回执、导出与操作功能，并验收A主题原生布局；D/S/I负责真实设备和全链。本包只支持工程消费能力，不支持研究效果结论。下一规范化包R-01检查表示方案与当前研究问题。</w:t>
+      </w:r>
+    </w:p>
+    <w:p>
+      <w:r>
+        <w:t>T01-N01 FIXED：五个执行工具迁入Agent层，新结果不覆盖历史；过期清理工具归档</w:t>
+      </w:r>
+    </w:p>
+    <w:p>
+      <w:r>
+        <w:t>T01-N02 FIXED_CURRENT_USAGE：当前TOE身份与旧清理候选不同，49项内部功能一致、13项编辑器布局变化，实际TD探针通过</w:t>
+      </w:r>
+    </w:p>
+    <w:p>
+      <w:r>
+        <w:t>T01-N03 FIXED_CANDIDATE：旧Text TOP裁切已在独立可读候选修复并实跑，未覆盖历史制品</w:t>
+      </w:r>
+    </w:p>
+    <w:p>
+      <w:r>
+        <w:t>T01-N04 OPEN_DOWNSTREAM_NATIVE_UI：A主题原生控件、导航和尺寸验收继续交T-02，不由本次旧界面修复代替</w:t>
+      </w:r>
+    </w:p>
+    <w:p>
+      <w:r>
+        <w:t>T01-N05 OPEN_HUMAN_REVIEW：可读性修复候选待真人对当前范围签收，历史签名不转移</w:t>
+      </w:r>
+    </w:p>
+    <w:p>
+      <w:r>
+        <w:t>T01-N06 FIXED_AND_INDEPENDENTLY_VERIFIED：独立复核两项验证器漏检及旧链接已修复，9项回归覆盖原复现；独立57项通过，复审无新P0-P3</w:t>
+      </w:r>
+    </w:p>
+    <w:p>
+      <w:pPr>
+        <w:pStyle w:val="Heading1"/>
+      </w:pPr>
+      <w:r>
         <w:t>待整理队列</w:t>
       </w:r>
     </w:p>
@@ -506,12 +559,12 @@
         <w:keepNext/>
       </w:pPr>
       <w:r>
-        <w:t>已整理11包，待整理60包。</w:t>
+        <w:t>已整理12包，待整理59包。</w:t>
       </w:r>
     </w:p>
     <w:p>
       <w:r>
-        <w:t>T-01、R-01、V-01、V-02、V-03、V-04、D-01、D-02、S-01、S-02、V-05、U-03、U-04、U-05、U-06、U-07、U-08、T-02、A-01、A-02、A-03、W-01、I-01、Q-01、Q-02、Q-03、X-01、X-02、X-03、Z-01、G-05、E-01、E-02、B-01、E-03、G-03、B-02、E-04、A-05、E-05、G-04、B-03、E-06、A-04、A-06、W-02、W-03、W-04、U12-01、U12-02、U12-03、U12-04、U12-05、U12-06、U12-07、U12-08、U12-09、U12-10、U12-11、U12-12</w:t>
+        <w:t>R-01、V-01、V-02、V-03、V-04、D-01、D-02、S-01、S-02、V-05、U-03、U-04、U-05、U-06、U-07、U-08、T-02、A-01、A-02、A-03、W-01、I-01、Q-01、Q-02、Q-03、X-01、X-02、X-03、Z-01、G-05、E-01、E-02、B-01、E-03、G-03、B-02、E-04、A-05、E-05、G-04、B-03、E-06、A-04、A-06、W-02、W-03、W-04、U12-01、U12-02、U12-03、U12-04、U12-05、U12-06、U12-07、U12-08、U12-09、U12-10、U12-11、U12-12</w:t>
       </w:r>
     </w:p>
     <w:p>

</xml_diff>

<commit_message>
refactor: normalize R-01 design review and execute candidate schema checks
</commit_message>
<xml_diff>
--- a/human/project-review.docx
+++ b/human/project-review.docx
@@ -551,6 +551,49 @@
         <w:pStyle w:val="Heading1"/>
       </w:pPr>
       <w:r>
+        <w:t>R-01 体验设计</w:t>
+      </w:r>
+    </w:p>
+    <w:p>
+      <w:r>
+        <w:t>R-01历史DONE只覆盖候选设计材料。校验器实际迁入Agent并补足Schema执行，13项回归通过；当前入口与v1.2、F-02及四层实现对齐。旧Gate 2报告门和旧天气提案不再指导当前研究。真人复核、四天气配置和真实渲染证据仍开放。</w:t>
+      </w:r>
+    </w:p>
+    <w:p>
+      <w:r>
+        <w:t>F-02和U12-02提供当前测量角色与步骤身份；P-01负责时间和流程，U-01/U-02负责网络与只读四层逻辑，TD不成为Unity体验依赖。</w:t>
+      </w:r>
+    </w:p>
+    <w:p>
+      <w:r>
+        <w:t>V-01/V-03及V-05/U-03至U-07消费语义、匹配要求与有效视觉合同；Q-01/Q-02和S-02提供真实评审、理解和标注。W-01/W-02仅按实际比较证据提出边界。U12-03保持领取快照，复核另读消费者影响记录。</w:t>
+      </w:r>
+    </w:p>
+    <w:p>
+      <w:r>
+        <w:t>R01-N01 FIXED_CURRENT_USAGE：旧Gate 2报告门不适用于v1.2，当前研究与天气使用入口已对齐，历史保留</w:t>
+      </w:r>
+    </w:p>
+    <w:p>
+      <w:r>
+        <w:t>R01-N02 FIXED：旧校验器实际Schema漏检已修复，13项正负回归通过</w:t>
+      </w:r>
+    </w:p>
+    <w:p>
+      <w:r>
+        <w:t>R01-N03 OPEN_HUMAN_REVIEW：历史仅模型候选审查，无真实团队双签；不代署，由团队总监安排</w:t>
+      </w:r>
+    </w:p>
+    <w:p>
+      <w:r>
+        <w:t>R01-N04 OPEN_DOWNSTREAM_CONFIGURATIONS：仅storm双条件合法fixture，真实四结构配置与渲染由U-03至U-07补齐</w:t>
+      </w:r>
+    </w:p>
+    <w:p>
+      <w:pPr>
+        <w:pStyle w:val="Heading1"/>
+      </w:pPr>
+      <w:r>
         <w:t>待整理队列</w:t>
       </w:r>
     </w:p>
@@ -559,12 +602,15 @@
         <w:keepNext/>
       </w:pPr>
       <w:r>
-        <w:t>已整理12包，待整理59包。</w:t>
+        <w:t>已整理13包，待整理58包。</w:t>
       </w:r>
     </w:p>
     <w:p>
+      <w:pPr>
+        <w:keepLines/>
+      </w:pPr>
       <w:r>
-        <w:t>R-01、V-01、V-02、V-03、V-04、D-01、D-02、S-01、S-02、V-05、U-03、U-04、U-05、U-06、U-07、U-08、T-02、A-01、A-02、A-03、W-01、I-01、Q-01、Q-02、Q-03、X-01、X-02、X-03、Z-01、G-05、E-01、E-02、B-01、E-03、G-03、B-02、E-04、A-05、E-05、G-04、B-03、E-06、A-04、A-06、W-02、W-03、W-04、U12-01、U12-02、U12-03、U12-04、U12-05、U12-06、U12-07、U12-08、U12-09、U12-10、U12-11、U12-12</w:t>
+        <w:t>V-01、V-02、V-03、V-04、D-01、D-02、S-01、S-02、V-05、U-03、U-04、U-05、U-06、U-07、U-08、T-02、A-01、A-02、A-03、W-01、I-01、Q-01、Q-02、Q-03、X-01、X-02、X-03、Z-01、G-05、E-01、E-02、B-01、E-03、G-03、B-02、E-04、A-05、E-05、G-04、B-03、E-06、A-04、A-06、W-02、W-03、W-04、U12-01、U12-02、U12-03、U12-04、U12-05、U12-06、U12-07、U12-08、U12-09、U12-10、U12-11、U12-12</w:t>
       </w:r>
     </w:p>
     <w:p>

</xml_diff>

<commit_message>
refactor: normalize V-01 journey and align current training timeline
</commit_message>
<xml_diff>
--- a/human/project-review.docx
+++ b/human/project-review.docx
@@ -594,6 +594,54 @@
         <w:pStyle w:val="Heading1"/>
       </w:pPr>
       <w:r>
+        <w:t>V-01 Unity前期设计</w:t>
+      </w:r>
+    </w:p>
+    <w:p>
+      <w:r>
+        <w:t>V-01历史DONE和傅钧烨原签收保留。旧校验器迁入Agent，当前旅程另存版本化候选，补入前测后教学及后测后其他测量，订正教学暴露、旧研究门及两条件参与者措辞。22项回归、历史12节点和当前14节点校验及V-02消费通过；新候选未代签，教学运行接入仍开放。</w:t>
+      </w:r>
+    </w:p>
+    <w:p>
+      <w:r>
+        <w:t>F-02/R-01提供测量及表示边界，P-01掌握时钟与顺序，U-01/U-02消费v2.2步骤和生命周期；TD不成为Unity体验依赖。默认核心800秒，不包含准备、教学和量表，暂停增加墙钟时长。</w:t>
+      </w:r>
+    </w:p>
+    <w:p>
+      <w:r>
+        <w:t>V-02/V-03既有选择保留，V-05及U-03至U-07搭建真实完整旅程与双条件；U12-03/04/11冻结教学和测量，U12-06/X-01连接暴露与追加记录。下一规范化包V-02，检查旧选择到当前视觉合同的关系。</w:t>
+      </w:r>
+    </w:p>
+    <w:p>
+      <w:r>
+        <w:t>V01-N01 FIXED_DESIGN_CANDIDATE：当前14节点补前测后教学、后测后其他测量，22项时序与约束回归通过</w:t>
+      </w:r>
+    </w:p>
+    <w:p>
+      <w:r>
+        <w:t>V01-N02 FIXED_CURRENT_USAGE：旧研究门和两条件同一参与者措辞不用于当前v1.2设计</w:t>
+      </w:r>
+    </w:p>
+    <w:p>
+      <w:r>
+        <w:t>V01-N03 OPEN_DOWNSTREAM_EXPOSURE：教学首材料前暴露登记需U12-06/X-01连接G-02/P-01/P-02，设计候选不是运行证据</w:t>
+      </w:r>
+    </w:p>
+    <w:p>
+      <w:r>
+        <w:t>V01-N04 FIXED_CURRENT_USAGE：旧开放项不重开已选镜头/双环/天气，fade复色与累计独立</w:t>
+      </w:r>
+    </w:p>
+    <w:p>
+      <w:r>
+        <w:t>V01-N05 OPEN_HUMAN_REVIEW：新候选未继承历史签名，正式时序冻结及真人审阅由责任人完成</w:t>
+      </w:r>
+    </w:p>
+    <w:p>
+      <w:pPr>
+        <w:pStyle w:val="Heading1"/>
+      </w:pPr>
+      <w:r>
         <w:t>待整理队列</w:t>
       </w:r>
     </w:p>
@@ -602,7 +650,7 @@
         <w:keepNext/>
       </w:pPr>
       <w:r>
-        <w:t>已整理13包，待整理58包。</w:t>
+        <w:t>已整理14包，待整理57包。</w:t>
       </w:r>
     </w:p>
     <w:p>
@@ -610,7 +658,7 @@
         <w:keepLines/>
       </w:pPr>
       <w:r>
-        <w:t>V-01、V-02、V-03、V-04、D-01、D-02、S-01、S-02、V-05、U-03、U-04、U-05、U-06、U-07、U-08、T-02、A-01、A-02、A-03、W-01、I-01、Q-01、Q-02、Q-03、X-01、X-02、X-03、Z-01、G-05、E-01、E-02、B-01、E-03、G-03、B-02、E-04、A-05、E-05、G-04、B-03、E-06、A-04、A-06、W-02、W-03、W-04、U12-01、U12-02、U12-03、U12-04、U12-05、U12-06、U12-07、U12-08、U12-09、U12-10、U12-11、U12-12</w:t>
+        <w:t>V-02、V-03、V-04、D-01、D-02、S-01、S-02、V-05、U-03、U-04、U-05、U-06、U-07、U-08、T-02、A-01、A-02、A-03、W-01、I-01、Q-01、Q-02、Q-03、X-01、X-02、X-03、Z-01、G-05、E-01、E-02、B-01、E-03、G-03、B-02、E-04、A-05、E-05、G-04、B-03、E-06、A-04、A-06、W-02、W-03、W-04、U12-01、U12-02、U12-03、U12-04、U12-05、U12-06、U12-07、U12-08、U12-09、U12-10、U12-11、U12-12</w:t>
       </w:r>
     </w:p>
     <w:p>

</xml_diff>

<commit_message>
refactor: normalize V-02 scene handoff and superseded design rules
</commit_message>
<xml_diff>
--- a/human/project-review.docx
+++ b/human/project-review.docx
@@ -642,6 +642,54 @@
         <w:pStyle w:val="Heading1"/>
       </w:pPr>
       <w:r>
+        <w:t>V-02 Unity前期设计</w:t>
+      </w:r>
+    </w:p>
+    <w:p>
+      <w:r>
+        <w:t>保留V-02原DONE及设计签收。历史校验器迁入Agent，当前交接明确V-04固定镜头、独立素材和fade有效时间复色优先于旧稿；新旧设计校验及26项回归通过。真实呈现、许可及教学接入仍由下游完成。</w:t>
+      </w:r>
+    </w:p>
+    <w:p>
+      <w:r>
+        <w:t>V-01当前时序先前测再教学，后测后其他测量；教学在800秒核心外，首次条件材料前暴露登记接入仍待U12-06/X-01。R-01提供四层与结果范围，不预设原生胜出。</w:t>
+      </w:r>
+    </w:p>
+    <w:p>
+      <w:r>
+        <w:t>V-03/V-04提供风险与有效视觉，V-05/U-03至U-07实现同源双条件和回执。G-02/G-05/U-08提供许可与真实资格，条件相同算法不意味着正式不同参与者波形相同。下一规范化包V-03。</w:t>
+      </w:r>
+    </w:p>
+    <w:p>
+      <w:r>
+        <w:t>V02-N01 FIXED_CURRENT_USAGE：当前固定镜头覆盖旧卷轴，局部非周期运动及共同转场分开</w:t>
+      </w:r>
+    </w:p>
+    <w:p>
+      <w:r>
+        <w:t>V02-N02 FIXED_CURRENT_USAGE：完整底图加独立素材覆盖旧拆层生产路线，许可未自动放行</w:t>
+      </w:r>
+    </w:p>
+    <w:p>
+      <w:r>
+        <w:t>V02-N03 FIXED_CURRENT_USAGE：fade有效时间复色与步骤水系、累计轮廓纹理分开</w:t>
+      </w:r>
+    </w:p>
+    <w:p>
+      <w:r>
+        <w:t>V02-N04 FIXED_CURRENT_USAGE：四天气完整demo均要求v2.2身份，不采用粗相位兼容捷径</w:t>
+      </w:r>
+    </w:p>
+    <w:p>
+      <w:r>
+        <w:t>V02-N05 OPEN_DOWNSTREAM：真实呈现由V-05/U任务验证，资产许可与教学接入分别待G/U12/X任务</w:t>
+      </w:r>
+    </w:p>
+    <w:p>
+      <w:pPr>
+        <w:pStyle w:val="Heading1"/>
+      </w:pPr>
+      <w:r>
         <w:t>待整理队列</w:t>
       </w:r>
     </w:p>
@@ -650,7 +698,7 @@
         <w:keepNext/>
       </w:pPr>
       <w:r>
-        <w:t>已整理14包，待整理57包。</w:t>
+        <w:t>已整理15包，待整理56包。</w:t>
       </w:r>
     </w:p>
     <w:p>
@@ -658,7 +706,7 @@
         <w:keepLines/>
       </w:pPr>
       <w:r>
-        <w:t>V-02、V-03、V-04、D-01、D-02、S-01、S-02、V-05、U-03、U-04、U-05、U-06、U-07、U-08、T-02、A-01、A-02、A-03、W-01、I-01、Q-01、Q-02、Q-03、X-01、X-02、X-03、Z-01、G-05、E-01、E-02、B-01、E-03、G-03、B-02、E-04、A-05、E-05、G-04、B-03、E-06、A-04、A-06、W-02、W-03、W-04、U12-01、U12-02、U12-03、U12-04、U12-05、U12-06、U12-07、U12-08、U12-09、U12-10、U12-11、U12-12</w:t>
+        <w:t>V-03、V-04、D-01、D-02、S-01、S-02、V-05、U-03、U-04、U-05、U-06、U-07、U-08、T-02、A-01、A-02、A-03、W-01、I-01、Q-01、Q-02、Q-03、X-01、X-02、X-03、Z-01、G-05、E-01、E-02、B-01、E-03、G-03、B-02、E-04、A-05、E-05、G-04、B-03、E-06、A-04、A-06、W-02、W-03、W-04、U12-01、U12-02、U12-03、U12-04、U12-05、U12-06、U12-07、U12-08、U12-09、U12-10、U12-11、U12-12</w:t>
       </w:r>
     </w:p>
     <w:p>

</xml_diff>

<commit_message>
refactor: normalize V-03 mapping and separate historical asset checks
</commit_message>
<xml_diff>
--- a/human/project-review.docx
+++ b/human/project-review.docx
@@ -690,6 +690,49 @@
         <w:pStyle w:val="Heading1"/>
       </w:pPr>
       <w:r>
+        <w:t>V-03 Unity前期设计</w:t>
+      </w:r>
+    </w:p>
+    <w:p>
+      <w:r>
+        <w:t>V-03原DONE和设计签收保留。三工具及资产测试迁入Agent，修复历史资产校验混用当前依赖与生成器覆盖签署文件的问题。当前40行对齐v2.2、固定镜头、fade有效时间复色及累计锁定；64项回归和新旧交接通过，素材许可与真实呈现仍待下游。</w:t>
+      </w:r>
+    </w:p>
+    <w:p>
+      <w:r>
+        <w:t>V-02当前场景、R-01四层与U-02累计生命周期共同约束当前映射。F-05提供实际v2.2字段；V-04后续素材、镜头和fade裁定优先，不把旧设计Schema当网络Schema。</w:t>
+      </w:r>
+    </w:p>
+    <w:p>
+      <w:r>
+        <w:t>V-05/U-03至U-07验证真实天气及同源双条件；G-02/U-08逐实例映射32素材及许可，U12-06/X-01接教学暴露。旧21设计项不是现有32素材完整清单，缺口保留。下一规范化包V-04。</w:t>
+      </w:r>
+    </w:p>
+    <w:p>
+      <w:r>
+        <w:t>V03-N01 FIXED_AND_RETESTED：历史78项/57包按签收原件复算，当前56包独立验证，不因合法移除Spout否定历史</w:t>
+      </w:r>
+    </w:p>
+    <w:p>
+      <w:r>
+        <w:t>V03-N02 FIXED_AND_RETESTED：生成器输出改本包候选目录，测试确认不写签署原件</w:t>
+      </w:r>
+    </w:p>
+    <w:p>
+      <w:r>
+        <w:t>V03-N03 FIXED_CURRENT_USAGE：当前40行对齐v2.2、固定镜头、fade时间复色及同模块累计锁定</w:t>
+      </w:r>
+    </w:p>
+    <w:p>
+      <w:r>
+        <w:t>V03-N04 OPEN_DOWNSTREAM_ASSET_INSTANCES：旧21设计项不替代32素材逐实例许可映射，G-02/U-08负责完成</w:t>
+      </w:r>
+    </w:p>
+    <w:p>
+      <w:pPr>
+        <w:pStyle w:val="Heading1"/>
+      </w:pPr>
+      <w:r>
         <w:t>待整理队列</w:t>
       </w:r>
     </w:p>
@@ -698,7 +741,7 @@
         <w:keepNext/>
       </w:pPr>
       <w:r>
-        <w:t>已整理15包，待整理56包。</w:t>
+        <w:t>已整理16包，待整理55包。</w:t>
       </w:r>
     </w:p>
     <w:p>
@@ -706,7 +749,7 @@
         <w:keepLines/>
       </w:pPr>
       <w:r>
-        <w:t>V-03、V-04、D-01、D-02、S-01、S-02、V-05、U-03、U-04、U-05、U-06、U-07、U-08、T-02、A-01、A-02、A-03、W-01、I-01、Q-01、Q-02、Q-03、X-01、X-02、X-03、Z-01、G-05、E-01、E-02、B-01、E-03、G-03、B-02、E-04、A-05、E-05、G-04、B-03、E-06、A-04、A-06、W-02、W-03、W-04、U12-01、U12-02、U12-03、U12-04、U12-05、U12-06、U12-07、U12-08、U12-09、U12-10、U12-11、U12-12</w:t>
+        <w:t>V-04、D-01、D-02、S-01、S-02、V-05、U-03、U-04、U-05、U-06、U-07、U-08、T-02、A-01、A-02、A-03、W-01、I-01、Q-01、Q-02、Q-03、X-01、X-02、X-03、Z-01、G-05、E-01、E-02、B-01、E-03、G-03、B-02、E-04、A-05、E-05、G-04、B-03、E-06、A-04、A-06、W-02、W-03、W-04、U12-01、U12-02、U12-03、U12-04、U12-05、U12-06、U12-07、U12-08、U12-09、U12-10、U12-11、U12-12</w:t>
       </w:r>
     </w:p>
     <w:p>

</xml_diff>

<commit_message>
refactor: normalize V-04 media review and current journey handoff
</commit_message>
<xml_diff>
--- a/human/project-review.docx
+++ b/human/project-review.docx
@@ -733,6 +733,44 @@
         <w:pStyle w:val="Heading1"/>
       </w:pPr>
       <w:r>
+        <w:t>V-04 Unity前期设计</w:t>
+      </w:r>
+    </w:p>
+    <w:p>
+      <w:r>
+        <w:t>原DONE与傅钧烨设计签收保留。37脚本迁入Agent归档，修复旧媒体忽略规则与LFS发布冲突及新报告覆盖问题；有效样片、800秒预演和当前旅程分别说明，真实Unity旅程与许可仍交下游。</w:t>
+      </w:r>
+    </w:p>
+    <w:p>
+      <w:r>
+        <w:t>V-01当前14节点规定前测后教学、首个分条件材料前登记暴露；V-05实现完整灰盒，U12-06/X-01接教学与登记。旧24镜头与14旅程节点不等同。</w:t>
+      </w:r>
+    </w:p>
+    <w:p>
+      <w:r>
+        <w:t>U-03/U-07实现v2.2真实步骤、双条件和回执，U-08/G-02逐实例登记32素材。fade全屏复色按有效时间，Recovery只管轮廓/纹理累计；预演顺序不决定运行顺序。</w:t>
+      </w:r>
+    </w:p>
+    <w:p>
+      <w:r>
+        <w:t>V04-N01 FIXED：迁移后的工具绑定与报告隔离，原JSON不变</w:t>
+      </w:r>
+    </w:p>
+    <w:p>
+      <w:r>
+        <w:t>V04-N02 FIXED：早期禁止Git跟踪规则与已签收LFS媒体冲突，改真实内容核验</w:t>
+      </w:r>
+    </w:p>
+    <w:p>
+      <w:r>
+        <w:t>V04-N03 HANDOFF_OPEN：原800秒核心预演不含新教学/测量旅程；交V05及U12-06/X01</w:t>
+      </w:r>
+    </w:p>
+    <w:p>
+      <w:pPr>
+        <w:pStyle w:val="Heading1"/>
+      </w:pPr>
+      <w:r>
         <w:t>待整理队列</w:t>
       </w:r>
     </w:p>
@@ -741,7 +779,7 @@
         <w:keepNext/>
       </w:pPr>
       <w:r>
-        <w:t>已整理16包，待整理55包。</w:t>
+        <w:t>已整理17包，待整理54包。</w:t>
       </w:r>
     </w:p>
     <w:p>
@@ -749,7 +787,7 @@
         <w:keepLines/>
       </w:pPr>
       <w:r>
-        <w:t>V-04、D-01、D-02、S-01、S-02、V-05、U-03、U-04、U-05、U-06、U-07、U-08、T-02、A-01、A-02、A-03、W-01、I-01、Q-01、Q-02、Q-03、X-01、X-02、X-03、Z-01、G-05、E-01、E-02、B-01、E-03、G-03、B-02、E-04、A-05、E-05、G-04、B-03、E-06、A-04、A-06、W-02、W-03、W-04、U12-01、U12-02、U12-03、U12-04、U12-05、U12-06、U12-07、U12-08、U12-09、U12-10、U12-11、U12-12</w:t>
+        <w:t>D-01、D-02、S-01、S-02、V-05、U-03、U-04、U-05、U-06、U-07、U-08、T-02、A-01、A-02、A-03、W-01、I-01、Q-01、Q-02、Q-03、X-01、X-02、X-03、Z-01、G-05、E-01、E-02、B-01、E-03、G-03、B-02、E-04、A-05、E-05、G-04、B-03、E-06、A-04、A-06、W-02、W-03、W-04、U12-01、U12-02、U12-03、U12-04、U12-05、U12-06、U12-07、U12-08、U12-09、U12-10、U12-11、U12-12</w:t>
       </w:r>
     </w:p>
     <w:p>

</xml_diff>

<commit_message>
refactor: normalize D-01 real acquisition handoff and retire old skeleton
</commit_message>
<xml_diff>
--- a/human/project-review.docx
+++ b/human/project-review.docx
@@ -771,6 +771,44 @@
         <w:pStyle w:val="Heading1"/>
       </w:pPr>
       <w:r>
+        <w:t>D-01 设备接入</w:t>
+      </w:r>
+    </w:p>
+    <w:p>
+      <w:r>
+        <w:t>D-01仍WAIT_DEP_EXTERNAL、未领取。旧Polar骨架及两份方案已实际归档；当前交接订正ECG通道、独立呼吸带与原始包记录。30项软件检查通过，不是H10真机或30分钟验收。</w:t>
+      </w:r>
+    </w:p>
+    <w:p>
+      <w:r>
+        <w:t>D-01原始ECG/RR包由P-02追加保存，D-02提供真实呼吸主通道；S-01做同步、SQI与时钟域，S-02做交互状态估计。通知原件先于降采样保存。</w:t>
+      </w:r>
+    </w:p>
+    <w:p>
+      <w:r>
+        <w:t>设备时间不能冒充主机时间，未知为null，原因另记L1；有payload的RawPacket不能填缺包原因，来源用polar_h10_ecg/rr。I-01须双真机800秒全链，G-05现场准入分别落实。</w:t>
+      </w:r>
+    </w:p>
+    <w:p>
+      <w:r>
+        <w:t>D01-N01 FIXED_CURRENT_HANDOFF：旧HR特征/ECG、EDR及聚合记录口径已在当前交接订正，骨架有据归档</w:t>
+      </w:r>
+    </w:p>
+    <w:p>
+      <w:r>
+        <w:t>D01-N02 OPEN_REAL_HARDWARE：缺实际驱动、Windows兼容与30分钟真机记录，不能关闭UP-06/M06</w:t>
+      </w:r>
+    </w:p>
+    <w:p>
+      <w:r>
+        <w:t>D01-N03 OPEN_REAL_OWNER：岗位P-HARDWARE未落实实际领取人，领取与输入冻结须由治理流程完成</w:t>
+      </w:r>
+    </w:p>
+    <w:p>
+      <w:pPr>
+        <w:pStyle w:val="Heading1"/>
+      </w:pPr>
+      <w:r>
         <w:t>待整理队列</w:t>
       </w:r>
     </w:p>
@@ -779,7 +817,7 @@
         <w:keepNext/>
       </w:pPr>
       <w:r>
-        <w:t>已整理17包，待整理54包。</w:t>
+        <w:t>已整理18包，待整理53包。</w:t>
       </w:r>
     </w:p>
     <w:p>
@@ -787,7 +825,7 @@
         <w:keepLines/>
       </w:pPr>
       <w:r>
-        <w:t>D-01、D-02、S-01、S-02、V-05、U-03、U-04、U-05、U-06、U-07、U-08、T-02、A-01、A-02、A-03、W-01、I-01、Q-01、Q-02、Q-03、X-01、X-02、X-03、Z-01、G-05、E-01、E-02、B-01、E-03、G-03、B-02、E-04、A-05、E-05、G-04、B-03、E-06、A-04、A-06、W-02、W-03、W-04、U12-01、U12-02、U12-03、U12-04、U12-05、U12-06、U12-07、U12-08、U12-09、U12-10、U12-11、U12-12</w:t>
+        <w:t>D-02、S-01、S-02、V-05、U-03、U-04、U-05、U-06、U-07、U-08、T-02、A-01、A-02、A-03、W-01、I-01、Q-01、Q-02、Q-03、X-01、X-02、X-03、Z-01、G-05、E-01、E-02、B-01、E-03、G-03、B-02、E-04、A-05、E-05、G-04、B-03、E-06、A-04、A-06、W-02、W-03、W-04、U12-01、U12-02、U12-03、U12-04、U12-05、U12-06、U12-07、U12-08、U12-09、U12-10、U12-11、U12-12</w:t>
       </w:r>
     </w:p>
     <w:p>

</xml_diff>

<commit_message>
refactor: normalize D-02 handoff and preserve native respiration batches
</commit_message>
<xml_diff>
--- a/human/project-review.docx
+++ b/human/project-review.docx
@@ -809,6 +809,49 @@
         <w:pStyle w:val="Heading1"/>
       </w:pPr>
       <w:r>
+        <w:t>D-02 设备接入</w:t>
+      </w:r>
+    </w:p>
+    <w:p>
+      <w:r>
+        <w:t>D-02仍WAIT_DEP_EXTERNAL、未领取；缺专用SDK、真实驱动及30分钟记录。共享帧补原生呼吸批次，37项软件测试通过；本轮完成双层规范化，不等于真机验收。</w:t>
+      </w:r>
+    </w:p>
+    <w:p>
+      <w:r>
+        <w:t>P-02接收plux_respiban原始包；D-01给ECG/RR，D-02给真实呼吸与运动，S-01同步/SQI，S-02做交互状态估计。未知设备时间置null，原因另记L1。</w:t>
+      </w:r>
+    </w:p>
+    <w:p>
+      <w:r>
+        <w:t>呼吸原生批次已保留；正式SDK及运动轴解码尚待实现，下游不可把旧显示均值、EDR或fixture视为真实输入。I-01仍须双设备800秒全链，真实准入由G-05落实。</w:t>
+      </w:r>
+    </w:p>
+    <w:p>
+      <w:r>
+        <w:t>D02-N01 FIXED_NATIVE_BATCH：共享呼吸帧原生样本丢失已补批次与时间戳，旧均值仅作显示</w:t>
+      </w:r>
+    </w:p>
+    <w:p>
+      <w:r>
+        <w:t>D02-N02 OPEN_VENDOR_AND_HARDWARE：缺respiBAN专用SDK、原始通知接口及真实30分钟记录，UP-06/M06仍开放</w:t>
+      </w:r>
+    </w:p>
+    <w:p>
+      <w:r>
+        <w:t>D02-N03 OPEN_REAL_OWNER：P-HARDWARE尚未落实实际领取人，不代填签收</w:t>
+      </w:r>
+    </w:p>
+    <w:p>
+      <w:r>
+        <w:t>D02-N04 FIXED_GOVERNANCE_RELOCATION：全仓发现R-01迁移路径误判，补精确映射；未知路径、其他任务和验收条件变化仍拒绝</w:t>
+      </w:r>
+    </w:p>
+    <w:p>
+      <w:pPr>
+        <w:pStyle w:val="Heading1"/>
+      </w:pPr>
+      <w:r>
         <w:t>待整理队列</w:t>
       </w:r>
     </w:p>
@@ -817,7 +860,7 @@
         <w:keepNext/>
       </w:pPr>
       <w:r>
-        <w:t>已整理18包，待整理53包。</w:t>
+        <w:t>已整理19包，待整理52包。</w:t>
       </w:r>
     </w:p>
     <w:p>
@@ -825,7 +868,7 @@
         <w:keepLines/>
       </w:pPr>
       <w:r>
-        <w:t>D-02、S-01、S-02、V-05、U-03、U-04、U-05、U-06、U-07、U-08、T-02、A-01、A-02、A-03、W-01、I-01、Q-01、Q-02、Q-03、X-01、X-02、X-03、Z-01、G-05、E-01、E-02、B-01、E-03、G-03、B-02、E-04、A-05、E-05、G-04、B-03、E-06、A-04、A-06、W-02、W-03、W-04、U12-01、U12-02、U12-03、U12-04、U12-05、U12-06、U12-07、U12-08、U12-09、U12-10、U12-11、U12-12</w:t>
+        <w:t>S-01、S-02、V-05、U-03、U-04、U-05、U-06、U-07、U-08、T-02、A-01、A-02、A-03、W-01、I-01、Q-01、Q-02、Q-03、X-01、X-02、X-03、Z-01、G-05、E-01、E-02、B-01、E-03、G-03、B-02、E-04、A-05、E-05、G-04、B-03、E-06、A-04、A-06、W-02、W-03、W-04、U12-01、U12-02、U12-03、U12-04、U12-05、U12-06、U12-07、U12-08、U12-09、U12-10、U12-11、U12-12</w:t>
       </w:r>
     </w:p>
     <w:p>

</xml_diff>

<commit_message>
refactor: normalize S-01 quality handoff and distinguish connection from SQI
</commit_message>
<xml_diff>
--- a/human/project-review.docx
+++ b/human/project-review.docx
@@ -852,6 +852,44 @@
         <w:pStyle w:val="Heading1"/>
       </w:pPr>
       <w:r>
+        <w:t>S-01 信号处理</w:t>
+      </w:r>
+    </w:p>
+    <w:p>
+      <w:r>
+        <w:t>S-01仍WAIT_DEP、未领取；双设备时钟映射、实测SQI和误差报告未完成。修复连接即good与启动前标记已连接的问题；125项软件检查通过，不能代替同步或真实质量验收。</w:t>
+      </w:r>
+    </w:p>
+    <w:p>
+      <w:r>
+        <w:t>D-01/D-02交原生时间戳、字节、序号及设备时钟域；S-01映射Python会话时间并提供分通道质量、偏差、漂移、不确定度。P-02保留原件与校准输入/结果，不覆盖L0。</w:t>
+      </w:r>
+    </w:p>
+    <w:p>
+      <w:r>
+        <w:t>S-02消费质量与原生信号做交互状态估计；P-01保持顺序和时间权威。U-02/T-01只消费降级与监控，I-01验证双设备全链；连接、SQI、Actual成功与情绪结果不互相替代。</w:t>
+      </w:r>
+    </w:p>
+    <w:p>
+      <w:r>
+        <w:t>S01-N01 FIXED_LINK_QUALITY_CONFUSION：启动前已连接和连接即good已修复，质量保持unknown</w:t>
+      </w:r>
+    </w:p>
+    <w:p>
+      <w:r>
+        <w:t>S01-N02 OPEN_REAL_SYNC_AND_SQI：缺实测双时钟映射、质量算法配置及误差报告，不能以旧原型关闭</w:t>
+      </w:r>
+    </w:p>
+    <w:p>
+      <w:r>
+        <w:t>S01-N03 OPEN_REAL_OWNER：实际领取人为空；阈值和精度需前测冻结，不代填验收</w:t>
+      </w:r>
+    </w:p>
+    <w:p>
+      <w:pPr>
+        <w:pStyle w:val="Heading1"/>
+      </w:pPr>
+      <w:r>
         <w:t>待整理队列</w:t>
       </w:r>
     </w:p>
@@ -860,7 +898,7 @@
         <w:keepNext/>
       </w:pPr>
       <w:r>
-        <w:t>已整理19包，待整理52包。</w:t>
+        <w:t>已整理20包，待整理51包。</w:t>
       </w:r>
     </w:p>
     <w:p>
@@ -868,7 +906,7 @@
         <w:keepLines/>
       </w:pPr>
       <w:r>
-        <w:t>S-01、S-02、V-05、U-03、U-04、U-05、U-06、U-07、U-08、T-02、A-01、A-02、A-03、W-01、I-01、Q-01、Q-02、Q-03、X-01、X-02、X-03、Z-01、G-05、E-01、E-02、B-01、E-03、G-03、B-02、E-04、A-05、E-05、G-04、B-03、E-06、A-04、A-06、W-02、W-03、W-04、U12-01、U12-02、U12-03、U12-04、U12-05、U12-06、U12-07、U12-08、U12-09、U12-10、U12-11、U12-12</w:t>
+        <w:t>S-02、V-05、U-03、U-04、U-05、U-06、U-07、U-08、T-02、A-01、A-02、A-03、W-01、I-01、Q-01、Q-02、Q-03、X-01、X-02、X-03、Z-01、G-05、E-01、E-02、B-01、E-03、G-03、B-02、E-04、A-05、E-05、G-04、B-03、E-06、A-04、A-06、W-02、W-03、W-04、U12-01、U12-02、U12-03、U12-04、U12-05、U12-06、U12-07、U12-08、U12-09、U12-10、U12-11、U12-12</w:t>
       </w:r>
     </w:p>
     <w:p>

</xml_diff>

<commit_message>
refactor: normalize S-02 event handoff and preserve frozen source migration
</commit_message>
<xml_diff>
--- a/human/project-review.docx
+++ b/human/project-review.docx
@@ -890,6 +890,49 @@
         <w:pStyle w:val="Heading1"/>
       </w:pPr>
       <w:r>
+        <w:t>S-02 交互状态估计</w:t>
+      </w:r>
+    </w:p>
+    <w:p>
+      <w:r>
+        <w:t>S-02仍WAIT_DEP、未领取；四结构检测、在线PF和真实双人标注尚未交付。旧评分设计已实际归档，118项软件回归与合同检查通过；A-03冻结副本保持原文，不能用旧综合分替代正式执行质量。</w:t>
+      </w:r>
+    </w:p>
+    <w:p>
+      <w:r>
+        <w:t>D-01/D-02提供原生包与时间，S-01提供同步及质量；P-01提供目标和流程，S-02独立估计Actual，不复制Target或接管顺序。P-02保存事件、机会和配置版本。</w:t>
+      </w:r>
+    </w:p>
+    <w:p>
+      <w:r>
+        <w:t>A-01按同一真实输入独立重算，A-03/U12-04冻结正式计分与缺失；U-02/T-01只消费实际状态和降级，I-01验证真机全链。当前检测、实测标注和责任人仍缺，不能解锁下游。</w:t>
+      </w:r>
+    </w:p>
+    <w:p>
+      <w:r>
+        <w:t>S02-N01 FIXED_ACTIVE_DESIGN_ENTRY：旧综合评分设计实际归档，活动入口改为步骤事件及机会PF，不借用旧文献主张</w:t>
+      </w:r>
+    </w:p>
+    <w:p>
+      <w:r>
+        <w:t>S02-N02 FIXED_FROZEN_SOURCE_RELOCATION：精确迁移保留A-03来源身份与原文，生成/校验仍检查哈希，副本未刷新</w:t>
+      </w:r>
+    </w:p>
+    <w:p>
+      <w:r>
+        <w:t>S02-N03 OPEN_REAL_EVENTS_AND_PF：四结构算法、真实标注和在线离线差未交付，容差与覆盖门仍待冻结</w:t>
+      </w:r>
+    </w:p>
+    <w:p>
+      <w:r>
+        <w:t>S02-N04 OPEN_REAL_OWNER_AND_A03_DECISION：实际领取人为空；A-03负责人须处理冻结旧评分来源影响，不代填裁定</w:t>
+      </w:r>
+    </w:p>
+    <w:p>
+      <w:pPr>
+        <w:pStyle w:val="Heading1"/>
+      </w:pPr>
+      <w:r>
         <w:t>待整理队列</w:t>
       </w:r>
     </w:p>
@@ -898,7 +941,7 @@
         <w:keepNext/>
       </w:pPr>
       <w:r>
-        <w:t>已整理20包，待整理51包。</w:t>
+        <w:t>已整理21包，待整理50包；根目录双层迁移未完成。下一项V-05。</w:t>
       </w:r>
     </w:p>
     <w:p>
@@ -906,12 +949,7 @@
         <w:keepLines/>
       </w:pPr>
       <w:r>
-        <w:t>S-02、V-05、U-03、U-04、U-05、U-06、U-07、U-08、T-02、A-01、A-02、A-03、W-01、I-01、Q-01、Q-02、Q-03、X-01、X-02、X-03、Z-01、G-05、E-01、E-02、B-01、E-03、G-03、B-02、E-04、A-05、E-05、G-04、B-03、E-06、A-04、A-06、W-02、W-03、W-04、U12-01、U12-02、U12-03、U12-04、U12-05、U12-06、U12-07、U12-08、U12-09、U12-10、U12-11、U12-12</w:t>
-      </w:r>
-    </w:p>
-    <w:p>
-      <w:r>
-        <w:t>根目录仍有旧业务目录，最终双层迁移未完成。下一包按上述队列顺序推进。</w:t>
+        <w:t>V-05、U-03、U-04、U-05、U-06、U-07、U-08、T-02、A-01、A-02、A-03、W-01、I-01、Q-01、Q-02、Q-03、X-01、X-02、X-03、Z-01、G-05、E-01、E-02、B-01、E-03、G-03、B-02、E-04、A-05、E-05、G-04、B-03、E-06、A-04、A-06、W-02、W-03、W-04、U12-01、U12-02、U12-03、U12-04、U12-05、U12-06、U12-07、U12-08、U12-09、U12-10、U12-11、U12-12</w:t>
       </w:r>
     </w:p>
     <w:sectPr>

</xml_diff>

<commit_message>
refactor: normalize V-05 graybox package and current handoffs
</commit_message>
<xml_diff>
--- a/human/project-review.docx
+++ b/human/project-review.docx
@@ -933,6 +933,49 @@
         <w:pStyle w:val="Heading1"/>
       </w:pPr>
       <w:r>
+        <w:t>V-05 Unity预制作</w:t>
+      </w:r>
+    </w:p>
+    <w:p>
+      <w:r>
+        <w:t>V-05仍READY、未领取；完整Unity灰盒、全旅程录像和真人形成性评审尚未交付。当前输入已补齐，24顺序×双条件Python核心矩阵及119项专项通过；不能由此解锁U-03或签收灰盒。</w:t>
+      </w:r>
+    </w:p>
+    <w:p>
+      <w:r>
+        <w:t>V-01提供完整旅程，V-02至V-04提供有效视觉与回退依据，F-03/U-01/U-02提供Unity基线、控制镜像及四层适配；P-01负责流程时钟，P-02负责记录。灰盒实际运行仍待领取人实施。</w:t>
+      </w:r>
+    </w:p>
+    <w:p>
+      <w:r>
+        <w:t>U-03消费通过复核和真人签收的灰盒及问题关闭矩阵，不消费48主机组合作为替代。形成性活动人员与去重交G-02/G-05；正式设备证据由D/S/I任务取得，32素材来源不代替真实许可。</w:t>
+      </w:r>
+    </w:p>
+    <w:p>
+      <w:r>
+        <w:t>V05-N01 FIXED_CURRENT_INPUTS：补齐七份当前来源，保留原历史输入，其他进行中及复核中的冻结身份不变</w:t>
+      </w:r>
+    </w:p>
+    <w:p>
+      <w:r>
+        <w:t>V05-N02 VERIFIED_HOST_MATRIX_NOT_UNITY：48组合v2.2核心与两条件时轴通过，只有合成ACK，不是Unity回执或全旅程运行</w:t>
+      </w:r>
+    </w:p>
+    <w:p>
+      <w:r>
+        <w:t>V05-N03 OPEN_UNITY_GRAYBOX_AND_FULL_JOURNEY：完整灰盒、教学运行、真实回执及完整录像未交付；核心800秒不含教学与测量</w:t>
+      </w:r>
+    </w:p>
+    <w:p>
+      <w:r>
+        <w:t>V05-N04 OPEN_HUMAN_REVIEW_AND_OWNER：实际领取人和形成性评审缺失，问题关闭及真人签收待实施，U-03不提前解锁</w:t>
+      </w:r>
+    </w:p>
+    <w:p>
+      <w:pPr>
+        <w:pStyle w:val="Heading1"/>
+      </w:pPr>
+      <w:r>
         <w:t>待整理队列</w:t>
       </w:r>
     </w:p>
@@ -941,7 +984,7 @@
         <w:keepNext/>
       </w:pPr>
       <w:r>
-        <w:t>已整理21包，待整理50包；根目录双层迁移未完成。下一项V-05。</w:t>
+        <w:t>已整理22包，待整理49包；根目录双层迁移未完成。下一项U-03。</w:t>
       </w:r>
     </w:p>
     <w:p>
@@ -949,7 +992,7 @@
         <w:keepLines/>
       </w:pPr>
       <w:r>
-        <w:t>V-05、U-03、U-04、U-05、U-06、U-07、U-08、T-02、A-01、A-02、A-03、W-01、I-01、Q-01、Q-02、Q-03、X-01、X-02、X-03、Z-01、G-05、E-01、E-02、B-01、E-03、G-03、B-02、E-04、A-05、E-05、G-04、B-03、E-06、A-04、A-06、W-02、W-03、W-04、U12-01、U12-02、U12-03、U12-04、U12-05、U12-06、U12-07、U12-08、U12-09、U12-10、U12-11、U12-12</w:t>
+        <w:t>U-03、U-04、U-05、U-06、U-07、U-08、T-02、A-01、A-02、A-03、W-01、I-01、Q-01、Q-02、Q-03、X-01、X-02、X-03、Z-01、G-05、E-01、E-02、B-01、E-03、G-03、B-02、E-04、A-05、E-05、G-04、B-03、E-06、A-04、A-06、W-02、W-03、W-04、U12-01、U12-02、U12-03、U12-04、U12-05、U12-06、U12-07、U12-08、U12-09、U12-10、U12-11、U12-12</w:t>
       </w:r>
     </w:p>
     <w:sectPr>

</xml_diff>

<commit_message>
docs: normalize U-03 handoff and archive obsolete scene design
</commit_message>
<xml_diff>
--- a/human/project-review.docx
+++ b/human/project-review.docx
@@ -976,6 +976,49 @@
         <w:pStyle w:val="Heading1"/>
       </w:pPr>
       <w:r>
+        <w:t>U-03 Unity场景</w:t>
+      </w:r>
+    </w:p>
+    <w:p>
+      <w:r>
+        <w:t>U-03保持WAIT_DEP、未领取；切片对象是fade，双条件完整模块、真实回执、形成性问题关闭及公共模板尚未验收。本轮已归档旧场景设计，修复当前背景映射残留的卷轴字段，180项专项通过。</w:t>
+      </w:r>
+    </w:p>
+    <w:p>
+      <w:r>
+        <w:t>V-05提供实际通过的灰盒及问题关闭，V-03/V-04提供有效映射和素材；U-01提供控制镜像与ConfirmRendered，U-02提供四层视图与累计锁定。Python仍为计时权威，ACK不是实际呈现回执。</w:t>
+      </w:r>
+    </w:p>
+    <w:p>
+      <w:r>
+        <w:t>U-04至U-07等待本包真实模板验收，U-08接性能及构建，G-02/G-05接许可及活动资格。模块默认200秒，不以68秒样片替代完整模块；素材存在不自动证明许可。</w:t>
+      </w:r>
+    </w:p>
+    <w:p>
+      <w:r>
+        <w:t>U03-N01 FIXED_LEGACY_ACTIVE_ENTRY：旧TD/Spout场景设计原文实际归档，当前入口改固定镜头fade双条件交接</w:t>
+      </w:r>
+    </w:p>
+    <w:p>
+      <w:r>
+        <w:t>U03-N02 FIXED_CURRENT_BACKGROUND_SCROLL_FIELDS：V-03当前生成器八行去除卷轴更新与取证字段，READY V-05同步，历史与冻结签署不改</w:t>
+      </w:r>
+    </w:p>
+    <w:p>
+      <w:r>
+        <w:t>U03-N03 VERIFIED_HANDOFF_NOT_RENDERED_SLICE：180项设计和核心检查通过，fade选择及v2.2双吸配置一致，不是Unity切片验收</w:t>
+      </w:r>
+    </w:p>
+    <w:p>
+      <w:r>
+        <w:t>U03-N04 OPEN_RUNTIME_TEMPLATE_AND_OWNER：V-05、实际负责人、双条件渲染、回执、Profiler和形成性模板冻结仍待交付，不解锁其余天气</w:t>
+      </w:r>
+    </w:p>
+    <w:p>
+      <w:pPr>
+        <w:pStyle w:val="Heading1"/>
+      </w:pPr>
+      <w:r>
         <w:t>待整理队列</w:t>
       </w:r>
     </w:p>
@@ -984,7 +1027,7 @@
         <w:keepNext/>
       </w:pPr>
       <w:r>
-        <w:t>已整理22包，待整理49包；根目录双层迁移未完成。下一项U-03。</w:t>
+        <w:t>已整理23包，待整理48包；根目录双层迁移未完成。下一项U-04。</w:t>
       </w:r>
     </w:p>
     <w:p>
@@ -992,7 +1035,7 @@
         <w:keepLines/>
       </w:pPr>
       <w:r>
-        <w:t>U-03、U-04、U-05、U-06、U-07、U-08、T-02、A-01、A-02、A-03、W-01、I-01、Q-01、Q-02、Q-03、X-01、X-02、X-03、Z-01、G-05、E-01、E-02、B-01、E-03、G-03、B-02、E-04、A-05、E-05、G-04、B-03、E-06、A-04、A-06、W-02、W-03、W-04、U12-01、U12-02、U12-03、U12-04、U12-05、U12-06、U12-07、U12-08、U12-09、U12-10、U12-11、U12-12</w:t>
+        <w:t>U-04、U-05、U-06、U-07、U-08、T-02、A-01、A-02、A-03、W-01、I-01、Q-01、Q-02、Q-03、X-01、X-02、X-03、Z-01、G-05、E-01、E-02、B-01、E-03、G-03、B-02、E-04、A-05、E-05、G-04、B-03、E-06、A-04、A-06、W-02、W-03、W-04、U12-01、U12-02、U12-03、U12-04、U12-05、U12-06、U12-07、U12-08、U12-09、U12-10、U12-11、U12-12</w:t>
       </w:r>
     </w:p>
     <w:sectPr>

</xml_diff>

<commit_message>
docs: normalize U-04 and archive obsolete Unity generators
</commit_message>
<xml_diff>
--- a/human/project-review.docx
+++ b/human/project-review.docx
@@ -1019,6 +1019,49 @@
         <w:pStyle w:val="Heading1"/>
       </w:pPr>
       <w:r>
+        <w:t>U-04 Unity场景</w:t>
+      </w:r>
+    </w:p>
+    <w:p>
+      <w:r>
+        <w:t>U-04仍WAIT_DEP、未领取；剩余天气A没有明确技术ID分配，不能默认storm。旧Unity框架与两个Editor生成工具已原文归档，34项设计检查及105项Unity EditMode通过；真实天气适配器和性能未验收。</w:t>
+      </w:r>
+    </w:p>
+    <w:p>
+      <w:r>
+        <w:t>V-02需补互斥完整的A/B/C分配；U-03先验收公共模板，再由U-04至U-06分别消费剩余天气及V-03映射、V-04素材。模板未通过不提前生产三个正式适配器；Python始终是顺序及时钟权威。</w:t>
+      </w:r>
+    </w:p>
+    <w:p>
+      <w:r>
+        <w:t>U-07消费天气条件切换与四结构提示交接，U-08消费真实视听/性能和构建，G-02/G-05消费许可与活动资格。U-04不把单天气扩成四天气完成，也不修改U-03最小抽象对照的职责。</w:t>
+      </w:r>
+    </w:p>
+    <w:p>
+      <w:r>
+        <w:t>U04-N01 OPEN_WEATHER_A_B_C_ALLOCATION：V-02未明确剩余天气A/B/C绑定，U-04保持selected_weather=null，不默认storm</w:t>
+      </w:r>
+    </w:p>
+    <w:p>
+      <w:r>
+        <w:t>U04-N02 FIXED_LEGACY_FRAMEWORK_AND_TOOLS：旧框架及两个无引用Editor生成器和meta原文归档，保留当前工程入口，105项Unity回归通过</w:t>
+      </w:r>
+    </w:p>
+    <w:p>
+      <w:r>
+        <w:t>U04-N03 VERIFIED_SHARED_ASSEMBLY_NOT_ADAPTER：34项设计与105项EditMode通过，旧StormScene不含当前桥/适配脚本引用，不等于新天气验收</w:t>
+      </w:r>
+    </w:p>
+    <w:p>
+      <w:r>
+        <w:t>U04-N04 OPEN_TEMPLATE_PERFORMANCE_AND_OWNER：U-03模板、真实负责人、Play和Profiler以及U-08预算仍待取得，WAIT_DEP不改变</w:t>
+      </w:r>
+    </w:p>
+    <w:p>
+      <w:pPr>
+        <w:pStyle w:val="Heading1"/>
+      </w:pPr>
+      <w:r>
         <w:t>待整理队列</w:t>
       </w:r>
     </w:p>
@@ -1027,7 +1070,7 @@
         <w:keepNext/>
       </w:pPr>
       <w:r>
-        <w:t>已整理23包，待整理48包；根目录双层迁移未完成。下一项U-04。</w:t>
+        <w:t>已整理24包，待整理47包；根目录双层迁移未完成。下一项U-05。</w:t>
       </w:r>
     </w:p>
     <w:p>
@@ -1035,7 +1078,7 @@
         <w:keepLines/>
       </w:pPr>
       <w:r>
-        <w:t>U-04、U-05、U-06、U-07、U-08、T-02、A-01、A-02、A-03、W-01、I-01、Q-01、Q-02、Q-03、X-01、X-02、X-03、Z-01、G-05、E-01、E-02、B-01、E-03、G-03、B-02、E-04、A-05、E-05、G-04、B-03、E-06、A-04、A-06、W-02、W-03、W-04、U12-01、U12-02、U12-03、U12-04、U12-05、U12-06、U12-07、U12-08、U12-09、U12-10、U12-11、U12-12</w:t>
+        <w:t>U-05、U-06、U-07、U-08、T-02、A-01、A-02、A-03、W-01、I-01、Q-01、Q-02、Q-03、X-01、X-02、X-03、Z-01、G-05、E-01、E-02、B-01、E-03、G-03、B-02、E-04、A-05、E-05、G-04、B-03、E-06、A-04、A-06、W-02、W-03、W-04、U12-01、U12-02、U12-03、U12-04、U12-05、U12-06、U12-07、U12-08、U12-09、U12-10、U12-11、U12-12</w:t>
       </w:r>
     </w:p>
     <w:sectPr>

</xml_diff>

<commit_message>
refactor: normalize U-05 handoff and archive obsolete scene tools
</commit_message>
<xml_diff>
--- a/human/project-review.docx
+++ b/human/project-review.docx
@@ -1062,6 +1062,54 @@
         <w:pStyle w:val="Heading1"/>
       </w:pPr>
       <w:r>
+        <w:t>U-05 Unity场景</w:t>
+      </w:r>
+    </w:p>
+    <w:p>
+      <w:r>
+        <w:t>U-05仍WAIT_DEP、未领取，B没有明确技术ID，不默认heat。两项旧场景修改菜单及meta已原文归档；38项专项和105项Unity EditMode通过，真实天气适配器、性能及签收仍未完成。</w:t>
+      </w:r>
+    </w:p>
+    <w:p>
+      <w:r>
+        <w:t>V-02明确A/B/C互斥技术ID，U-03验收公共模板后U-04至U-06各消费一个剩余天气；V-03提供分层映射、V-04提供有效素材，Python保持顺序及时钟权威。B未分配时不默认heat，旧Heat/Snow场景不能作为模板实例。</w:t>
+      </w:r>
+    </w:p>
+    <w:p>
+      <w:r>
+        <w:t>U-07消费条件切换与抽象四结构推广；U-08先落实目标设备及预算规格，再接收真实性能与视听结果完成集成。两条件背景、声音、时轴及累计函数相同，真实回执与ACK分开；G-02/G-05负责许可和活动资格。</w:t>
+      </w:r>
+    </w:p>
+    <w:p>
+      <w:r>
+        <w:t>U05-N01 OPEN_WEATHER_B_ALLOCATION：B未明确分配，不按列表第二项默认heat；模板仍待U-03验收</w:t>
+      </w:r>
+    </w:p>
+    <w:p>
+      <w:r>
+        <w:t>U05-N02 FIXED_OBSOLETE_SCENE_MUTATION_MENUS：两个无引用旧Editor场景修改菜单及meta原文归档，逐字节比较与共享Unity回归通过</w:t>
+      </w:r>
+    </w:p>
+    <w:p>
+      <w:r>
+        <w:t>U05-N03 VERIFIED_SHARED_REGRESSION_NOT_WEATHER：38项专项与105项EditMode通过；旧Heat/Snow无脚本绑定，不等于天气B适配器验收</w:t>
+      </w:r>
+    </w:p>
+    <w:p>
+      <w:r>
+        <w:t>U05-N04 OPEN_BUDGET_SPEC_BEFORE_INTEGRATION：U-05 AC3消费U-08预算，而U-08整体依赖U-05，需先落实预算规格，不伪造性能通过</w:t>
+      </w:r>
+    </w:p>
+    <w:p>
+      <w:r>
+        <w:t>U05-N05 OPEN_OWNER_PLAY_AND_PROFILER：实际负责人、Play、Profiler、声音和真人签收仍缺，业务状态不变</w:t>
+      </w:r>
+    </w:p>
+    <w:p>
+      <w:pPr>
+        <w:pStyle w:val="Heading1"/>
+      </w:pPr>
+      <w:r>
         <w:t>待整理队列</w:t>
       </w:r>
     </w:p>
@@ -1070,7 +1118,7 @@
         <w:keepNext/>
       </w:pPr>
       <w:r>
-        <w:t>已整理24包，待整理47包；根目录双层迁移未完成。下一项U-05。</w:t>
+        <w:t>已整理25包，待整理46包；根目录双层迁移未完成。下一项U-06。</w:t>
       </w:r>
     </w:p>
     <w:p>
@@ -1078,7 +1126,7 @@
         <w:keepLines/>
       </w:pPr>
       <w:r>
-        <w:t>U-05、U-06、U-07、U-08、T-02、A-01、A-02、A-03、W-01、I-01、Q-01、Q-02、Q-03、X-01、X-02、X-03、Z-01、G-05、E-01、E-02、B-01、E-03、G-03、B-02、E-04、A-05、E-05、G-04、B-03、E-06、A-04、A-06、W-02、W-03、W-04、U12-01、U12-02、U12-03、U12-04、U12-05、U12-06、U12-07、U12-08、U12-09、U12-10、U12-11、U12-12</w:t>
+        <w:t>U-06、U-07、U-08、T-02、A-01、A-02、A-03、W-01、I-01、Q-01、Q-02、Q-03、X-01、X-02、X-03、Z-01、G-05、E-01、E-02、B-01、E-03、G-03、B-02、E-04、A-05、E-05、G-04、B-03、E-06、A-04、A-06、W-02、W-03、W-04、U12-01、U12-02、U12-03、U12-04、U12-05、U12-06、U12-07、U12-08、U12-09、U12-10、U12-11、U12-12</w:t>
       </w:r>
     </w:p>
     <w:sectPr>

</xml_diff>

<commit_message>
refactor: normalize U-06 handoff and retire legacy rebuild menus
</commit_message>
<xml_diff>
--- a/human/project-review.docx
+++ b/human/project-review.docx
@@ -1110,6 +1110,49 @@
         <w:pStyle w:val="Heading1"/>
       </w:pPr>
       <w:r>
+        <w:t>U-06 Unity场景</w:t>
+      </w:r>
+    </w:p>
+    <w:p>
+      <w:r>
+        <w:t>U-06仍WAIT_DEP、未领取，C没有明确技术ID，不默认snow。三项旧Final/Fix场景重建菜单及meta已原文归档；40项专项和105项Unity EditMode通过，真实天气、性能及成品未验收。</w:t>
+      </w:r>
+    </w:p>
+    <w:p>
+      <w:r>
+        <w:t>V-02给出互斥完整的A/B/C技术ID，U-03验收公共模板；U-04至U-06分别覆盖三个剩余天气，V-03提供分层映射、V-04提供有效素材。三包未分配时不能用清单或排除法替代决定；Python保持顺序及时钟权威。</w:t>
+      </w:r>
+    </w:p>
+    <w:p>
+      <w:r>
+        <w:t>U-07消费双条件接口及抽象四结构推广，U-08先明确设备/预算规格，再接收视听、性能、最终场景清单与独立构建；F-03仅承接开发构建，不代替U-08成品。G-02/G-05负责许可与活动资格，回执和ACK分开。</w:t>
+      </w:r>
+    </w:p>
+    <w:p>
+      <w:r>
+        <w:t>U06-N01 OPEN_WEATHER_C_ALLOCATION：A/B/C均未明确分配，C不默认snow，公共模板仍待U-03</w:t>
+      </w:r>
+    </w:p>
+    <w:p>
+      <w:r>
+        <w:t>U06-N02 FIXED_LEGACY_FINAL_AND_FIX_MENUS：三项旧素材重导入和场景重建菜单及meta原文归档，活动工程无引用，共享回归通过</w:t>
+      </w:r>
+    </w:p>
+    <w:p>
+      <w:r>
+        <w:t>U06-N03 VERIFIED_DEV_BUILD_BOUNDARY_NOT_PRODUCT：默认列表为SampleScene；旧Final菜单不打包，F-03显式DEV-REPLAY不证明最终天气制品</w:t>
+      </w:r>
+    </w:p>
+    <w:p>
+      <w:r>
+        <w:t>U06-N04 OPEN_BUDGET_OWNER_AND_REAL_ACCEPTANCE：预算规格、实际负责人、天气Play和Profiler仍缺，40项专项及105项EditMode不替代验收</w:t>
+      </w:r>
+    </w:p>
+    <w:p>
+      <w:pPr>
+        <w:pStyle w:val="Heading1"/>
+      </w:pPr>
+      <w:r>
         <w:t>待整理队列</w:t>
       </w:r>
     </w:p>
@@ -1118,7 +1161,7 @@
         <w:keepNext/>
       </w:pPr>
       <w:r>
-        <w:t>已整理25包，待整理46包；根目录双层迁移未完成。下一项U-06。</w:t>
+        <w:t>已整理26包，待整理45包；根目录双层迁移未完成。下一项U-07。</w:t>
       </w:r>
     </w:p>
     <w:p>
@@ -1126,7 +1169,7 @@
         <w:keepLines/>
       </w:pPr>
       <w:r>
-        <w:t>U-06、U-07、U-08、T-02、A-01、A-02、A-03、W-01、I-01、Q-01、Q-02、Q-03、X-01、X-02、X-03、Z-01、G-05、E-01、E-02、B-01、E-03、G-03、B-02、E-04、A-05、E-05、G-04、B-03、E-06、A-04、A-06、W-02、W-03、W-04、U12-01、U12-02、U12-03、U12-04、U12-05、U12-06、U12-07、U12-08、U12-09、U12-10、U12-11、U12-12</w:t>
+        <w:t>U-07、U-08、T-02、A-01、A-02、A-03、W-01、I-01、Q-01、Q-02、Q-03、X-01、X-02、X-03、Z-01、G-05、E-01、E-02、B-01、E-03、G-03、B-02、E-04、A-05、E-05、G-04、B-03、E-06、A-04、A-06、W-02、W-03、W-04、U12-01、U12-02、U12-03、U12-04、U12-05、U12-06、U12-07、U12-08、U12-09、U12-10、U12-11、U12-12</w:t>
       </w:r>
     </w:p>
     <w:sectPr>

</xml_diff>

<commit_message>
Normalize U-07 abstract representation task and review documents
</commit_message>
<xml_diff>
--- a/human/project-review.docx
+++ b/human/project-review.docx
@@ -1153,6 +1153,54 @@
         <w:pStyle w:val="Heading1"/>
       </w:pPr>
       <w:r>
+        <w:t>U-07 Unity场景</w:t>
+      </w:r>
+    </w:p>
+    <w:p>
+      <w:r>
+        <w:t>U-07仍WAIT_DEP、未领取，U-03公共模板未验收。旧抽象规格原文归档，当前四结构、四态降级及两条件匹配入口已订正；41项专项通过，不构成真实双环、四天气或混杂实测验收。</w:t>
+      </w:r>
+    </w:p>
+    <w:p>
+      <w:r>
+        <w:t>U-03先做fade最小完整双条件并冻结模板，U-07复用后推广四结构，不形成反向等待。U-04至U-06负责其余天气，A/B/C未分配不能由本包代定。F-05提供合同，R-01提供完整方案比较边界，V-02/V-03提供形式及映射。</w:t>
+      </w:r>
+    </w:p>
+    <w:p>
+      <w:r>
+        <w:t>两条件匹配目标事实、算法、累计、降级、时长、背景、声音、奖励、教学测量、显示、负担及事件真值。形成性同源，正式参与者各自真实输入。抽象关闭原生周期载体，fade整屏复色随有效时间且不表示成绩；六类处理差异完整报告，不要求像素同一。</w:t>
+      </w:r>
+    </w:p>
+    <w:p>
+      <w:r>
+        <w:t>U-08消费真实配置与集成输入；Q-01/Q-02及U12-02消费同源片段和真值，论文任务按实际收益、代价和边界报告，不保证原生获胜、不单独归因天气或呼吸法。</w:t>
+      </w:r>
+    </w:p>
+    <w:p>
+      <w:r>
+        <w:t>U07-N01 FIXED_STALE_GENERIC_FADE_SPEC：旧低质量内环淡出规格原文归档，原入口导航当前四态规则；历史候选与签署不改</w:t>
+      </w:r>
+    </w:p>
+    <w:p>
+      <w:r>
+        <w:t>U07-N02 FIXED_AND_RETESTED_POINTER_LINK：首次导航相对路径失败，源文件修正并专项复测通过，原失败记录保留</w:t>
+      </w:r>
+    </w:p>
+    <w:p>
+      <w:r>
+        <w:t>U07-N03 OPEN_FOUR_STRUCTURE_RENDER_AND_CONFOUND_EVIDENCE：四结构真实双环配置、Play、掩膜、差异遥测及混杂实测未交付，两个storm示例和逻辑投影不代替</w:t>
+      </w:r>
+    </w:p>
+    <w:p>
+      <w:r>
+        <w:t>U07-N04 OPEN_TEMPLATE_OWNER_AND_FORMAL_LIMITS：U-03模板、实际负责人和正式视觉范围未冻结，U-03最小对照不反向等待U-07推广</w:t>
+      </w:r>
+    </w:p>
+    <w:p>
+      <w:pPr>
+        <w:pStyle w:val="Heading1"/>
+      </w:pPr>
+      <w:r>
         <w:t>待整理队列</w:t>
       </w:r>
     </w:p>
@@ -1161,7 +1209,7 @@
         <w:keepNext/>
       </w:pPr>
       <w:r>
-        <w:t>已整理26包，待整理45包；根目录双层迁移未完成。下一项U-07。</w:t>
+        <w:t>已整理27包，待整理44包；根目录双层迁移未完成。下一项U-08。</w:t>
       </w:r>
     </w:p>
     <w:p>
@@ -1169,7 +1217,7 @@
         <w:keepLines/>
       </w:pPr>
       <w:r>
-        <w:t>U-07、U-08、T-02、A-01、A-02、A-03、W-01、I-01、Q-01、Q-02、Q-03、X-01、X-02、X-03、Z-01、G-05、E-01、E-02、B-01、E-03、G-03、B-02、E-04、A-05、E-05、G-04、B-03、E-06、A-04、A-06、W-02、W-03、W-04、U12-01、U12-02、U12-03、U12-04、U12-05、U12-06、U12-07、U12-08、U12-09、U12-10、U12-11、U12-12</w:t>
+        <w:t>U-08、T-02、A-01、A-02、A-03、W-01、I-01、Q-01、Q-02、Q-03、X-01、X-02、X-03、Z-01、G-05、E-01、E-02、B-01、E-03、G-03、B-02、E-04、A-05、E-05、G-04、B-03、E-06、A-04、A-06、W-02、W-03、W-04、U12-01、U12-02、U12-03、U12-04、U12-05、U12-06、U12-07、U12-08、U12-09、U12-10、U12-11、U12-12</w:t>
       </w:r>
     </w:p>
     <w:sectPr>

</xml_diff>

<commit_message>
Normalize U-08 product handoff and archive obsolete scene builders
</commit_message>
<xml_diff>
--- a/human/project-review.docx
+++ b/human/project-review.docx
@@ -1201,6 +1201,54 @@
         <w:pStyle w:val="Heading1"/>
       </w:pPr>
       <w:r>
+        <w:t>U-08 Unity成品</w:t>
+      </w:r>
+    </w:p>
+    <w:p>
+      <w:r>
+        <w:t>U-08仍WAIT_DEP、未领取。两个旧Build Scene菜单及meta已原文归档，40项专项和105项Unity EditMode通过；成品规格、五适配器覆盖和发布职责已整理，目标设备预算、真实可访问路径及Windows成品尚未验收。</w:t>
+      </w:r>
+    </w:p>
+    <w:p>
+      <w:r>
+        <w:t>U-03先给fade双条件模板，U-04至U-06给三个明确天气，U-07给四结构抽象配置；当前A/B/C尚未分配。U-08先给目标设备和预算规格，再按真实结果完成整合；不会要求整体DONE才给规格。</w:t>
+      </w:r>
+    </w:p>
+    <w:p>
+      <w:r>
+        <w:t>formal_frozen会话前冻结且参与者不调参，demo_accessible仅启动前减运动/静音且不形成正式证据。两条件同背景、声音和累计，fade整屏复色随有效时间，暂停冻结视觉及音轨并从冻结位置恢复；不新增核心阶段条件特有文字。</w:t>
+      </w:r>
+    </w:p>
+    <w:p>
+      <w:r>
+        <w:t>成品交I-01/Z-01，G-02提供发布许可门、G-05取得真实外部关闭；D/S/I承担真实设备联调。实际许可、U4、Windows候选和无TD运行须分别留证，不将共享回归或开发EXE转为正式活动准入。</w:t>
+      </w:r>
+    </w:p>
+    <w:p>
+      <w:r>
+        <w:t>U08-N01 FIXED_LEGACY_SCENE_BUILD_MENUS：两个无引用旧场景重建菜单及meta原文归档，不再与Windows成品构建混淆，共享回归通过</w:t>
+      </w:r>
+    </w:p>
+    <w:p>
+      <w:r>
+        <w:t>U08-N02 OPEN_TARGET_BUDGET_FREEZE：提供上游先行规格字段和交接顺序，但真实目标设备及性能阈值尚未冻结，null不表示通过</w:t>
+      </w:r>
+    </w:p>
+    <w:p>
+      <w:r>
+        <w:t>U08-N03 CLARIFIED_EIGHT_CASES_AND_RESEARCH_U4：五适配器须覆盖四天气双条件八呈现、48顺序条件轨迹；研究U4不等于任务U-04</w:t>
+      </w:r>
+    </w:p>
+    <w:p>
+      <w:r>
+        <w:t>U08-N04 OPEN_FORMAL_ASSEMBLY_ACCESSIBILITY_AND_LICENSE：默认SampleScene、开发EXE及软件许可门不证明成品，实际装配/U4/性能/许可清零和负责人仍待落实</w:t>
+      </w:r>
+    </w:p>
+    <w:p>
+      <w:pPr>
+        <w:pStyle w:val="Heading1"/>
+      </w:pPr>
+      <w:r>
         <w:t>待整理队列</w:t>
       </w:r>
     </w:p>
@@ -1209,7 +1257,7 @@
         <w:keepNext/>
       </w:pPr>
       <w:r>
-        <w:t>已整理27包，待整理44包；根目录双层迁移未完成。下一项U-08。</w:t>
+        <w:t>已整理28包，待整理43包；根目录双层迁移未完成。下一项T-02。</w:t>
       </w:r>
     </w:p>
     <w:p>
@@ -1217,7 +1265,7 @@
         <w:keepLines/>
       </w:pPr>
       <w:r>
-        <w:t>U-08、T-02、A-01、A-02、A-03、W-01、I-01、Q-01、Q-02、Q-03、X-01、X-02、X-03、Z-01、G-05、E-01、E-02、B-01、E-03、G-03、B-02、E-04、A-05、E-05、G-04、B-03、E-06、A-04、A-06、W-02、W-03、W-04、U12-01、U12-02、U12-03、U12-04、U12-05、U12-06、U12-07、U12-08、U12-09、U12-10、U12-11、U12-12</w:t>
+        <w:t>T-02、A-01、A-02、A-03、W-01、I-01、Q-01、Q-02、Q-03、X-01、X-02、X-03、Z-01、G-05、E-01、E-02、B-01、E-03、G-03、B-02、E-04、A-05、E-05、G-04、B-03、E-06、A-04、A-06、W-02、W-03、W-04、U12-01、U12-02、U12-03、U12-04、U12-05、U12-06、U12-07、U12-08、U12-09、U12-10、U12-11、U12-12</w:t>
       </w:r>
     </w:p>
     <w:sectPr>

</xml_diff>

<commit_message>
Normalize T-02 handoff and archive legacy TD authoring
</commit_message>
<xml_diff>
--- a/human/project-review.docx
+++ b/human/project-review.docx
@@ -1249,6 +1249,54 @@
         <w:pStyle w:val="Heading1"/>
       </w:pPr>
       <w:r>
+        <w:t>T-02 TouchDesigner</w:t>
+      </w:r>
+    </w:p>
+    <w:p>
+      <w:r>
+        <w:t>T-02仍READY、未领取。15份旧TD引导与遥控原件已归档；276项专项和635项根回归通过。实际TD请求仍统一拒绝，人工标记、请求ACK、告警历史及操作录像未交付；本轮不构成业务签收。</w:t>
+      </w:r>
+    </w:p>
+    <w:p>
+      <w:r>
+        <w:t>T-01提供只读遥测、计数与质量来源；P-01提供核心和控制，P-02提供耐久记录及离线消费。T-02应分开请求接受、记录结果、Unity控制ACK与渲染回执；socket发送不代表中止已执行。</w:t>
+      </w:r>
+    </w:p>
+    <w:p>
+      <w:r>
+        <w:t>告警确认只改变本地已读，不改变SQI、阈值、顺序或核心状态；TD缺席不阻断体验。A-01消费人工标记时与原始设备数据、在线事实和离线重算分别处理。</w:t>
+      </w:r>
+    </w:p>
+    <w:p>
+      <w:r>
+        <w:t>UI13至UI16是本包核心；UI17至UI20的快照、截图、归档、事件导出是已提出但未实现的扩展，分别验收。完整会话导出经Python和G-02权限，TD不直读受限原件。</w:t>
+      </w:r>
+    </w:p>
+    <w:p>
+      <w:r>
+        <w:t>T02-N01 FIXED_LEGACY_AUTHORING_ARCHIVE：15份旧TD引导、任意脚本遥控及原型工程实际原文归档，当前导航修正，不再混作操作员请求</w:t>
+      </w:r>
+    </w:p>
+    <w:p>
+      <w:r>
+        <w:t>T02-N02 OPEN_TD_REQUEST_AND_DURABLE_MARK：真实TCP TD请求仍统一拒绝，内部manual_mark不支持；请求handler/ACK/耐久标记及正向权限验收仍缺</w:t>
+      </w:r>
+    </w:p>
+    <w:p>
+      <w:r>
+        <w:t>T02-N03 CLARIFIED_ACK_AND_ALARM_AUTHORITY：请求ACK不等于UnityACK，发送不等于执行；告警确认不改变质量、阈值或会话</w:t>
+      </w:r>
+    </w:p>
+    <w:p>
+      <w:r>
+        <w:t>T02-N04 OPEN_UI_EVIDENCE_AND_OWNER：告警历史、实际A主题操作、日志/录像及真实负责人未交付；导出截图扩展另验，不扩大本包基础验收</w:t>
+      </w:r>
+    </w:p>
+    <w:p>
+      <w:pPr>
+        <w:pStyle w:val="Heading1"/>
+      </w:pPr>
+      <w:r>
         <w:t>待整理队列</w:t>
       </w:r>
     </w:p>
@@ -1257,7 +1305,7 @@
         <w:keepNext/>
       </w:pPr>
       <w:r>
-        <w:t>已整理28包，待整理43包；根目录双层迁移未完成。下一项T-02。</w:t>
+        <w:t>已整理29包，待整理42包；根目录双层迁移未完成。下一项A-01。</w:t>
       </w:r>
     </w:p>
     <w:p>
@@ -1265,7 +1313,7 @@
         <w:keepLines/>
       </w:pPr>
       <w:r>
-        <w:t>T-02、A-01、A-02、A-03、W-01、I-01、Q-01、Q-02、Q-03、X-01、X-02、X-03、Z-01、G-05、E-01、E-02、B-01、E-03、G-03、B-02、E-04、A-05、E-05、G-04、B-03、E-06、A-04、A-06、W-02、W-03、W-04、U12-01、U12-02、U12-03、U12-04、U12-05、U12-06、U12-07、U12-08、U12-09、U12-10、U12-11、U12-12</w:t>
+        <w:t>A-01、A-02、A-03、W-01、I-01、Q-01、Q-02、Q-03、X-01、X-02、X-03、Z-01、G-05、E-01、E-02、B-01、E-03、G-03、B-02、E-04、A-05、E-05、G-04、B-03、E-06、A-04、A-06、W-02、W-03、W-04、U12-01、U12-02、U12-03、U12-04、U12-05、U12-06、U12-07、U12-08、U12-09、U12-10、U12-11、U12-12</w:t>
       </w:r>
     </w:p>
     <w:sectPr>

</xml_diff>

<commit_message>
Normalize A-01 offline evidence consumption and human review
</commit_message>
<xml_diff>
--- a/human/project-review.docx
+++ b/human/project-review.docx
@@ -1297,6 +1297,54 @@
         <w:pStyle w:val="Heading1"/>
       </w:pPr>
       <w:r>
+        <w:t>A-01 离线分析</w:t>
+      </w:r>
+    </w:p>
+    <w:p>
+      <w:r>
+        <w:t>A-01仍WAIT_DEP、未领取。旧QC/PF原文已归档，当前研究入口订正；98项专项通过。P-02提供记录读取和核心重放，但同步、事件、L3汇总与自动差报告尚未交付，本轮不构成业务签收。</w:t>
+      </w:r>
+    </w:p>
+    <w:p>
+      <w:r>
+        <w:t>S-01提供真实时钟和SQI，S-02提供独立Actual事件；目标步骤不得当作检测结果。时长容差、覆盖和在线离线差阈值仍未冻结，不能填示例值。</w:t>
+      </w:r>
+    </w:p>
+    <w:p>
+      <w:r>
+        <w:t>L3交给A-02/A-03，保留机会三态、各类计数、缺失和原因码；缺模块不重新平均，量表与过程指标不合成一个情绪分。L4/L5最终分析和论文主张归后续任务。</w:t>
+      </w:r>
+    </w:p>
+    <w:p>
+      <w:r>
+        <w:t>T-02人工标记服务还未实现，A-01不能补造缺失标记；核心重放不连接设备、不发控制、不重复登记暴露。实际差报告和下游消费验收继续开放。</w:t>
+      </w:r>
+    </w:p>
+    <w:p>
+      <w:r>
+        <w:t>A01-N01 FIXED_LEGACY_RULES_AND_AUTHORITY：旧QC/PF规则原文归档，模块地图改当前研究v1.2与A-01入口，主要情绪报告不再依赖旧功能门</w:t>
+      </w:r>
+    </w:p>
+    <w:p>
+      <w:r>
+        <w:t>A01-N02 FIXED_AND_RETESTED_HASH_POLICY：本轮测试误用字节哈希及manifest字段，按既有口径修复，冻结输入未漂移且失败记录保留</w:t>
+      </w:r>
+    </w:p>
+    <w:p>
+      <w:r>
+        <w:t>A01-N03 OPEN_OFFLINE_PIPELINE_AND_DIFF_REPORT：存储读取及核心重放不等于同步、事件、L3重建和自动差报告，完整AC未交付</w:t>
+      </w:r>
+    </w:p>
+    <w:p>
+      <w:r>
+        <w:t>A01-N04 OPEN_PERMISSION_THRESHOLDS_AND_OWNER：受限原件授权读取、真实算法阈值、实际责任人和消费者验收仍待落实</w:t>
+      </w:r>
+    </w:p>
+    <w:p>
+      <w:pPr>
+        <w:pStyle w:val="Heading1"/>
+      </w:pPr>
+      <w:r>
         <w:t>待整理队列</w:t>
       </w:r>
     </w:p>
@@ -1305,7 +1353,7 @@
         <w:keepNext/>
       </w:pPr>
       <w:r>
-        <w:t>已整理29包，待整理42包；根目录双层迁移未完成。下一项A-01。</w:t>
+        <w:t>已整理30包，待整理41包；根目录双层迁移未完成。下一项A-02。</w:t>
       </w:r>
     </w:p>
     <w:p>
@@ -1313,7 +1361,7 @@
         <w:keepLines/>
       </w:pPr>
       <w:r>
-        <w:t>A-01、A-02、A-03、W-01、I-01、Q-01、Q-02、Q-03、X-01、X-02、X-03、Z-01、G-05、E-01、E-02、B-01、E-03、G-03、B-02、E-04、A-05、E-05、G-04、B-03、E-06、A-04、A-06、W-02、W-03、W-04、U12-01、U12-02、U12-03、U12-04、U12-05、U12-06、U12-07、U12-08、U12-09、U12-10、U12-11、U12-12</w:t>
+        <w:t>A-02、A-03、W-01、I-01、Q-01、Q-02、Q-03、X-01、X-02、X-03、Z-01、G-05、E-01、E-02、B-01、E-03、G-03、B-02、E-04、A-05、E-05、G-04、B-03、E-06、A-04、A-06、W-02、W-03、W-04、U12-01、U12-02、U12-03、U12-04、U12-05、U12-06、U12-07、U12-08、U12-09、U12-10、U12-11、U12-12</w:t>
       </w:r>
     </w:p>
     <w:sectPr>

</xml_diff>

<commit_message>
Normalize A-02 functional statistics and missingness handoff
</commit_message>
<xml_diff>
--- a/human/project-review.docx
+++ b/human/project-review.docx
@@ -1345,6 +1345,54 @@
         <w:pStyle w:val="Heading1"/>
       </w:pPr>
       <w:r>
+        <w:t>A-02 统计实现</w:t>
+      </w:r>
+    </w:p>
+    <w:p>
+      <w:r>
+        <w:t>A-02仍WAIT_DEP、未领取。旧统计计划已原文归档，29项专项通过；主要PANAS、PF护栏及SCCI分开报告。两分析集、100次候选插补和敏感性完整流水线未交付，U12-04签收不等于本包完成。</w:t>
+      </w:r>
+    </w:p>
+    <w:p>
+      <w:r>
+        <w:t>A-01交L3、原分配、问卷引用及机会三态/缺失原因；A-02分别重建全部随机分配与完整四模块集，不按结果方向筛人。量表缺失与过程缺失分开，设备失败不自动删除有效PANAS。</w:t>
+      </w:r>
+    </w:p>
+    <w:p>
+      <w:r>
+        <w:t>U12-04供候选SAP，U12-11/G-03完成数值冻结；A-05消费锁定分析集与敏感性结果，Z-01复现合成样例。A-03旧有序门只属原范围，冻结输入不自动追认本次新规则。</w:t>
+      </w:r>
+    </w:p>
+    <w:p>
+      <w:r>
+        <w:t>仍需实际两集构建、有界MI及合并、偏移网格/tipping point、不可估计处理与下游复跑。所有结果按实际证据交接，不能用候选100次或旧N写成正式完成。</w:t>
+      </w:r>
+    </w:p>
+    <w:p>
+      <w:r>
+        <w:t>A02-N01 FIXED_LEGACY_ORDERED_STATISTICS：旧统计有序门计划原文归档，当前导航改PANAS主比较、PF护栏与SCCI分开报告</w:t>
+      </w:r>
+    </w:p>
+    <w:p>
+      <w:r>
+        <w:t>A02-N02 CLARIFIED_SYNTHETIC_NOT_MI：实际合成前测代填不是100次多重插补，OBSERVED_CASE不核验完整四模块资格，不能转移U12-04签名</w:t>
+      </w:r>
+    </w:p>
+    <w:p>
+      <w:r>
+        <w:t>A02-N03 OPEN_ANALYSIS_SETS_MI_AND_SENSITIVITY：两分析集、有界插补合并、偏移网格和tipping point及下游复跑尚未交付</w:t>
+      </w:r>
+    </w:p>
+    <w:p>
+      <w:r>
+        <w:t>A02-N04 OPEN_FREEZE_AND_REAL_OWNER：缺失模型、功能界值、正式N和真实责任人未落实，规范化不改业务WAIT_DEP</w:t>
+      </w:r>
+    </w:p>
+    <w:p>
+      <w:pPr>
+        <w:pStyle w:val="Heading1"/>
+      </w:pPr>
+      <w:r>
         <w:t>待整理队列</w:t>
       </w:r>
     </w:p>
@@ -1353,7 +1401,7 @@
         <w:keepNext/>
       </w:pPr>
       <w:r>
-        <w:t>已整理30包，待整理41包；根目录双层迁移未完成。下一项A-02。</w:t>
+        <w:t>已整理31包，待整理40包；根目录双层迁移未完成。下一项A-03。</w:t>
       </w:r>
     </w:p>
     <w:p>
@@ -1361,7 +1409,7 @@
         <w:keepLines/>
       </w:pPr>
       <w:r>
-        <w:t>A-02、A-03、W-01、I-01、Q-01、Q-02、Q-03、X-01、X-02、X-03、Z-01、G-05、E-01、E-02、B-01、E-03、G-03、B-02、E-04、A-05、E-05、G-04、B-03、E-06、A-04、A-06、W-02、W-03、W-04、U12-01、U12-02、U12-03、U12-04、U12-05、U12-06、U12-07、U12-08、U12-09、U12-10、U12-11、U12-12</w:t>
+        <w:t>A-03、W-01、I-01、Q-01、Q-02、Q-03、X-01、X-02、X-03、Z-01、G-05、E-01、E-02、B-01、E-03、G-03、B-02、E-04、A-05、E-05、G-04、B-03、E-06、A-04、A-06、W-02、W-03、W-04、U12-01、U12-02、U12-03、U12-04、U12-05、U12-06、U12-07、U12-08、U12-09、U12-10、U12-11、U12-12</w:t>
       </w:r>
     </w:p>
     <w:sectPr>

</xml_diff>

<commit_message>
Normalize A-03 statistical scope and non-overwriting reproduction
</commit_message>
<xml_diff>
--- a/human/project-review.docx
+++ b/human/project-review.docx
@@ -1393,6 +1393,44 @@
         <w:pStyle w:val="Heading1"/>
       </w:pPr>
       <w:r>
+        <w:t>A-03 统计实现</w:t>
+      </w:r>
+    </w:p>
+    <w:p>
+      <w:r>
+        <w:t>A-03仍IN_PROGRESS，SPEC仅原范围DONE。旧入口及正态锚点实际归档，正式能力说明订正，CLI禁止覆盖报告；U12-04候选签收已交接，REAL/CAL和正式数值仍未完成。</w:t>
+      </w:r>
+    </w:p>
+    <w:p>
+      <w:r>
+        <w:t>A-01交真实L3与六类原件引用，A-02交两分析集和缺失流程，U12-02交步骤实例测量，U12-04交已签收候选SAP；旧八项fixture不是新测量。REAL仍未完成，不提前释放真实数据资格。</w:t>
+      </w:r>
+    </w:p>
+    <w:p>
+      <w:r>
+        <w:t>SPEC按原依赖供X-01；REAL供Q-03，E-03的Level C盲态材料供CAL，U12-11/G-03消费回执与冻结配置。A-05完整报告PANAS、护栏及过程结果，Z-01消费复现入口；不因可选策略扩展等待而隐藏核心结果。</w:t>
+      </w:r>
+    </w:p>
+    <w:p>
+      <w:r>
+        <w:t>A03-N01 FIXED_FORMAL_CAPABILITY_AND_OVERWRITE：正式模式说明订正，旧入口归档，CLI拒绝覆盖报告且复现写新目录</w:t>
+      </w:r>
+    </w:p>
+    <w:p>
+      <w:r>
+        <w:t>A03-N02 FIXED_CURRENT_NEW_SPEC_ACCEPTANCE：范围影响补已存在U12-04候选签署，不扩大为REAL/CAL或正式冻结</w:t>
+      </w:r>
+    </w:p>
+    <w:p>
+      <w:r>
+        <w:t>A03-N03 OPEN_REAL_CAL_AND_CURRENT_MEASUREMENT：真实适配、步骤实例测量映射、真实模型和盲态校准尚未交付</w:t>
+      </w:r>
+    </w:p>
+    <w:p>
+      <w:pPr>
+        <w:pStyle w:val="Heading1"/>
+      </w:pPr>
+      <w:r>
         <w:t>待整理队列</w:t>
       </w:r>
     </w:p>
@@ -1401,7 +1439,7 @@
         <w:keepNext/>
       </w:pPr>
       <w:r>
-        <w:t>已整理31包，待整理40包；根目录双层迁移未完成。下一项A-03。</w:t>
+        <w:t>已整理32包，待整理39包；根目录双层迁移未完成。下一项W-01。</w:t>
       </w:r>
     </w:p>
     <w:p>
@@ -1409,7 +1447,7 @@
         <w:keepLines/>
       </w:pPr>
       <w:r>
-        <w:t>A-03、W-01、I-01、Q-01、Q-02、Q-03、X-01、X-02、X-03、Z-01、G-05、E-01、E-02、B-01、E-03、G-03、B-02、E-04、A-05、E-05、G-04、B-03、E-06、A-04、A-06、W-02、W-03、W-04、U12-01、U12-02、U12-03、U12-04、U12-05、U12-06、U12-07、U12-08、U12-09、U12-10、U12-11、U12-12</w:t>
+        <w:t>W-01、I-01、Q-01、Q-02、Q-03、X-01、X-02、X-03、Z-01、G-05、E-01、E-02、B-01、E-03、G-03、B-02、E-04、A-05、E-05、G-04、B-03、E-06、A-04、A-06、W-02、W-03、W-04、U12-01、U12-02、U12-03、U12-04、U12-05、U12-06、U12-07、U12-08、U12-09、U12-10、U12-11、U12-12</w:t>
       </w:r>
     </w:p>
     <w:sectPr>

</xml_diff>

<commit_message>
Normalize W-01 paper authority and preserve historical candidate
</commit_message>
<xml_diff>
--- a/human/project-review.docx
+++ b/human/project-review.docx
@@ -1431,6 +1431,54 @@
         <w:pStyle w:val="Heading1"/>
       </w:pPr>
       <w:r>
+        <w:t>W-01 论文准备</w:t>
+      </w:r>
+    </w:p>
+    <w:p>
+      <w:r>
+        <w:t>W-01原候选范围DONE不改，新颖性仍REVISE_REQUIRED。旧骨架原文归档，验证器迁入Agent，当前PANAS主比较与A-06核心收尾入口订正；原生检索导出、全文双审和真实人员仍缺。</w:t>
+      </w:r>
+    </w:p>
+    <w:p>
+      <w:r>
+        <w:t>R-01/F-02及U12-02/U12-03供当前设计、步骤测量和公平性，U/V交实际呈现，A-02/A-03交统计边界与真实分析，Q-01交真实独立重建。四例实现不证明通用框架或独立天气效应。</w:t>
+      </w:r>
+    </w:p>
+    <w:p>
+      <w:r>
+        <w:t>W-02依赖W-01|A-06|U12-07；核心写作不等A-04。U12-07旧RQ/句式需要新候选，签名不转移；A-06供实际范围、锁库和主张—结果—图表关联，W-03再消费同一证据。</w:t>
+      </w:r>
+    </w:p>
+    <w:p>
+      <w:r>
+        <w:t>当前仍缺原生检索/去重、关键全文页段与两名真实来源审查者；15篇不是综述分母，DOI身份不是全文核验。只有当前可检查事实交下游，不沿用旧门序当新研究结论。</w:t>
+      </w:r>
+    </w:p>
+    <w:p>
+      <w:r>
+        <w:t>W01-N01 FIXED_ACTIVE_PRIMARY_AND_CORE_ROUTE：旧骨架原文归档，当前PANAS主比较独立报告；W-02走A-06核心关闭不等A-04</w:t>
+      </w:r>
+    </w:p>
+    <w:p>
+      <w:r>
+        <w:t>W01-N02 MOVED_EXECUTION_WITH_SCOPE_PRESERVED：验证器实际迁入Agent，精确登记证据路径，历史原验收不改</w:t>
+      </w:r>
+    </w:p>
+    <w:p>
+      <w:r>
+        <w:t>W01-N03 OPEN_LITERATURE_AND_REAL_REVIEWERS：旧15篇及13行记录不是原生综述分母或新全文复查，双人真实审查与关键字段仍缺</w:t>
+      </w:r>
+    </w:p>
+    <w:p>
+      <w:r>
+        <w:t>W01-N04 HANDOFF_U12_07_SIGNED_TEXT_REVISION：已签收U12-07仍含旧RQ/有序门/八题写法，隔离当前权威并需其新候选修订，不改签名</w:t>
+      </w:r>
+    </w:p>
+    <w:p>
+      <w:pPr>
+        <w:pStyle w:val="Heading1"/>
+      </w:pPr>
+      <w:r>
         <w:t>待整理队列</w:t>
       </w:r>
     </w:p>
@@ -1439,7 +1487,7 @@
         <w:keepNext/>
       </w:pPr>
       <w:r>
-        <w:t>已整理32包，待整理39包；根目录双层迁移未完成。下一项W-01。</w:t>
+        <w:t>已整理33包，待整理38包；根目录双层迁移未完成。下一项I-01。</w:t>
       </w:r>
     </w:p>
     <w:p>
@@ -1447,7 +1495,7 @@
         <w:keepLines/>
       </w:pPr>
       <w:r>
-        <w:t>W-01、I-01、Q-01、Q-02、Q-03、X-01、X-02、X-03、Z-01、G-05、E-01、E-02、B-01、E-03、G-03、B-02、E-04、A-05、E-05、G-04、B-03、E-06、A-04、A-06、W-02、W-03、W-04、U12-01、U12-02、U12-03、U12-04、U12-05、U12-06、U12-07、U12-08、U12-09、U12-10、U12-11、U12-12</w:t>
+        <w:t>I-01、Q-01、Q-02、Q-03、X-01、X-02、X-03、Z-01、G-05、E-01、E-02、B-01、E-03、G-03、B-02、E-04、A-05、E-05、G-04、B-03、E-06、A-04、A-06、W-02、W-03、W-04、U12-01、U12-02、U12-03、U12-04、U12-05、U12-06、U12-07、U12-08、U12-09、U12-10、U12-11、U12-12</w:t>
       </w:r>
     </w:p>
     <w:sectPr>

</xml_diff>

<commit_message>
Normalize I-01 integration handoff and external measurement boundary
</commit_message>
<xml_diff>
--- a/human/project-review.docx
+++ b/human/project-review.docx
@@ -1479,6 +1479,49 @@
         <w:pStyle w:val="Heading1"/>
       </w:pPr>
       <w:r>
+        <w:t>I-01 系统集成</w:t>
+      </w:r>
+    </w:p>
+    <w:p>
+      <w:r>
+        <w:t>I-01仍WAIT_DEP_EXTERNAL、未领取。固定五目录和真实验收交接已建立，216项交接/主机回归通过；真实双设备、八种呈现、装配、外部延迟、多小时压力及干净机器证据未交付，不构成LIVE_E2E或业务签收。</w:t>
+      </w:r>
+    </w:p>
+    <w:p>
+      <w:r>
+        <w:t>D-01/D-02交原始通知，S-01交时钟/SQI，S-02交Actual与在线PF；P-01定状态时钟，P-02定存储与重放，U-08交八呈现成品，T-02交可选操作台请求。接口和实际资格不能由DONE标签代替。</w:t>
+      </w:r>
+    </w:p>
+    <w:p>
+      <w:r>
+        <w:t>Q-03需要真实系统和A-03-REAL等前置；X-01/Z-01按原依赖消费完整链，当前不解锁。仓库外受限原件、活动许可归G-05及数据责任人；主机负载、签署基线和样片不代替LIVE_E2E。</w:t>
+      </w:r>
+    </w:p>
+    <w:p>
+      <w:r>
+        <w:t>I01-N01 CLARIFIED_RECORDING_AND_OPTIONAL_TD：同一记录代理装配、L1先存后发及无TD独立体验交接明确，不删除T-02原依赖</w:t>
+      </w:r>
+    </w:p>
+    <w:p>
+      <w:r>
+        <w:t>I01-N02 CLARIFIED_EXTERNAL_DISPLAY_MEASUREMENT：软件渲染回执不等于屏幕外部时间，跨时钟映射与冻结阈值仍待实测</w:t>
+      </w:r>
+    </w:p>
+    <w:p>
+      <w:r>
+        <w:t>I01-N03 OPEN_REAL_CHAIN_AND_OWNER：真实双设备、最终八呈现、完整装配、多小时压力、外部延迟和真实负责人仍缺，保持WAIT_DEP_EXTERNAL</w:t>
+      </w:r>
+    </w:p>
+    <w:p>
+      <w:r>
+        <w:t>I01-N04 OPEN_TEACHING_EXPOSURE_INTEGRATION：核心start登记不能覆盖教学后退出，需P-01/U12-11完成首次条件教学前登记</w:t>
+      </w:r>
+    </w:p>
+    <w:p>
+      <w:pPr>
+        <w:pStyle w:val="Heading1"/>
+      </w:pPr>
+      <w:r>
         <w:t>待整理队列</w:t>
       </w:r>
     </w:p>
@@ -1487,7 +1530,7 @@
         <w:keepNext/>
       </w:pPr>
       <w:r>
-        <w:t>已整理33包，待整理38包；根目录双层迁移未完成。下一项I-01。</w:t>
+        <w:t>已整理34包，待整理37包；根目录双层迁移未完成。下一项Q-01。</w:t>
       </w:r>
     </w:p>
     <w:p>
@@ -1495,7 +1538,7 @@
         <w:keepLines/>
       </w:pPr>
       <w:r>
-        <w:t>I-01、Q-01、Q-02、Q-03、X-01、X-02、X-03、Z-01、G-05、E-01、E-02、B-01、E-03、G-03、B-02、E-04、A-05、E-05、G-04、B-03、E-06、A-04、A-06、W-02、W-03、W-04、U12-01、U12-02、U12-03、U12-04、U12-05、U12-06、U12-07、U12-08、U12-09、U12-10、U12-11、U12-12</w:t>
+        <w:t>Q-01、Q-02、Q-03、X-01、X-02、X-03、Z-01、G-05、E-01、E-02、B-01、E-03、G-03、B-02、E-04、A-05、E-05、G-04、B-03、E-06、A-04、A-06、W-02、W-03、W-04、U12-01、U12-02、U12-03、U12-04、U12-05、U12-06、U12-07、U12-08、U12-09、U12-10、U12-11、U12-12</w:t>
       </w:r>
     </w:p>
     <w:sectPr>

</xml_diff>

<commit_message>
Normalize Q-01 material handoff and non-overwriting scoring tools
</commit_message>
<xml_diff>
--- a/human/project-review.docx
+++ b/human/project-review.docx
@@ -1522,6 +1522,49 @@
         <w:pStyle w:val="Heading1"/>
       </w:pPr>
       <w:r>
+        <w:t>Q-01 研究工具</w:t>
+      </w:r>
+    </w:p>
+    <w:p>
+      <w:r>
+        <w:t>Q-01原工具材料范围DONE不改。两工具两测试实际迁入Agent，三份旧说明原文归档；21项及3子测试通过，CLI拒绝覆盖。当前专家交接已对齐静态断续降级和当前测量；真人角色、Level A活动、最终渲染及本轮修订签收仍未完成。</w:t>
+      </w:r>
+    </w:p>
+    <w:p>
+      <w:r>
+        <w:t>R-01/F-02交当前语法和测量边界，V-03/V-04及U/V交真实同源材料与最终渲染。Q-02检验目标使用者理解，不能用专家表达清晰度评分替代。独立转移不足只收缩设计知识主张，不隐藏有效PANAS比较。</w:t>
+      </w:r>
+    </w:p>
+    <w:p>
+      <w:r>
+        <w:t>E-01须落实U12-05、G-05对应资格、负责人及15名真实人员；匿名角色代码不是招募完成。W-01/W-02消费真实转移、分歧和局限，本轮不解除研究门或把四场景实现当通用生成性证据。</w:t>
+      </w:r>
+    </w:p>
+    <w:p>
+      <w:r>
+        <w:t>Q01-N01 FIXED_EXECUTION_AND_EXCLUSIVE_OUTPUT：两工具两测试实际迁入执行层，同名输出拒绝覆盖，CSV与裁定不变</w:t>
+      </w:r>
+    </w:p>
+    <w:p>
+      <w:r>
+        <w:t>Q01-N02 FIXED_CURRENT_EXPERT_HANDOFF：旧说明归档，当前专家解释对齐静态断续降级、具体步骤和fade复色，评分含义变更须新版本复核</w:t>
+      </w:r>
+    </w:p>
+    <w:p>
+      <w:r>
+        <w:t>Q01-N03 OPEN_REAL_ACTIVITY_AND_ROLES：E-01负责人、15名真实人员及资格未落实，材料DONE不表示Level A或最终渲染通过</w:t>
+      </w:r>
+    </w:p>
+    <w:p>
+      <w:r>
+        <w:t>Q01-N04 PRESERVED_SIGNATURE_CURRENT_REVISION_UNSIGNED：原合同待签署状态保留历史，真实签收以报告为准；本轮修订不继承旧签名</w:t>
+      </w:r>
+    </w:p>
+    <w:p>
+      <w:pPr>
+        <w:pStyle w:val="Heading1"/>
+      </w:pPr>
+      <w:r>
         <w:t>待整理队列</w:t>
       </w:r>
     </w:p>
@@ -1530,7 +1573,7 @@
         <w:keepNext/>
       </w:pPr>
       <w:r>
-        <w:t>已整理34包，待整理37包；根目录双层迁移未完成。下一项Q-01。</w:t>
+        <w:t>已整理35包，待整理36包；根目录双层迁移未完成。下一项Q-02。</w:t>
       </w:r>
     </w:p>
     <w:p>
@@ -1538,7 +1581,7 @@
         <w:keepLines/>
       </w:pPr>
       <w:r>
-        <w:t>Q-01、Q-02、Q-03、X-01、X-02、X-03、Z-01、G-05、E-01、E-02、B-01、E-03、G-03、B-02、E-04、A-05、E-05、G-04、B-03、E-06、A-04、A-06、W-02、W-03、W-04、U12-01、U12-02、U12-03、U12-04、U12-05、U12-06、U12-07、U12-08、U12-09、U12-10、U12-11、U12-12</w:t>
+        <w:t>Q-02、Q-03、X-01、X-02、X-03、Z-01、G-05、E-01、E-02、B-01、E-03、G-03、B-02、E-04、A-05、E-05、G-04、B-03、E-06、A-04、A-06、W-02、W-03、W-04、U12-01、U12-02、U12-03、U12-04、U12-05、U12-06、U12-07、U12-08、U12-09、U12-10、U12-11、U12-12</w:t>
       </w:r>
     </w:p>
     <w:sectPr>

</xml_diff>

<commit_message>
Normalize Q-02 cognitive interview materials and research handoff
</commit_message>
<xml_diff>
--- a/human/project-review.docx
+++ b/human/project-review.docx
@@ -1565,6 +1565,44 @@
         <w:pStyle w:val="Heading1"/>
       </w:pPr>
       <w:r>
+        <w:t>Q-02 研究工具</w:t>
+      </w:r>
+    </w:p>
+    <w:p>
+      <w:r>
+        <w:t>Q-02仍WAIT_DEP、未领取且无签署。本轮补齐固定结构、访谈提纲与空白记录，53项专项通过；真实人数、两臂四结构片段、活动与最终回归未完成，不把材料整理当Level B关闭。</w:t>
+      </w:r>
+    </w:p>
+    <w:p>
+      <w:r>
+        <w:t>Q-01/E-01交真实构念审查，U12-02交八题同源题面和私有键，U12-03交公平教学，U-08交八呈现真实成品；两条件同事件/题/答案，实际未知不可从目标补写。</w:t>
+      </w:r>
+    </w:p>
+    <w:p>
+      <w:r>
+        <w:t>E-02须先落实真实负责人、人数/轮次、U12-05与G-05对应资格及片段版本。Q-03仍依赖其他任务；U12-04/U12-11冻结使用与分析，W/A只消费真实理解、帮助与适用边界，不能用功能不足隐去情绪比较。</w:t>
+      </w:r>
+    </w:p>
+    <w:p>
+      <w:r>
+        <w:t>Q02-N01 FIXED_CURRENT_PROCESS_AND_TEMPLATE：通用联调改为认知访谈交接；独立作答/追问分计时，末尾猜测不暴露未分配条件</w:t>
+      </w:r>
+    </w:p>
+    <w:p>
+      <w:r>
+        <w:t>Q02-N02 OPEN_SAMPLE_AND_ROLE_FREEZE：旧24至32与E-02当前12至16人数口径不同；当前人数、轮次和真实负责人未冻结</w:t>
+      </w:r>
+    </w:p>
+    <w:p>
+      <w:r>
+        <w:t>Q02-N03 OPEN_REAL_ACTIVITY_AND_RENDERING：两臂四结构真实片段、访谈、修订关闭与最终Unity回归尚缺，保持WAIT_DEP</w:t>
+      </w:r>
+    </w:p>
+    <w:p>
+      <w:pPr>
+        <w:pStyle w:val="Heading1"/>
+      </w:pPr>
+      <w:r>
         <w:t>待整理队列</w:t>
       </w:r>
     </w:p>
@@ -1573,7 +1611,7 @@
         <w:keepNext/>
       </w:pPr>
       <w:r>
-        <w:t>已整理35包，待整理36包；根目录双层迁移未完成。下一项Q-02。</w:t>
+        <w:t>已整理36包，待整理35包；根目录双层迁移未完成。下一项Q-03。</w:t>
       </w:r>
     </w:p>
     <w:p>
@@ -1581,7 +1619,7 @@
         <w:keepLines/>
       </w:pPr>
       <w:r>
-        <w:t>Q-02、Q-03、X-01、X-02、X-03、Z-01、G-05、E-01、E-02、B-01、E-03、G-03、B-02、E-04、A-05、E-05、G-04、B-03、E-06、A-04、A-06、W-02、W-03、W-04、U12-01、U12-02、U12-03、U12-04、U12-05、U12-06、U12-07、U12-08、U12-09、U12-10、U12-11、U12-12</w:t>
+        <w:t>Q-03、X-01、X-02、X-03、Z-01、G-05、E-01、E-02、B-01、E-03、G-03、B-02、E-04、A-05、E-05、G-04、B-03、E-06、A-04、A-06、W-02、W-03、W-04、U12-01、U12-02、U12-03、U12-04、U12-05、U12-06、U12-07、U12-08、U12-09、U12-10、U12-11、U12-12</w:t>
       </w:r>
     </w:p>
     <w:sectPr>

</xml_diff>

<commit_message>
Normalize Q-03 Level C planning and archive superseded execution guides
</commit_message>
<xml_diff>
--- a/human/project-review.docx
+++ b/human/project-review.docx
@@ -1603,6 +1603,44 @@
         <w:pStyle w:val="Heading1"/>
       </w:pPr>
       <w:r>
+        <w:t>Q-03 研究工具</w:t>
+      </w:r>
+    </w:p>
+    <w:p>
+      <w:r>
+        <w:t>Q-03仍WAIT_DEP_EXTERNAL、未领取且无签署。两旧执行方案原文归档，85项专项及历史协议检查通过；48个设计单元只是规划预览，真实manifest、标注界面、门报告和冻结工具尚未完成。</w:t>
+      </w:r>
+    </w:p>
+    <w:p>
+      <w:r>
+        <w:t>I-01交真实全链与外部测量，Q-02/E-02交真实Level B关闭，A-01交六类原件和离线L3，A-03-REAL交真实测量适配；S-02双标注遮蔽Target/条件/情绪/预测，不从目标补Actual或未知值。</w:t>
+      </w:r>
+    </w:p>
+    <w:p>
+      <w:r>
+        <w:t>B-01每批最多12人，E-03汇总48人盲态报告，A-03-CAL校准后U12-11/G-03签署。Q-03真实分配、标注界面和自动门报告尚缺，真实负责人、审批与冻结不得由预览或软件PASS替代。</w:t>
+      </w:r>
+    </w:p>
+    <w:p>
+      <w:r>
+        <w:t>Q03-N01 FIXED_ARCHIVE_AND_CURRENT_ROUTE：两旧方案实际原文归档，导航与历史校验消费者修正；当前PANAS及可选扩展范围对齐</w:t>
+      </w:r>
+    </w:p>
+    <w:p>
+      <w:r>
+        <w:t>Q03-N02 OPEN_REAL_LEVEL_C_TOOL_IMPLEMENTATION：X-01不支持Level C；48单元仅覆盖预览，真实分配/manifest、标注UI和自动门报告未完成</w:t>
+      </w:r>
+    </w:p>
+    <w:p>
+      <w:r>
+        <w:t>Q03-N03 OPEN_REAL_DATA_AND_FREEZE：真实链/Level B/REAL/人员和批准仍缺；所有当前阈值、配置和签署未冻结，业务状态不变</w:t>
+      </w:r>
+    </w:p>
+    <w:p>
+      <w:pPr>
+        <w:pStyle w:val="Heading1"/>
+      </w:pPr>
+      <w:r>
         <w:t>待整理队列</w:t>
       </w:r>
     </w:p>
@@ -1611,7 +1649,7 @@
         <w:keepNext/>
       </w:pPr>
       <w:r>
-        <w:t>已整理36包，待整理35包；根目录双层迁移未完成。下一项Q-03。</w:t>
+        <w:t>已整理37包，待整理34包；根目录双层迁移未完成。下一项X-01。</w:t>
       </w:r>
     </w:p>
     <w:p>
@@ -1619,7 +1657,7 @@
         <w:keepLines/>
       </w:pPr>
       <w:r>
-        <w:t>Q-03、X-01、X-02、X-03、Z-01、G-05、E-01、E-02、B-01、E-03、G-03、B-02、E-04、A-05、E-05、G-04、B-03、E-06、A-04、A-06、W-02、W-03、W-04、U12-01、U12-02、U12-03、U12-04、U12-05、U12-06、U12-07、U12-08、U12-09、U12-10、U12-11、U12-12</w:t>
+        <w:t>X-01、X-02、X-03、Z-01、G-05、E-01、E-02、B-01、E-03、G-03、B-02、E-04、A-05、E-05、G-04、B-03、E-06、A-04、A-06、W-02、W-03、W-04、U12-01、U12-02、U12-03、U12-04、U12-05、U12-06、U12-07、U12-08、U12-09、U12-10、U12-11、U12-12</w:t>
       </w:r>
     </w:p>
     <w:sectPr>

</xml_diff>

<commit_message>
docs: normalize X-01 tools and non-overwriting evidence reproduction
</commit_message>
<xml_diff>
--- a/human/project-review.docx
+++ b/human/project-review.docx
@@ -1641,6 +1641,44 @@
         <w:pStyle w:val="Heading1"/>
       </w:pPr>
       <w:r>
+        <w:t>X-01 随机化</w:t>
+      </w:r>
+    </w:p>
+    <w:p>
+      <w:r>
+        <w:t>X-01保留原软件与合成范围DONE。两工具实际移入Agent，旧README原文归档；41项专项及384条原清单检查通过，新目录复现拒绝覆盖。正式清单、实名权限、Level C和阶段三实时策略仍未交付。</w:t>
+      </w:r>
+    </w:p>
+    <w:p>
+      <w:r>
+        <w:t>P-01消费清单哈希、索引、阶段、层、块、臂、预约许可与固定序列，仍是流程/时钟/暴露权威。G-02供去重预约，G-05落实实名权限、种子保管、仓库外存储与活动资格；U12-06/U12-11冻结前测、教学和揭示时序。</w:t>
+      </w:r>
+    </w:p>
+    <w:p>
+      <w:r>
+        <w:t>Q-03需独立Level C分配及manifest适配；X-03提供真实状态、候选概率和动态步骤接口。阶段三是可选扩展，不能阻断核心论文；按完成情况定向补格仍不允许。</w:t>
+      </w:r>
+    </w:p>
+    <w:p>
+      <w:r>
+        <w:t>X01-N01 FIXED_TOOL_MIGRATION_AND_EXCLUSIVE_REPRODUCTION：两工具实际迁入Agent，旧README归档，合成复现新目录排他写入且消费者修正</w:t>
+      </w:r>
+    </w:p>
+    <w:p>
+      <w:r>
+        <w:t>X01-N02 FIXED_CURRENT_CAPABILITY_DESCRIPTION：固定48块、动作区间见证、调用方角色与正式权限边界按真实实现订正，原签署不改</w:t>
+      </w:r>
+    </w:p>
+    <w:p>
+      <w:r>
+        <w:t>X01-N03 OPEN_FORMAL_CONTEXT_AND_RUNTIME_ADAPTERS：实名权限、正式分层清单、Level C适配及阶段三实时策略未完成，本轮工具修订未新签收</w:t>
+      </w:r>
+    </w:p>
+    <w:p>
+      <w:pPr>
+        <w:pStyle w:val="Heading1"/>
+      </w:pPr>
+      <w:r>
         <w:t>待整理队列</w:t>
       </w:r>
     </w:p>
@@ -1649,7 +1687,7 @@
         <w:keepNext/>
       </w:pPr>
       <w:r>
-        <w:t>已整理37包，待整理34包；根目录双层迁移未完成。下一项X-01。</w:t>
+        <w:t>已整理38包，待整理33包；根目录双层迁移未完成。下一项X-02。</w:t>
       </w:r>
     </w:p>
     <w:p>
@@ -1657,7 +1695,7 @@
         <w:keepLines/>
       </w:pPr>
       <w:r>
-        <w:t>X-01、X-02、X-03、Z-01、G-05、E-01、E-02、B-01、E-03、G-03、B-02、E-04、A-05、E-05、G-04、B-03、E-06、A-04、A-06、W-02、W-03、W-04、U12-01、U12-02、U12-03、U12-04、U12-05、U12-06、U12-07、U12-08、U12-09、U12-10、U12-11、U12-12</w:t>
+        <w:t>X-02、X-03、Z-01、G-05、E-01、E-02、B-01、E-03、G-03、B-02、E-04、A-05、E-05、G-04、B-03、E-06、A-04、A-06、W-02、W-03、W-04、U12-01、U12-02、U12-03、U12-04、U12-05、U12-06、U12-07、U12-08、U12-09、U12-10、U12-11、U12-12</w:t>
       </w:r>
     </w:p>
     <w:sectPr>

</xml_diff>

<commit_message>
docs: normalize X-02 policy handoff and archived method consumers
</commit_message>
<xml_diff>
--- a/human/project-review.docx
+++ b/human/project-review.docx
@@ -1679,6 +1679,44 @@
         <w:pStyle w:val="Heading1"/>
       </w:pPr>
       <w:r>
+        <w:t>X-02 策略实现</w:t>
+      </w:r>
+    </w:p>
+    <w:p>
+      <w:r>
+        <w:t>X-02仍WAIT_DEP、未领取且未签署。两旧v1.1方案原文归档，当前交接与历史消费者修复，42项专项通过；没有训练器、OPE、ESS、实际模型或冻结报告，核心论文不等待可选扩展。</w:t>
+      </w:r>
+    </w:p>
+    <w:p>
+      <w:r>
+        <w:t>A-01提供完整轨迹/原件/L3，A-03提供真实测量与锁定结果，X-01供分配身份和行为概率；缺失/支持按位置及候选历史处理，研究编号只作分组键。</w:t>
+      </w:r>
+    </w:p>
+    <w:p>
+      <w:r>
+        <w:t>E-05/U12-08冻结真实模型、方法、阈值及模型核查结果；X-03只读加载和逐决策部署，P-01保持编排权威。阶段三独立队列比较包含回退的部署策略，同一锁定资料的学习/OPE不是确认性优效。</w:t>
+      </w:r>
+    </w:p>
+    <w:p>
+      <w:r>
+        <w:t>X02-N01 FIXED_ARCHIVE_AND_CURRENT_ROUTE：两旧方案实际归档，导航及历史消费者修复，核心PANAS与可选策略范围分离</w:t>
+      </w:r>
+    </w:p>
+    <w:p>
+      <w:r>
+        <w:t>X02-N02 FIXED_HANDOFF_NOT_IMPLEMENTATION：分组/时序/概率/块依赖与奖励方向明确，正式方法和阈值未冻结，不宣称完成策略模型</w:t>
+      </w:r>
+    </w:p>
+    <w:p>
+      <w:r>
+        <w:t>X02-N03 OPEN_MODEL_OPE_DATA_AND_RESPONSIBILITY：训练器、OPE/ESS、真实锁定资料、负责人及E-05冻结证据仍缺，WAIT_DEP未签署</w:t>
+      </w:r>
+    </w:p>
+    <w:p>
+      <w:pPr>
+        <w:pStyle w:val="Heading1"/>
+      </w:pPr>
+      <w:r>
         <w:t>待整理队列</w:t>
       </w:r>
     </w:p>
@@ -1687,7 +1725,7 @@
         <w:keepNext/>
       </w:pPr>
       <w:r>
-        <w:t>已整理38包，待整理33包；根目录双层迁移未完成。下一项X-02。</w:t>
+        <w:t>已整理39包，待整理32包；根目录双层迁移未完成。下一项X-03。</w:t>
       </w:r>
     </w:p>
     <w:p>
@@ -1695,7 +1733,7 @@
         <w:keepLines/>
       </w:pPr>
       <w:r>
-        <w:t>X-02、X-03、Z-01、G-05、E-01、E-02、B-01、E-03、G-03、B-02、E-04、A-05、E-05、G-04、B-03、E-06、A-04、A-06、W-02、W-03、W-04、U12-01、U12-02、U12-03、U12-04、U12-05、U12-06、U12-07、U12-08、U12-09、U12-10、U12-11、U12-12</w:t>
+        <w:t>X-03、Z-01、G-05、E-01、E-02、B-01、E-03、G-03、B-02、E-04、A-05、E-05、G-04、B-03、E-06、A-04、A-06、W-02、W-03、W-04、U12-01、U12-02、U12-03、U12-04、U12-05、U12-06、U12-07、U12-08、U12-09、U12-10、U12-11、U12-12</w:t>
       </w:r>
     </w:p>
     <w:sectPr>

</xml_diff>

<commit_message>
docs: normalize X-03 runtime and safe replay handoff
</commit_message>
<xml_diff>
--- a/human/project-review.docx
+++ b/human/project-review.docx
@@ -1717,6 +1717,44 @@
         <w:pStyle w:val="Heading1"/>
       </w:pPr>
       <w:r>
+        <w:t>X-03 策略运行</w:t>
+      </w:r>
+    </w:p>
+    <w:p>
+      <w:r>
+        <w:t>X-03仍WAIT_DEP、未领取未签署。当前P-01即使v2.2也拒绝frozen_policy，P-02拒绝任意策略核心重放；44项专项通过，活动说明已修正，但加载器、动态顺序、策略重放与同构建真链未完成。</w:t>
+      </w:r>
+    </w:p>
+    <w:p>
+      <w:r>
+        <w:t>X-02提供模型与支持报告，E-05/U12-08真实冻结，X-01分配、G-05资格；U-08供同一scene_native构建，U-01只维护渲染镜像，TD不选天气或装模型。</w:t>
+      </w:r>
+    </w:p>
+    <w:p>
+      <w:r>
+        <w:t>P-01/P-02共同升级动态顺序及安全重放，控制发送前耐久提交；I-01验证800秒真链。均匀回退保留策略臂，正式身份错误不能借随机回退绕过，核心投稿不依赖可选阶段三。</w:t>
+      </w:r>
+    </w:p>
+    <w:p>
+      <w:r>
+        <w:t>X03-N01 FIXED_V22_CAPABILITY_DESCRIPTION：活动说明订正，v2.2步骤身份不等于动态顺序，当前冻结策略仍拒绝</w:t>
+      </w:r>
+    </w:p>
+    <w:p>
+      <w:r>
+        <w:t>X03-N02 FIXED_TEST_STORE_BINDING：测试复现核心/代理存储不一致，绑定同一耐久存储后复测；业务和安全重放边界不改</w:t>
+      </w:r>
+    </w:p>
+    <w:p>
+      <w:r>
+        <w:t>X03-N03 OPEN_DYNAMIC_RUNTIME_AND_REAL_EVIDENCE：加载器、动态顺序/状态、策略安全重放、同构建及真实冻结/真链未交付，WAIT_DEP未签署</w:t>
+      </w:r>
+    </w:p>
+    <w:p>
+      <w:pPr>
+        <w:pStyle w:val="Heading1"/>
+      </w:pPr>
+      <w:r>
         <w:t>待整理队列</w:t>
       </w:r>
     </w:p>
@@ -1725,7 +1763,7 @@
         <w:keepNext/>
       </w:pPr>
       <w:r>
-        <w:t>已整理39包，待整理32包；根目录双层迁移未完成。下一项X-03。</w:t>
+        <w:t>已整理40包，待整理31包；根目录双层迁移未完成。下一项Z-01。</w:t>
       </w:r>
     </w:p>
     <w:p>
@@ -1733,7 +1771,7 @@
         <w:keepLines/>
       </w:pPr>
       <w:r>
-        <w:t>X-03、Z-01、G-05、E-01、E-02、B-01、E-03、G-03、B-02、E-04、A-05、E-05、G-04、B-03、E-06、A-04、A-06、W-02、W-03、W-04、U12-01、U12-02、U12-03、U12-04、U12-05、U12-06、U12-07、U12-08、U12-09、U12-10、U12-11、U12-12</w:t>
+        <w:t>Z-01、G-05、E-01、E-02、B-01、E-03、G-03、B-02、E-04、A-05、E-05、G-04、B-03、E-06、A-04、A-06、W-02、W-03、W-04、U12-01、U12-02、U12-03、U12-04、U12-05、U12-06、U12-07、U12-08、U12-09、U12-10、U12-11、U12-12</w:t>
       </w:r>
     </w:p>
     <w:sectPr>

</xml_diff>

<commit_message>
docs: normalize Z-01 delivery and repair tool authority
</commit_message>
<xml_diff>
--- a/human/project-review.docx
+++ b/human/project-review.docx
@@ -1755,6 +1755,44 @@
         <w:pStyle w:val="Heading1"/>
       </w:pPr>
       <w:r>
+        <w:t>Z-01 构建交付</w:t>
+      </w:r>
+    </w:p>
+    <w:p>
+      <w:r>
+        <w:t>Z-01仍WAIT_DEP、未领取未签收。工具权威三处偏离已修复，22项专项通过；当前资产扫描225项、269个阻断，三个匹配候选、完整锁与独立干净重建未交付。</w:t>
+      </w:r>
+    </w:p>
+    <w:p>
+      <w:r>
+        <w:t>U-08供参与者构建、I-01供真链、A-02/A-03供统计配置、A-01供离线样例、T-02供操作台；G-02真实门和G-05批准分别满足。</w:t>
+      </w:r>
+    </w:p>
+    <w:p>
+      <w:r>
+        <w:t>候选交G-03/G-04阶段锁定、W-03独立投稿复现与公开审批、W-04归档；实际版本与运行匹配不以标签相同或上游DONE代替。</w:t>
+      </w:r>
+    </w:p>
+    <w:p>
+      <w:r>
+        <w:t>Z01-N01 FIXED_CURRENT_TOOL_AUTHORITY：旧目录、两项漏依赖和MCP浮动校验按现有工程修复，旧原件归档，未变软件版本</w:t>
+      </w:r>
+    </w:p>
+    <w:p>
+      <w:r>
+        <w:t>Z01-N02 OPEN_ACTUAL_ASSET_BLOCKERS：当前225资产项、269阻断，不能沿用旧许可报告或把开发构建发布为参与者候选</w:t>
+      </w:r>
+    </w:p>
+    <w:p>
+      <w:r>
+        <w:t>Z01-N03 OPEN_CANDIDATE_REBUILD_AND_OWNERS：三个匹配候选、完整锁/SBOM、独立干净重建与责任人未交付，WAIT_DEP保持</w:t>
+      </w:r>
+    </w:p>
+    <w:p>
+      <w:pPr>
+        <w:pStyle w:val="Heading1"/>
+      </w:pPr>
+      <w:r>
         <w:t>待整理队列</w:t>
       </w:r>
     </w:p>
@@ -1763,7 +1801,7 @@
         <w:keepNext/>
       </w:pPr>
       <w:r>
-        <w:t>已整理40包，待整理31包；根目录双层迁移未完成。下一项Z-01。</w:t>
+        <w:t>已整理41包，待整理30包；根目录双层迁移未完成。下一项G-05。</w:t>
       </w:r>
     </w:p>
     <w:p>
@@ -1771,7 +1809,7 @@
         <w:keepLines/>
       </w:pPr>
       <w:r>
-        <w:t>Z-01、G-05、E-01、E-02、B-01、E-03、G-03、B-02、E-04、A-05、E-05、G-04、B-03、E-06、A-04、A-06、W-02、W-03、W-04、U12-01、U12-02、U12-03、U12-04、U12-05、U12-06、U12-07、U12-08、U12-09、U12-10、U12-11、U12-12</w:t>
+        <w:t>G-05、E-01、E-02、B-01、E-03、G-03、B-02、E-04、A-05、E-05、G-04、B-03、E-06、A-04、A-06、W-02、W-03、W-04、U12-01、U12-02、U12-03、U12-04、U12-05、U12-06、U12-07、U12-08、U12-09、U12-10、U12-11、U12-12</w:t>
       </w:r>
     </w:p>
     <w:sectPr>

</xml_diff>

<commit_message>
docs: normalize G-05 admission and archive stale setup
</commit_message>
<xml_diff>
--- a/human/project-review.docx
+++ b/human/project-review.docx
@@ -1793,6 +1793,49 @@
         <w:pStyle w:val="Heading1"/>
       </w:pPr>
       <w:r>
+        <w:t>G-05 外部准入</w:t>
+      </w:r>
+    </w:p>
+    <w:p>
+      <w:r>
+        <w:t>G-05仍WAIT_DEP_EXTERNAL、未领取未签收。五份过期包/手册原件实际归档，当前准入与专机入口订正；28项专项通过，本机六项仍失败，十三项外部资格均待真实证据。</w:t>
+      </w:r>
+    </w:p>
+    <w:p>
+      <w:r>
+        <w:t>G-01供当前材料、G-02供治理门，U12-05供早期批准；G-05取得真人回执、正式机器、用途许可和现场吞吐，不能由Agent材料或总监单签代替。</w:t>
+      </w:r>
+    </w:p>
+    <w:p>
+      <w:r>
+        <w:t>U-08/I-01/Z-01消费真实环境/资产；G-03/G-04及U12-11按对应活动冻结，W-03审公开。核心与可选阶段三分开报告，13项全包规则与核心闭环问题保留待裁定。</w:t>
+      </w:r>
+    </w:p>
+    <w:p>
+      <w:r>
+        <w:t>G05-N01 FIXED_ARCHIVE_AND_CURRENT_ENTRIES：五旧文件实际归档，原路径改导航，旧目录/早期整体门/固定六行说明订正</w:t>
+      </w:r>
+    </w:p>
+    <w:p>
+      <w:r>
+        <w:t>G05-N02 FIXED_VERIFY_OUTPUT_DIRECTORY：初次核查脚本未创建evidence，补固定目录初始化后完整复测通过</w:t>
+      </w:r>
+    </w:p>
+    <w:p>
+      <w:r>
+        <w:t>G05-N03 OPEN_REAL_OWNERS_AND_RECEIPTS：13项外部资格待定，本机六项未过，机构/专机/许可与两周U8无真实签收</w:t>
+      </w:r>
+    </w:p>
+    <w:p>
+      <w:r>
+        <w:t>G05-N04 OPEN_GLOBAL_DONE_VS_OPTIONAL_STAGE3：现有整体DONE要求13项含阶段三，核心按活动准入的关闭规则仍须治理裁定，未伪造资格或修改门</w:t>
+      </w:r>
+    </w:p>
+    <w:p>
+      <w:pPr>
+        <w:pStyle w:val="Heading1"/>
+      </w:pPr>
+      <w:r>
         <w:t>待整理队列</w:t>
       </w:r>
     </w:p>
@@ -1801,7 +1844,7 @@
         <w:keepNext/>
       </w:pPr>
       <w:r>
-        <w:t>已整理41包，待整理30包；根目录双层迁移未完成。下一项G-05。</w:t>
+        <w:t>已整理42包，待整理29包；根目录双层迁移未完成。下一项E-01。</w:t>
       </w:r>
     </w:p>
     <w:p>
@@ -1809,7 +1852,7 @@
         <w:keepLines/>
       </w:pPr>
       <w:r>
-        <w:t>G-05、E-01、E-02、B-01、E-03、G-03、B-02、E-04、A-05、E-05、G-04、B-03、E-06、A-04、A-06、W-02、W-03、W-04、U12-01、U12-02、U12-03、U12-04、U12-05、U12-06、U12-07、U12-08、U12-09、U12-10、U12-11、U12-12</w:t>
+        <w:t>E-01、E-02、B-01、E-03、G-03、B-02、E-04、A-05、E-05、G-04、B-03、E-06、A-04、A-06、W-02、W-03、W-04、U12-01、U12-02、U12-03、U12-04、U12-05、U12-06、U12-07、U12-08、U12-09、U12-10、U12-11、U12-12</w:t>
       </w:r>
     </w:p>
     <w:sectPr>

</xml_diff>

<commit_message>
docs: normalize E-01 execution package and repair historical consumers
</commit_message>
<xml_diff>
--- a/human/project-review.docx
+++ b/human/project-review.docx
@@ -1836,6 +1836,39 @@
         <w:pStyle w:val="Heading1"/>
       </w:pPr>
       <w:r>
+        <w:t>E-01 研究执行</w:t>
+      </w:r>
+    </w:p>
+    <w:p>
+      <w:r>
+        <w:t>E-01仍BLOCKED_EXTERNAL、未领取未签收。三份旧第7步原件实际归档，当前专家/重建执行和G-01消费者订正；38项合成与交接检查通过，无真实专家或活动证据。</w:t>
+      </w:r>
+    </w:p>
+    <w:p>
+      <w:r>
+        <w:t>Q-01交冻结材料和计分器，U12-05及对应资格交批准范围；E-01交真实专家/独立重建结果、分歧和修订决定。失败退回Q-01产生新候选复核，不回写原始评分或改原签署。</w:t>
+      </w:r>
+    </w:p>
+    <w:p>
+      <w:r>
+        <w:t>E-02仍等待Q-02/E-01/U12-05及自身真设备范围，不因Level A批准自动放行。W-01/W-02、A-06消费真实设计知识范围，情绪主比较独立报告，核心论文不等待可选阶段三。</w:t>
+      </w:r>
+    </w:p>
+    <w:p>
+      <w:r>
+        <w:t>E01-N01 FIXED_ARCHIVE_AND_CONSUMER：三旧第7步文件实际归档，当前执行与G-01原件核查订正，不再用6/8与旧全路线门</w:t>
+      </w:r>
+    </w:p>
+    <w:p>
+      <w:r>
+        <w:t>E01-N02 OPEN_REAL_ACTIVITY_AND_MATERIAL_FREEZE：批准、15名人员、评分含义冻结、真实结果及签署未完成，CLI报告不自带完整原始来源束</w:t>
+      </w:r>
+    </w:p>
+    <w:p>
+      <w:pPr>
+        <w:pStyle w:val="Heading1"/>
+      </w:pPr>
+      <w:r>
         <w:t>待整理队列</w:t>
       </w:r>
     </w:p>
@@ -1844,7 +1877,7 @@
         <w:keepNext/>
       </w:pPr>
       <w:r>
-        <w:t>已整理42包，待整理29包；根目录双层迁移未完成。下一项E-01。</w:t>
+        <w:t>已整理43包，待整理28包；根目录双层迁移未完成。下一项E-02。</w:t>
       </w:r>
     </w:p>
     <w:p>
@@ -1852,7 +1885,7 @@
         <w:keepLines/>
       </w:pPr>
       <w:r>
-        <w:t>E-01、E-02、B-01、E-03、G-03、B-02、E-04、A-05、E-05、G-04、B-03、E-06、A-04、A-06、W-02、W-03、W-04、U12-01、U12-02、U12-03、U12-04、U12-05、U12-06、U12-07、U12-08、U12-09、U12-10、U12-11、U12-12</w:t>
+        <w:t>E-02、B-01、E-03、G-03、B-02、E-04、A-05、E-05、G-04、B-03、E-06、A-04、A-06、W-02、W-03、W-04、U12-01、U12-02、U12-03、U12-04、U12-05、U12-06、U12-07、U12-08、U12-09、U12-10、U12-11、U12-12</w:t>
       </w:r>
     </w:p>
     <w:sectPr>

</xml_diff>

<commit_message>
docs: normalize E-02 cognitive pilot execution and closure package
</commit_message>
<xml_diff>
--- a/human/project-review.docx
+++ b/human/project-review.docx
@@ -1869,6 +1869,44 @@
         <w:pStyle w:val="Heading1"/>
       </w:pPr>
       <w:r>
+        <w:t>E-02 研究执行</w:t>
+      </w:r>
+    </w:p>
+    <w:p>
+      <w:r>
+        <w:t>E-02仍BLOCKED_EXTERNAL、未领取未签收。两旧第8步方案实际归档，当前四层认知预试、单条件/单次体验和修订关闭交接订正；70项合成/交接检查通过，没有真人预试或新Unity回归。</w:t>
+      </w:r>
+    </w:p>
+    <w:p>
+      <w:r>
+        <w:t>Q-02交材料与提纲，E-01交真实Level A关闭，U12-05及对应资格交实际批准；U/V和教学/测量交同版本呈现。E-02交真实覆盖、独立回答、原始问题/分歧、成对修订和关闭候选。</w:t>
+      </w:r>
+    </w:p>
+    <w:p>
+      <w:r>
+        <w:t>B-01/Q-03/E-03继续等待自己的真机、分析与批准；U12-04/U12-11消费时序/成本/缺失及冻结依据，W/A保留功能不足和设计边界，核心主情绪比较独立报告。</w:t>
+      </w:r>
+    </w:p>
+    <w:p>
+      <w:r>
+        <w:t>E02-N01 FIXED_ARCHIVE_AND_CURRENT_RULES：两旧第8步方案实际归档，三层/重复理解/固定12人不再作当前执行门</w:t>
+      </w:r>
+    </w:p>
+    <w:p>
+      <w:r>
+        <w:t>E02-N02 FIXED_LITERAL_ASSERTION：初次文本断言与正文不匹配，修正后复测通过，不改研究语义</w:t>
+      </w:r>
+    </w:p>
+    <w:p>
+      <w:r>
+        <w:t>E02-N03 OPEN_REAL_FREEZE_ACTIVITY_AND_CLOSURE：人数/阈值与材料冻结、实际批准/角色/记录、真实构建复测和签署未完成</w:t>
+      </w:r>
+    </w:p>
+    <w:p>
+      <w:pPr>
+        <w:pStyle w:val="Heading1"/>
+      </w:pPr>
+      <w:r>
         <w:t>待整理队列</w:t>
       </w:r>
     </w:p>
@@ -1877,7 +1915,7 @@
         <w:keepNext/>
       </w:pPr>
       <w:r>
-        <w:t>已整理43包，待整理28包；根目录双层迁移未完成。下一项E-02。</w:t>
+        <w:t>已整理44包，待整理27包；根目录双层迁移未完成。下一项B-01。</w:t>
       </w:r>
     </w:p>
     <w:p>
@@ -1885,7 +1923,7 @@
         <w:keepLines/>
       </w:pPr>
       <w:r>
-        <w:t>E-02、B-01、E-03、G-03、B-02、E-04、A-05、E-05、G-04、B-03、E-06、A-04、A-06、W-02、W-03、W-04、U12-01、U12-02、U12-03、U12-04、U12-05、U12-06、U12-07、U12-08、U12-09、U12-10、U12-11、U12-12</w:t>
+        <w:t>B-01、E-03、G-03、B-02、E-04、A-05、E-05、G-04、B-03、E-06、A-04、A-06、W-02、W-03、W-04、U12-01、U12-02、U12-03、U12-04、U12-05、U12-06、U12-07、U12-08、U12-09、U12-10、U12-11、U12-12</w:t>
       </w:r>
     </w:p>
     <w:sectPr>

</xml_diff>

<commit_message>
docs: normalize B-01 Level C batch handoff and human review
</commit_message>
<xml_diff>
--- a/human/project-review.docx
+++ b/human/project-review.docx
@@ -1907,6 +1907,44 @@
         <w:pStyle w:val="Heading1"/>
       </w:pPr>
       <w:r>
+        <w:t>B-01 研究批次</w:t>
+      </w:r>
+    </w:p>
+    <w:p>
+      <w:r>
+        <w:t>B-01保持TEMPLATE、BLOCKED_EXTERNAL，未领取未签收。当前批次流程、人数口径、空白登记及QC骨架已整理；真实分配、会话、批次QC和活动未生成，不把48设计单元当48参与者。</w:t>
+      </w:r>
+    </w:p>
+    <w:p>
+      <w:r>
+        <w:t>Q-03交实际分配/manifest、盲态工具与材料，E-02交真实修订关闭，G-05/U12-05按本活动交批准；I/D/S/P交同版本真机、时钟、回执和记录链。</w:t>
+      </w:r>
+    </w:p>
+    <w:p>
+      <w:r>
+        <w:t>B-01向E-03交全部实际实例、六类原件索引、封存检查、独立标注/分歧、人数口径和偏离。标注未完成时QC待补，不能即时假PASS；E-03/校准/冻结继续，不靠效果方向调参或堵塞可选阶段三以外的核心论文。</w:t>
+      </w:r>
+    </w:p>
+    <w:p>
+      <w:r>
+        <w:t>B01-N01 FIXED_CURRENT_TEMPLATE_AND_INTERFACE_SCOPE：建立单次核心批次入口，区分P-01已支持与X-01分配缺口，空表不作真实批次</w:t>
+      </w:r>
+    </w:p>
+    <w:p>
+      <w:r>
+        <w:t>B01-N02 FIXED_COUNT_AND_QC_HANDOFF：分配/暴露/完成/停止/取消分开，六类原件沿现有枚举；未标注不假PASS，退出不足不定向补人</w:t>
+      </w:r>
+    </w:p>
+    <w:p>
+      <w:r>
+        <w:t>B01-N03 OPEN_REAL_ACTIVITY_TOOLING_AND_FREEZE：实际批准、实名人员、Level C分配、真机链、人数/退出/暴露规则及真实QC未完成</w:t>
+      </w:r>
+    </w:p>
+    <w:p>
+      <w:pPr>
+        <w:pStyle w:val="Heading1"/>
+      </w:pPr>
+      <w:r>
         <w:t>待整理队列</w:t>
       </w:r>
     </w:p>
@@ -1915,7 +1953,7 @@
         <w:keepNext/>
       </w:pPr>
       <w:r>
-        <w:t>已整理44包，待整理27包；根目录双层迁移未完成。下一项B-01。</w:t>
+        <w:t>已整理45包，待整理26包；根目录双层迁移未完成。下一项E-03。</w:t>
       </w:r>
     </w:p>
     <w:p>
@@ -1923,7 +1961,7 @@
         <w:keepLines/>
       </w:pPr>
       <w:r>
-        <w:t>B-01、E-03、G-03、B-02、E-04、A-05、E-05、G-04、B-03、E-06、A-04、A-06、W-02、W-03、W-04、U12-01、U12-02、U12-03、U12-04、U12-05、U12-06、U12-07、U12-08、U12-09、U12-10、U12-11、U12-12</w:t>
+        <w:t>E-03、G-03、B-02、E-04、A-05、E-05、G-04、B-03、E-06、A-04、A-06、W-02、W-03、W-04、U12-01、U12-02、U12-03、U12-04、U12-05、U12-06、U12-07、U12-08、U12-09、U12-10、U12-11、U12-12</w:t>
       </w:r>
     </w:p>
     <w:sectPr>

</xml_diff>

<commit_message>
docs: normalize E-03 technical closeout and repair Level C activity scope
</commit_message>
<xml_diff>
--- a/human/project-review.docx
+++ b/human/project-review.docx
@@ -1945,6 +1945,44 @@
         <w:pStyle w:val="Heading1"/>
       </w:pPr>
       <w:r>
+        <w:t>E-03 研究关闭</w:t>
+      </w:r>
+    </w:p>
+    <w:p>
+      <w:r>
+        <w:t>E-03保持BLOCKED_EXTERNAL、未领取未签收。真实批次汇总、技术报告/配置、校准和研究冻结分开；补齐Level C活动矩阵的B-01采集范围，许可仍待回执，不推定已放行。</w:t>
+      </w:r>
+    </w:p>
+    <w:p>
+      <w:r>
+        <w:t>Q-03供盲态工具，E-02供真实修订关闭，B-01供全部实例/六类原件/QC，I/S供独立事件及外部时钟显示；许可按B-01/E-03实际活动范围，不凭材料存在放行。</w:t>
+      </w:r>
+    </w:p>
+    <w:p>
+      <w:r>
+        <w:t>E-03交盲态技术关闭和精确候选给A-03-CAL，CAL在REAL与E-03之后，U12-11/G-03再做研究冻结。最终N/界值不由本轮填写；主要情绪比较独立报告，可选阶段三不是核心论文前置。</w:t>
+      </w:r>
+    </w:p>
+    <w:p>
+      <w:r>
+        <w:t>E03-N01 FIXED_LEVEL_C_ACTIVITY_SCOPE：Level C资格行补齐B-01实际采集，仍PENDING_EXTERNAL；在研输入冻结未刷新并留影响记录</w:t>
+      </w:r>
+    </w:p>
+    <w:p>
+      <w:r>
+        <w:t>E03-N02 FIXED_CLOSEOUT_CAL_AND_FREEZE_HANDOFF：技术关闭、CAL、研究冻结分开；既有工程AC与旧事件门不混同，步骤9及手册消费者对齐</w:t>
+      </w:r>
+    </w:p>
+    <w:p>
+      <w:r>
+        <w:t>E03-N03 OPEN_REAL_EVIDENCE_AND_APPROVAL：真实全部批次、实名人员、盲态门定义/独立验证、技术配置及签署未完成</w:t>
+      </w:r>
+    </w:p>
+    <w:p>
+      <w:pPr>
+        <w:pStyle w:val="Heading1"/>
+      </w:pPr>
+      <w:r>
         <w:t>待整理队列</w:t>
       </w:r>
     </w:p>
@@ -1953,7 +1991,7 @@
         <w:keepNext/>
       </w:pPr>
       <w:r>
-        <w:t>已整理45包，待整理26包；根目录双层迁移未完成。下一项E-03。</w:t>
+        <w:t>已整理46包，待整理25包；根目录双层迁移未完成。下一项G-03。</w:t>
       </w:r>
     </w:p>
     <w:p>
@@ -1961,7 +1999,7 @@
         <w:keepLines/>
       </w:pPr>
       <w:r>
-        <w:t>E-03、G-03、B-02、E-04、A-05、E-05、G-04、B-03、E-06、A-04、A-06、W-02、W-03、W-04、U12-01、U12-02、U12-03、U12-04、U12-05、U12-06、U12-07、U12-08、U12-09、U12-10、U12-11、U12-12</w:t>
+        <w:t>G-03、B-02、E-04、A-05、E-05、G-04、B-03、E-06、A-04、A-06、W-02、W-03、W-04、U12-01、U12-02、U12-03、U12-04、U12-05、U12-06、U12-07、U12-08、U12-09、U12-10、U12-11、U12-12</w:t>
       </w:r>
     </w:p>
     <w:sectPr>

</xml_diff>

<commit_message>
Normalize G-03 preregistration handoff and current gate authority
</commit_message>
<xml_diff>
--- a/human/project-review.docx
+++ b/human/project-review.docx
@@ -1983,6 +1983,44 @@
         <w:pStyle w:val="Heading1"/>
       </w:pPr>
       <w:r>
+        <w:t>G-03 预注册与锁定</w:t>
+      </w:r>
+    </w:p>
+    <w:p>
+      <w:r>
+        <w:t>G-03仍BLOCKED_EXTERNAL，未领取未签收。旧当前门禁按字节归档，新入口按v1.2分别处理情绪比较、功能护栏及真实准入；15项冻结与真实预注册未完成，规范化不放行B-02。</w:t>
+      </w:r>
+    </w:p>
+    <w:p>
+      <w:r>
+        <w:t>E-03供技术关闭、A-03供REAL/CAL、A-02/U12-04供统计规则、U12-11供数值/资源冻结、X-01/Z-01供隐藏清单和同构建，G-05供阶段一适用回执；不能互用候选或旧锚点放行。</w:t>
+      </w:r>
+    </w:p>
+    <w:p>
+      <w:r>
+        <w:t>U12-06接六类正式入口并提供负测/真实签收。B-02只消费已关闭G-03版本，最多12人一实例，按分配平衡，禁止按方向/p值或完成缺格补人；A-05/A-06/W沿同一SAP关闭核心论文，不强制未开展阶段三DONE。</w:t>
+      </w:r>
+    </w:p>
+    <w:p>
+      <w:r>
+        <w:t>G03-N01 FIXED_ARCHIVE_AND_CURRENT_GATE_CONSUMERS：旧当前门禁有序报告/强制策略描述实际归档，新入口及历史验证/步骤9/手册按当前范围消费</w:t>
+      </w:r>
+    </w:p>
+    <w:p>
+      <w:r>
+        <w:t>G03-N02 VERIFIED_EXISTING_RUNTIME_DEPENDENCY：U12-06已由U12-11/U12-09传递依赖，无重复新增边或冻结快照改写</w:t>
+      </w:r>
+    </w:p>
+    <w:p>
+      <w:r>
+        <w:t>G03-N03 OPEN_REAL_FREEZE_PREREGISTRATION_AND_RUNTIME：15项真实冻结、阶段一资格、预注册、入口/教学暴露接线与实名签收缺；G-05全项关闭与可选阶段三冲突未裁定</w:t>
+      </w:r>
+    </w:p>
+    <w:p>
+      <w:pPr>
+        <w:pStyle w:val="Heading1"/>
+      </w:pPr>
+      <w:r>
         <w:t>待整理队列</w:t>
       </w:r>
     </w:p>
@@ -1991,7 +2029,7 @@
         <w:keepNext/>
       </w:pPr>
       <w:r>
-        <w:t>已整理46包，待整理25包；根目录双层迁移未完成。下一项G-03。</w:t>
+        <w:t>已整理47包，待整理24包；根目录双层迁移未完成。下一项B-02。</w:t>
       </w:r>
     </w:p>
     <w:p>
@@ -1999,7 +2037,7 @@
         <w:keepLines/>
       </w:pPr>
       <w:r>
-        <w:t>G-03、B-02、E-04、A-05、E-05、G-04、B-03、E-06、A-04、A-06、W-02、W-03、W-04、U12-01、U12-02、U12-03、U12-04、U12-05、U12-06、U12-07、U12-08、U12-09、U12-10、U12-11、U12-12</w:t>
+        <w:t>B-02、E-04、A-05、E-05、G-04、B-03、E-06、A-04、A-06、W-02、W-03、W-04、U12-01、U12-02、U12-03、U12-04、U12-05、U12-06、U12-07、U12-08、U12-09、U12-10、U12-11、U12-12</w:t>
       </w:r>
     </w:p>
     <w:sectPr>

</xml_diff>

<commit_message>
Normalize B-02 batch handoff and generate Word review
</commit_message>
<xml_diff>
--- a/human/project-review.docx
+++ b/human/project-review.docx
@@ -2021,6 +2021,44 @@
         <w:pStyle w:val="Heading1"/>
       </w:pPr>
       <w:r>
+        <w:t>B-02 正式批次</w:t>
+      </w:r>
+    </w:p>
+    <w:p>
+      <w:r>
+        <w:t>B-02仍TEMPLATE/BLOCKED_EXTERNAL，真实实例为空、未领取未签收。两旧正式执行方案实际归档，当前批次按v1.2冻结版本、已分配平衡与单次体验对齐，不生成正式manifest或采集许可。</w:t>
+      </w:r>
+    </w:p>
+    <w:p>
+      <w:r>
+        <w:t>G-03供同版本研究冻结/预注册和活动资格，X-01供分配，P/S/D/U/I供真实记录链，G-02/G-05供去重/权限与专机；当前软件签收不代替实际链或正式批准。</w:t>
+      </w:r>
+    </w:p>
+    <w:p>
+      <w:r>
+        <w:t>E-04接全部实例、退出/失败、盲态QC、停止和偏离，单批结束不自动锁库/揭盲。A-01读取授权原件，A-05用同一锁定SAP报告PANAS与护栏；不以设备失败删除有效量表，也不要求可选阶段三完成。</w:t>
+      </w:r>
+    </w:p>
+    <w:p>
+      <w:r>
+        <w:t>B02-N01 FIXED_ARCHIVE_AND_EXECUTION_ENTRIES：两旧第10步方案按原字节归档，新入口及历史校验对齐v1.2未冻结N/时序与条件式扩展</w:t>
+      </w:r>
+    </w:p>
+    <w:p>
+      <w:r>
+        <w:t>B02-N02 FIXED_BATCH_ALLOCATION_AND_QC_HANDOFF：区分12人批次与48分配块、操作完成与分析集、教学暴露和数据恢复，空QC不授权锁库</w:t>
+      </w:r>
+    </w:p>
+    <w:p>
+      <w:r>
+        <w:t>B02-N03 OPEN_REAL_APPROVAL_RUNTIME_AND_BATCHES：真实批准/冻结、清单权限、运行整合、人员、所有批次/QC及签收仍未交付</w:t>
+      </w:r>
+    </w:p>
+    <w:p>
+      <w:pPr>
+        <w:pStyle w:val="Heading1"/>
+      </w:pPr>
+      <w:r>
         <w:t>待整理队列</w:t>
       </w:r>
     </w:p>
@@ -2029,7 +2067,7 @@
         <w:keepNext/>
       </w:pPr>
       <w:r>
-        <w:t>已整理47包，待整理24包；根目录双层迁移未完成。下一项B-02。</w:t>
+        <w:t>已整理48包，待整理23包；根目录双层迁移未完成。下一项E-04。</w:t>
       </w:r>
     </w:p>
     <w:p>
@@ -2037,7 +2075,7 @@
         <w:keepLines/>
       </w:pPr>
       <w:r>
-        <w:t>B-02、E-04、A-05、E-05、G-04、B-03、E-06、A-04、A-06、W-02、W-03、W-04、U12-01、U12-02、U12-03、U12-04、U12-05、U12-06、U12-07、U12-08、U12-09、U12-10、U12-11、U12-12</w:t>
+        <w:t>E-04、A-05、E-05、G-04、B-03、E-06、A-04、A-06、W-02、W-03、W-04、U12-01、U12-02、U12-03、U12-04、U12-05、U12-06、U12-07、U12-08、U12-09、U12-10、U12-11、U12-12</w:t>
       </w:r>
     </w:p>
     <w:sectPr>

</xml_diff>

<commit_message>
Normalize E-04 research lock and unblinding handoff
</commit_message>
<xml_diff>
--- a/human/project-review.docx
+++ b/human/project-review.docx
@@ -2059,6 +2059,44 @@
         <w:pStyle w:val="Heading1"/>
       </w:pPr>
       <w:r>
+        <w:t>E-04 研究关闭</w:t>
+      </w:r>
+    </w:p>
+    <w:p>
+      <w:r>
+        <w:t>E-04仍BLOCKED_EXTERNAL、未领取未签收；没有真实批次、研究锁库或揭盲授权。两旧第11步有序门方案已实际归档，当前执行入口对齐PANAS主比较与全部批次盲态QC，不用会话封存和平衡报告替代真人授权。</w:t>
+      </w:r>
+    </w:p>
+    <w:p>
+      <w:r>
+        <w:t>G-03供同版冻结/预注册/资格，B-02交所有真实实例，P-02/G-02/X-01供实际原件、去重和分配核查；A-01盲态重建、A-02分析集/缺失、A-03/U12-11正式SAP仍需完成。</w:t>
+      </w:r>
+    </w:p>
+    <w:p>
+      <w:r>
+        <w:t>A-05须取得锁定输入和真实授权后分析，A-06关闭实际核心范围、W-02/W-03用同一证据；可选阶段三不用伪DONE。揭盲后变更保留旧锁定对象与偏离，不能冒称事前冻结。</w:t>
+      </w:r>
+    </w:p>
+    <w:p>
+      <w:r>
+        <w:t>E04-N01 FIXED_ARCHIVE_AND_CURRENT_ANALYSIS_ENTRIES：两旧第11步有序门原文实际归档，新导航/历史验证消费者和手册过程修复</w:t>
+      </w:r>
+    </w:p>
+    <w:p>
+      <w:r>
+        <w:t>E04-N02 FIXED_LOCK_BLINDING_AND_CONSUMER_BOUNDARIES：封存、原件核查、锁库、揭盲分开；实际平衡接口不核验分析集或授权，盲态映射职责明确</w:t>
+      </w:r>
+    </w:p>
+    <w:p>
+      <w:r>
+        <w:t>E04-N03 OPEN_REAL_BATCHES_RECONSTRUCTION_LOCK_AND_AUTHORIZATION：全部真实批次、盲态QC/重建、正式SAP、锁库工具与真实签名/授权仍缺</w:t>
+      </w:r>
+    </w:p>
+    <w:p>
+      <w:pPr>
+        <w:pStyle w:val="Heading1"/>
+      </w:pPr>
+      <w:r>
         <w:t>待整理队列</w:t>
       </w:r>
     </w:p>
@@ -2067,7 +2105,7 @@
         <w:keepNext/>
       </w:pPr>
       <w:r>
-        <w:t>已整理48包，待整理23包；根目录双层迁移未完成。下一项E-04。</w:t>
+        <w:t>已整理49包，待整理22包；根目录双层迁移未完成。下一项A-05。</w:t>
       </w:r>
     </w:p>
     <w:p>
@@ -2075,7 +2113,7 @@
         <w:keepLines/>
       </w:pPr>
       <w:r>
-        <w:t>E-04、A-05、E-05、G-04、B-03、E-06、A-04、A-06、W-02、W-03、W-04、U12-01、U12-02、U12-03、U12-04、U12-05、U12-06、U12-07、U12-08、U12-09、U12-10、U12-11、U12-12</w:t>
+        <w:t>A-05、E-05、G-04、B-03、E-06、A-04、A-06、W-02、W-03、W-04、U12-01、U12-02、U12-03、U12-04、U12-05、U12-06、U12-07、U12-08、U12-09、U12-10、U12-11、U12-12</w:t>
       </w:r>
     </w:p>
     <w:sectPr>

</xml_diff>

<commit_message>
docs: normalize A-05 locked analysis handoff and human review
</commit_message>
<xml_diff>
--- a/human/project-review.docx
+++ b/human/project-review.docx
@@ -2097,6 +2097,44 @@
         <w:pStyle w:val="Heading1"/>
       </w:pPr>
       <w:r>
+        <w:t>A-05 锁定分析</w:t>
+      </w:r>
+    </w:p>
+    <w:p>
+      <w:r>
+        <w:t>A-05仍BLOCKED_EXTERNAL、未领取未签收；真实锁定输入、授权和完整分析流水线尚缺。旧问卷说明已实际归档，当前交接对齐PANAS主比较、独立功能护栏和过程结果；合成工具验证不代表真实效果。</w:t>
+      </w:r>
+    </w:p>
+    <w:p>
+      <w:r>
+        <w:t>E-04交真实锁库及揭盲授权，A-01交原件重建，A-02交机会计数/资格/缺失，A-03及U12-11交真实冻结SAP；现有候选工具不能替代这些交付。</w:t>
+      </w:r>
+    </w:p>
+    <w:p>
+      <w:r>
+        <w:t>A-06、W-02/W-03消费同一主张—结果—图表—输入—代码链，U12-10按冻结规则分类；核心论文不依赖阶段三。若批准训练，参与者分组且只用决策前状态，后测仅作离线标签。</w:t>
+      </w:r>
+    </w:p>
+    <w:p>
+      <w:r>
+        <w:t>A05-N01 FIXED_ARCHIVE_AND_CURRENT_CONSUMERS：旧问卷实际归档，当前PANAS/时序入口及历史验证消费者修复</w:t>
+      </w:r>
+    </w:p>
+    <w:p>
+      <w:r>
+        <w:t>A05-N02 OPEN_CANDIDATE_SAP_WORDING_REVISION：观测集资格与48块表述和实现不同，保留签收原件并登记受控修订</w:t>
+      </w:r>
+    </w:p>
+    <w:p>
+      <w:r>
+        <w:t>A05-N03 OPEN_REAL_LOCKED_ANALYSIS_AND_OWNERS：真实锁库授权、正式SAP、完整分析和分类流水线、实名复跑及签收缺</w:t>
+      </w:r>
+    </w:p>
+    <w:p>
+      <w:pPr>
+        <w:pStyle w:val="Heading1"/>
+      </w:pPr>
+      <w:r>
         <w:t>待整理队列</w:t>
       </w:r>
     </w:p>
@@ -2105,7 +2143,7 @@
         <w:keepNext/>
       </w:pPr>
       <w:r>
-        <w:t>已整理49包，待整理22包；根目录双层迁移未完成。下一项A-05。</w:t>
+        <w:t>已整理50包，待整理21包；根目录双层迁移未完成。下一项E-05。</w:t>
       </w:r>
     </w:p>
     <w:p>
@@ -2113,7 +2151,7 @@
         <w:keepLines/>
       </w:pPr>
       <w:r>
-        <w:t>A-05、E-05、G-04、B-03、E-06、A-04、A-06、W-02、W-03、W-04、U12-01、U12-02、U12-03、U12-04、U12-05、U12-06、U12-07、U12-08、U12-09、U12-10、U12-11、U12-12</w:t>
+        <w:t>E-05、G-04、B-03、E-06、A-04、A-06、W-02、W-03、W-04、U12-01、U12-02、U12-03、U12-04、U12-05、U12-06、U12-07、U12-08、U12-09、U12-10、U12-11、U12-12</w:t>
       </w:r>
     </w:p>
     <w:sectPr>

</xml_diff>

<commit_message>
docs: normalize E-05 freeze gates and repair policy review consumers
</commit_message>
<xml_diff>
--- a/human/project-review.docx
+++ b/human/project-review.docx
@@ -1694,7 +1694,7 @@
     </w:p>
     <w:p>
       <w:r>
-        <w:t>E-05/U12-08冻结真实模型、方法、阈值及模型核查结果；X-03只读加载和逐决策部署，P-01保持编排权威。阶段三独立队列比较包含回退的部署策略，同一锁定资料的学习/OPE不是确认性优效。</w:t>
+        <w:t>E-05冻结真实模型、方法、阈值及模型核查结果；X-03只读加载和逐决策部署，P-01保持编排权威。阶段三独立队列比较包含回退的部署策略，同一锁定资料的学习/OPE不是确认性优效。</w:t>
       </w:r>
     </w:p>
     <w:p>
@@ -1727,7 +1727,7 @@
     </w:p>
     <w:p>
       <w:r>
-        <w:t>X-02提供模型与支持报告，E-05/U12-08真实冻结，X-01分配、G-05资格；U-08供同一scene_native构建，U-01只维护渲染镜像，TD不选天气或装模型。</w:t>
+        <w:t>X-02提供模型与支持报告，E-05真实冻结，X-01分配、G-05资格；U-08供同一scene_native构建，U-01只维护渲染镜像，TD不选天气或装模型。</w:t>
       </w:r>
     </w:p>
     <w:p>
@@ -2135,6 +2135,49 @@
         <w:pStyle w:val="Heading1"/>
       </w:pPr>
       <w:r>
+        <w:t>E-05 策略冻结</w:t>
+      </w:r>
+    </w:p>
+    <w:p>
+      <w:r>
+        <w:t>E-05仍BLOCKED_EXTERNAL、未领取未签收；真实模型、OPE/ESS、事前标准和最终签署尚缺。已拆开揭盲前选择标准与分析后模型冻结，纠正U12-08职责，并同步修正X-02/X-03执行与人读总结。</w:t>
+      </w:r>
+    </w:p>
+    <w:p>
+      <w:r>
+        <w:t>A-05/E-04交真实锁定资料与授权，X-02交参与者分组训练/OPE/支持；G-03/U12-11及E-04交揭盲前标准来源。现真实条件均缺，不能反向把后分析选择写事前冻结。</w:t>
+      </w:r>
+    </w:p>
+    <w:p>
+      <w:r>
+        <w:t>X-03只读加载，G-04另作独立准入/同构建，Z-01/I-01交真实制品和运行证据；U12-08消费后续扩展分析。A-06可关闭阶段一核心，实际扩展须披露分配、暴露、回退和停止记录。</w:t>
+      </w:r>
+    </w:p>
+    <w:p>
+      <w:r>
+        <w:t>E05-N01 FIXED_PRECRITERIA_VS_FINAL_FREEZE_HANDOFF：揭盲前选择标准与后分析最终模型冻结分开，无事前凭证不补日期或有利门槛</w:t>
+      </w:r>
+    </w:p>
+    <w:p>
+      <w:r>
+        <w:t>E05-N02 FIXED_U12_08_CONSUMERS_AND_WORD：U12-08实际为扩展分析附录，修正X-02/X-03当前执行和Word，避免循环职责</w:t>
+      </w:r>
+    </w:p>
+    <w:p>
+      <w:r>
+        <w:t>E05-N03 OPEN_REAL_MODEL_OPE_APPROVAL_AND_SIGNATURE：真实训练、支持报告、正式方法/阈值、事前批准及最终模型签署尚缺，不解除活动门</w:t>
+      </w:r>
+    </w:p>
+    <w:p>
+      <w:r>
+        <w:t>E05-N04 FIXED_POWERSHELL_ROOT_ENTRYPOINT：静态审查发现初稿根路径少一层，按现有方式修正并从仓库外实调复测</w:t>
+      </w:r>
+    </w:p>
+    <w:p>
+      <w:pPr>
+        <w:pStyle w:val="Heading1"/>
+      </w:pPr>
+      <w:r>
         <w:t>待整理队列</w:t>
       </w:r>
     </w:p>
@@ -2143,7 +2186,7 @@
         <w:keepNext/>
       </w:pPr>
       <w:r>
-        <w:t>已整理50包，待整理21包；根目录双层迁移未完成。下一项E-05。</w:t>
+        <w:t>已整理51包，待整理20包；根目录双层迁移未完成。下一项G-04。</w:t>
       </w:r>
     </w:p>
     <w:p>
@@ -2151,7 +2194,7 @@
         <w:keepLines/>
       </w:pPr>
       <w:r>
-        <w:t>E-05、G-04、B-03、E-06、A-04、A-06、W-02、W-03、W-04、U12-01、U12-02、U12-03、U12-04、U12-05、U12-06、U12-07、U12-08、U12-09、U12-10、U12-11、U12-12</w:t>
+        <w:t>G-04、B-03、E-06、A-04、A-06、W-02、W-03、W-04、U12-01、U12-02、U12-03、U12-04、U12-05、U12-06、U12-07、U12-08、U12-09、U12-10、U12-11、U12-12</w:t>
       </w:r>
     </w:p>
     <w:sectPr>

</xml_diff>

<commit_message>
Normalize G-04 extension freeze handoff and human review
</commit_message>
<xml_diff>
--- a/human/project-review.docx
+++ b/human/project-review.docx
@@ -2178,6 +2178,49 @@
         <w:pStyle w:val="Heading1"/>
       </w:pPr>
       <w:r>
+        <w:t>G-04 预注册与锁定</w:t>
+      </w:r>
+    </w:p>
+    <w:p>
+      <w:r>
+        <w:t>G-04仍BLOCKED_EXTERNAL、未领取未签收。已明确两原生组的部署策略比较、含回退估计目标、独立许可与同构建交接；真实策略运行、研究冻结、批准及预注册尚缺，核心论文不等待本包。</w:t>
+      </w:r>
+    </w:p>
+    <w:p>
+      <w:r>
+        <w:t>E-05交揭盲前选择标准来源和获准最终策略，X-03交只读动态运行/重放，Z-01交同版制品；G-05交活动凭证，量表与专机需另确认阶段三适用范围。现均未满足，不实例化真实B-03。</w:t>
+      </w:r>
+    </w:p>
+    <w:p>
+      <w:r>
+        <w:t>B-03/E-06交全部分配、暴露、回退及停止，A-04分析部署效果、U12-08附录；A-06依据实际活动决定范围。阶段一核心W-02/W-03不等待可选任务DONE，不以未开展布尔值隐去部分运行。</w:t>
+      </w:r>
+    </w:p>
+    <w:p>
+      <w:r>
+        <w:t>G04-N01 FIXED_POLICY_CONTRAST_HANDOFF：两scene_native组必须比较策略分配，阶段一cue_mode模板不是扩展模型；候选未冒充正式冻结</w:t>
+      </w:r>
+    </w:p>
+    <w:p>
+      <w:r>
+        <w:t>G04-N02 FIXED_RESULT_GATE_AND_ADMISSION_HANDOFF：Gate3结果判据、采集前资格、共享配置与同构建分开，修正三个入口和手册</w:t>
+      </w:r>
+    </w:p>
+    <w:p>
+      <w:r>
+        <w:t>G04-N03 OPEN_DYNAMIC_DEPLOYMENT_AND_BUILD：48行分配已可生成但v2.2仍拒绝动态策略，同构建/共享配置没有真实验证</w:t>
+      </w:r>
+    </w:p>
+    <w:p>
+      <w:r>
+        <w:t>G04-N04 OPEN_REAL_FREEZE_AND_ACTIVITY_SCOPE：正式N/方法/预注册、三项直接许可、共享量表专机阶段三范围及真实责任人仍缺</w:t>
+      </w:r>
+    </w:p>
+    <w:p>
+      <w:pPr>
+        <w:pStyle w:val="Heading1"/>
+      </w:pPr>
+      <w:r>
         <w:t>待整理队列</w:t>
       </w:r>
     </w:p>
@@ -2186,7 +2229,7 @@
         <w:keepNext/>
       </w:pPr>
       <w:r>
-        <w:t>已整理51包，待整理20包；根目录双层迁移未完成。下一项G-04。</w:t>
+        <w:t>已整理52包，待整理19包；根目录双层迁移未完成。下一项B-03。</w:t>
       </w:r>
     </w:p>
     <w:p>
@@ -2194,7 +2237,7 @@
         <w:keepLines/>
       </w:pPr>
       <w:r>
-        <w:t>G-04、B-03、E-06、A-04、A-06、W-02、W-03、W-04、U12-01、U12-02、U12-03、U12-04、U12-05、U12-06、U12-07、U12-08、U12-09、U12-10、U12-11、U12-12</w:t>
+        <w:t>B-03、E-06、A-04、A-06、W-02、W-03、W-04、U12-01、U12-02、U12-03、U12-04、U12-05、U12-06、U12-07、U12-08、U12-09、U12-10、U12-11、U12-12</w:t>
       </w:r>
     </w:p>
     <w:sectPr>

</xml_diff>

<commit_message>
Normalize B-03 optional stage-three batch handoff and review
</commit_message>
<xml_diff>
--- a/human/project-review.docx
+++ b/human/project-review.docx
@@ -2221,6 +2221,49 @@
         <w:pStyle w:val="Heading1"/>
       </w:pPr>
       <w:r>
+        <w:t>B-03 正式批次</w:t>
+      </w:r>
+    </w:p>
+    <w:p>
+      <w:r>
+        <w:t>B-03仍为未执行的TEMPLATE/BLOCKED_EXTERNAL，真实实例为零、未领取未签收。已建立两原生组批次、真实决策与全部部分活动交接；固定随机开发重放不冒充动态策略通过，G-04真实放行仍缺。</w:t>
+      </w:r>
+    </w:p>
+    <w:p>
+      <w:r>
+        <w:t>G-04交独立放行、最终N/停止、同构建/配置和预注册；X-01交stage_3清单，X-03交真实决策前状态、完整候选概率和安全重放，D/S/P/U/I与G-02/G-05交设备、记录、去重及活动资格。现真实条件未齐，不实例化。</w:t>
+      </w:r>
+    </w:p>
+    <w:p>
+      <w:r>
+        <w:t>E-06接所有分配/暴露/退出、原件索引、盲态QC及停止；A-04按含回退部署目标分析，U12-08附录，A-06据真实分配/暴露/批次事实判范围。有部分运行不能自称NO_STAGE3；单批结束不授权揭盲。</w:t>
+      </w:r>
+    </w:p>
+    <w:p>
+      <w:r>
+        <w:t>B03-N01 CLARIFIED_BLOCK_VS_BATCH_AND_STOP：48分配块与12人批次、完成者与分配分开；注册完整块与部分运行差异保留，尾块/停止仍待G-04冻结</w:t>
+      </w:r>
+    </w:p>
+    <w:p>
+      <w:r>
+        <w:t>B03-N02 FIXED_FIXED_REPLAY_VS_POLICY_HANDOFF：固定随机重放、均衡中点见证及状态身份不冒充动态决策/完整分布/真实状态，当前消费者同步</w:t>
+      </w:r>
+    </w:p>
+    <w:p>
+      <w:r>
+        <w:t>B03-N03 FIXED_REASON_CODE_FIXTURE_AND_RETESTED：初次合成原因码不合法，修测试后复测，保留失败记录且不放宽核心合同</w:t>
+      </w:r>
+    </w:p>
+    <w:p>
+      <w:r>
+        <w:t>B03-N04 OPEN_REAL_ADMISSION_INSTANCES_AND_DYNAMIC_REPLAY：独立批准、策略动态运行、同构建配置、教学暴露、正式规则与真实实例/QC及实名职责仍缺</w:t>
+      </w:r>
+    </w:p>
+    <w:p>
+      <w:pPr>
+        <w:pStyle w:val="Heading1"/>
+      </w:pPr>
+      <w:r>
         <w:t>待整理队列</w:t>
       </w:r>
     </w:p>
@@ -2229,7 +2272,7 @@
         <w:keepNext/>
       </w:pPr>
       <w:r>
-        <w:t>已整理52包，待整理19包；根目录双层迁移未完成。下一项B-03。</w:t>
+        <w:t>已整理53包，待整理18包；根目录双层迁移未完成。下一项E-06。</w:t>
       </w:r>
     </w:p>
     <w:p>
@@ -2237,7 +2280,7 @@
         <w:keepLines/>
       </w:pPr>
       <w:r>
-        <w:t>B-03、E-06、A-04、A-06、W-02、W-03、W-04、U12-01、U12-02、U12-03、U12-04、U12-05、U12-06、U12-07、U12-08、U12-09、U12-10、U12-11、U12-12</w:t>
+        <w:t>E-06、A-04、A-06、W-02、W-03、W-04、U12-01、U12-02、U12-03、U12-04、U12-05、U12-06、U12-07、U12-08、U12-09、U12-10、U12-11、U12-12</w:t>
       </w:r>
     </w:p>
     <w:sectPr>

</xml_diff>

<commit_message>
Normalize E-06 stage-three research closeout and human review
</commit_message>
<xml_diff>
--- a/human/project-review.docx
+++ b/human/project-review.docx
@@ -2264,6 +2264,49 @@
         <w:pStyle w:val="Heading1"/>
       </w:pPr>
       <w:r>
+        <w:t>E-06 研究关闭</w:t>
+      </w:r>
+    </w:p>
+    <w:p>
+      <w:r>
+        <w:t>E-06仍BLOCKED_EXTERNAL、未领取未签收，真实实例零，研究锁库和揭盲未执行。已明确全部部分活动关闭、策略全组件/实际加载审计、盲态分工和分别授权；软件平衡/封存不冒充研究完成。</w:t>
+      </w:r>
+    </w:p>
+    <w:p>
+      <w:r>
+        <w:t>G-04交独立SAP/预注册、批准、N/停止及策略/构建；B-03交全部实例含部分运行，X-03交全组件加载/真实状态和完整分布/只读重放，A-01/A-02交获准原件重建及分析集规则。现真实交付未齐，不签研究锁库。</w:t>
+      </w:r>
+    </w:p>
+    <w:p>
+      <w:r>
+        <w:t>精确锁库及授权后A-04按含回退部署估计目标分析，U12-08附录，A-06核对实际活动范围。部分运行不能自称NO_STAGE3，预设情绪结果不因PF/SCCI失败隐去，锁后更正留原版和重新授权依据。</w:t>
+      </w:r>
+    </w:p>
+    <w:p>
+      <w:r>
+        <w:t>E06-N01 CLARIFIED_FULL_BLOCK_NO_GO_AND_ACTUAL_SCOPE：完整块计划与尾块/停止分开，NO_GO不能隐去已启动活动；正式裁定仍待G-04</w:t>
+      </w:r>
+    </w:p>
+    <w:p>
+      <w:r>
+        <w:t>E06-N02 FIXED_BALANCE_POLICY_AND_BLINDING_HANDOFF：分配汇总不证明策略/分析资格，全组件与实际加载另审，两原生组不自动盲态，当前入口和手册同步</w:t>
+      </w:r>
+    </w:p>
+    <w:p>
+      <w:r>
+        <w:t>E06-N03 FIXED_LOCK_VS_UNBLIND_AUTHORITY_HANDOFF：会话封存/原件核查/研究锁库/揭盲授权分开，具体对象与真实角色签署不由软件PASS代替</w:t>
+      </w:r>
+    </w:p>
+    <w:p>
+      <w:r>
+        <w:t>E06-N04 OPEN_REAL_BATCHES_POLICY_LOCK_AND_AUTHORIZATION：全部真实实例/QC、策略动态证据、盲态重建/SAP及真实锁库签署/揭盲仍缺</w:t>
+      </w:r>
+    </w:p>
+    <w:p>
+      <w:pPr>
+        <w:pStyle w:val="Heading1"/>
+      </w:pPr>
+      <w:r>
         <w:t>待整理队列</w:t>
       </w:r>
     </w:p>
@@ -2272,7 +2315,7 @@
         <w:keepNext/>
       </w:pPr>
       <w:r>
-        <w:t>已整理53包，待整理18包；根目录双层迁移未完成。下一项E-06。</w:t>
+        <w:t>已整理54包，待整理17包；根目录双层迁移未完成。下一项A-04。</w:t>
       </w:r>
     </w:p>
     <w:p>
@@ -2280,7 +2323,7 @@
         <w:keepLines/>
       </w:pPr>
       <w:r>
-        <w:t>E-06、A-04、A-06、W-02、W-03、W-04、U12-01、U12-02、U12-03、U12-04、U12-05、U12-06、U12-07、U12-08、U12-09、U12-10、U12-11、U12-12</w:t>
+        <w:t>A-04、A-06、W-02、W-03、W-04、U12-01、U12-02、U12-03、U12-04、U12-05、U12-06、U12-07、U12-08、U12-09、U12-10、U12-11、U12-12</w:t>
       </w:r>
     </w:p>
     <w:sectPr>

</xml_diff>

<commit_message>
Normalize A-04 extension analysis and repair ordered-gate consumers
</commit_message>
<xml_diff>
--- a/human/project-review.docx
+++ b/human/project-review.docx
@@ -2307,6 +2307,44 @@
         <w:pStyle w:val="Heading1"/>
       </w:pPr>
       <w:r>
+        <w:t>A-04 最终分析</w:t>
+      </w:r>
+    </w:p>
+    <w:p>
+      <w:r>
+        <w:t>A-04仍BLOCKED_EXTERNAL、未领取未签收；已规范两原生组的策略部署比较、回退原分配、独立统计参数与全部结果出口。旧三重门不再作为报告前置，真实锁库/SAP/分析及独立复现仍缺。</w:t>
+      </w:r>
+    </w:p>
+    <w:p>
+      <w:r>
+        <w:t>E-06交精确锁库及同对象揭盲授权，G-04交独立SAP、分配/停止规则，A-01/A-02交获准六类原件重建、分析集及缺失，X-03交真实策略全组件/状态/分布/回退与无副作用重放。当前未齐。</w:t>
+      </w:r>
+    </w:p>
+    <w:p>
+      <w:r>
+        <w:t>A-05阶段一参数和U12-10核心分类不无合同直接套用；扩展结果交U12-08专门复核、A-06核实全部实际范围，W-02/W-03消费同一结果/图表/输入/代码。未开展扩展不要求A-04 DONE，部分活动不得声称NO_STAGE3。</w:t>
+      </w:r>
+    </w:p>
+    <w:p>
+      <w:r>
+        <w:t>A04-N01 FIXED_CURRENT_SCOPE_AND_MODULE_CONSUMERS：旧三重门与当前验收分开，阶段三部署比较及四段过程进入实际消费者</w:t>
+      </w:r>
+    </w:p>
+    <w:p>
+      <w:r>
+        <w:t>A04-N02 FIXED_TEST_IDENTITY_AND_PACKAGE_SOURCE：测试同名及包源路径实际修复，复测36通过；第二失败原输出丢失已明确</w:t>
+      </w:r>
+    </w:p>
+    <w:p>
+      <w:r>
+        <w:t>A04-N03 OPEN_REAL_LOCK_SAP_ANALYSIS_AND_REPRODUCTION：真实锁库/揭盲、独立SAP、全分析/FDR/图表和独立复跑未取得</w:t>
+      </w:r>
+    </w:p>
+    <w:p>
+      <w:pPr>
+        <w:pStyle w:val="Heading1"/>
+      </w:pPr>
+      <w:r>
         <w:t>待整理队列</w:t>
       </w:r>
     </w:p>
@@ -2315,7 +2353,7 @@
         <w:keepNext/>
       </w:pPr>
       <w:r>
-        <w:t>已整理54包，待整理17包；根目录双层迁移未完成。下一项A-04。</w:t>
+        <w:t>已整理55包，待整理16包；根目录双层迁移未完成。下一项A-06。</w:t>
       </w:r>
     </w:p>
     <w:p>
@@ -2323,7 +2361,7 @@
         <w:keepLines/>
       </w:pPr>
       <w:r>
-        <w:t>A-04、A-06、W-02、W-03、W-04、U12-01、U12-02、U12-03、U12-04、U12-05、U12-06、U12-07、U12-08、U12-09、U12-10、U12-11、U12-12</w:t>
+        <w:t>A-06、W-02、W-03、W-04、U12-01、U12-02、U12-03、U12-04、U12-05、U12-06、U12-07、U12-08、U12-09、U12-10、U12-11、U12-12</w:t>
       </w:r>
     </w:p>
     <w:sectPr>

</xml_diff>

<commit_message>
Normalize A-06 actual research scope closure and repair progress entry
</commit_message>
<xml_diff>
--- a/human/project-review.docx
+++ b/human/project-review.docx
@@ -2345,6 +2345,49 @@
         <w:pStyle w:val="Heading1"/>
       </w:pPr>
       <w:r>
+        <w:t>A-06 研究关闭</w:t>
+      </w:r>
+    </w:p>
+    <w:p>
+      <w:r>
+        <w:t>A-06仍WAIT_DEP，未领取未签收。已规范核心/扩展两路线、三台账真实来源核查、元数据与外层签署的区别及双人责任；真实结果、台账核对和范围回执仍缺。</w:t>
+      </w:r>
+    </w:p>
+    <w:p>
+      <w:r>
+        <w:t>A-05交同版锁定结果和图表，U12-10交真实分类/主张复核；数据保管者交三台账与授权。已有扩展则E-06/A-04/U12-08交全部范围、结果和偏离/停止/回退。当前未齐，不完成范围关闭。</w:t>
+      </w:r>
+    </w:p>
+    <w:p>
+      <w:r>
+        <w:t>W-02仍依赖W-01、A-06、U12-07，单一范围回执不能自动解锁所有写作条件。W-02/W-03用同版主张—结果—图表—输入—代码；W-04/U12-12后续交接，关闭不自动授权采集、投稿或公开受限数据。</w:t>
+      </w:r>
+    </w:p>
+    <w:p>
+      <w:r>
+        <w:t>A06-N01 FIXED_CURRENT_CLOSEOUT_HANDOFF：三台账、部分扩展、双人范围签署及写作前置进入当前消费者</w:t>
+      </w:r>
+    </w:p>
+    <w:p>
+      <w:r>
+        <w:t>A06-N02 FIXED_STALE_NORMALIZATION_ENTRY：规范化入口旧44/71和下一B-01已按当前机器队列订正</w:t>
+      </w:r>
+    </w:p>
+    <w:p>
+      <w:r>
+        <w:t>A06-N03 CLARIFIED_METADATA_VS_REAL_CLOSURE：内层路线ok不验证签署原件，外层另验Git/报告，真实来源与双人身份仍需人核对</w:t>
+      </w:r>
+    </w:p>
+    <w:p>
+      <w:r>
+        <w:t>A06-N04 OPEN_REAL_RESULTS_LEDGERS_AND_DUAL_SIGNATURE：实际分析分类、完整台账来源、具体范围关闭及双人回执未取得</w:t>
+      </w:r>
+    </w:p>
+    <w:p>
+      <w:pPr>
+        <w:pStyle w:val="Heading1"/>
+      </w:pPr>
+      <w:r>
         <w:t>待整理队列</w:t>
       </w:r>
     </w:p>
@@ -2353,7 +2396,7 @@
         <w:keepNext/>
       </w:pPr>
       <w:r>
-        <w:t>已整理55包，待整理16包；根目录双层迁移未完成。下一项A-06。</w:t>
+        <w:t>已整理56包，待整理15包；根目录双层迁移未完成。下一项W-02。</w:t>
       </w:r>
     </w:p>
     <w:p>
@@ -2361,7 +2404,7 @@
         <w:keepLines/>
       </w:pPr>
       <w:r>
-        <w:t>A-06、W-02、W-03、W-04、U12-01、U12-02、U12-03、U12-04、U12-05、U12-06、U12-07、U12-08、U12-09、U12-10、U12-11、U12-12</w:t>
+        <w:t>W-02、W-03、W-04、U12-01、U12-02、U12-03、U12-04、U12-05、U12-06、U12-07、U12-08、U12-09、U12-10、U12-11、U12-12</w:t>
       </w:r>
     </w:p>
     <w:sectPr>

</xml_diff>

<commit_message>
Normalize W-02 manuscript handoff and human review
</commit_message>
<xml_diff>
--- a/human/project-review.docx
+++ b/human/project-review.docx
@@ -2388,6 +2388,44 @@
         <w:pStyle w:val="Heading1"/>
       </w:pPr>
       <w:r>
+        <w:t>W-02 论文写作</w:t>
+      </w:r>
+    </w:p>
+    <w:p>
+      <w:r>
+        <w:t>W-02仍WAIT_DEP，未领取未签收。已将旧有序门结构和主张矩阵实际归档，当前写作以情绪收益、功能代价及设计边界为中心；真实范围、结果和主稿仍缺。</w:t>
+      </w:r>
+    </w:p>
+    <w:p>
+      <w:r>
+        <w:t>A-05交同版锁定结果/图表，A-06交全部活动和范围回执，W-01交全文页段及文献增量，U12-07交当前适用稿，U12-10交真实分类。上述输入仍未齐，不写观测效果或宣布主稿完成。</w:t>
+      </w:r>
+    </w:p>
+    <w:p>
+      <w:r>
+        <w:t>真实主稿及主张—数字—图表—输入—代码、补充材料交W-03；实际扩展须披露，A-04两原生组策略比较不能混作提示比较。当前作者贡献、公开权限和相似性检查待真实负责人，推送不等于投稿。</w:t>
+      </w:r>
+    </w:p>
+    <w:p>
+      <w:r>
+        <w:t>W02-N01 FIXED_ACTUAL_ARCHIVE_AND_CONSUMERS：旧结构和矩阵实际归档，当前PANAS主比较及历史验证消费者对齐</w:t>
+      </w:r>
+    </w:p>
+    <w:p>
+      <w:r>
+        <w:t>W02-N02 OPEN_SIGNED_U1207_REVISION：历史签署稿仍含旧RQ八题和有序门，原件不改，当前修订待完成</w:t>
+      </w:r>
+    </w:p>
+    <w:p>
+      <w:r>
+        <w:t>W02-N03 OPEN_REAL_PAPER_AND_RESPONSIBILITY：真实范围结果主稿全文审查作者责任及相似性检查尚未落实</w:t>
+      </w:r>
+    </w:p>
+    <w:p>
+      <w:pPr>
+        <w:pStyle w:val="Heading1"/>
+      </w:pPr>
+      <w:r>
         <w:t>待整理队列</w:t>
       </w:r>
     </w:p>
@@ -2396,7 +2434,7 @@
         <w:keepNext/>
       </w:pPr>
       <w:r>
-        <w:t>已整理56包，待整理15包；根目录双层迁移未完成。下一项W-02。</w:t>
+        <w:t>已整理57包，待整理14包；根目录双层迁移未完成。下一项W-03。</w:t>
       </w:r>
     </w:p>
     <w:p>
@@ -2404,7 +2442,7 @@
         <w:keepLines/>
       </w:pPr>
       <w:r>
-        <w:t>W-02、W-03、W-04、U12-01、U12-02、U12-03、U12-04、U12-05、U12-06、U12-07、U12-08、U12-09、U12-10、U12-11、U12-12</w:t>
+        <w:t>W-03、W-04、U12-01、U12-02、U12-03、U12-04、U12-05、U12-06、U12-07、U12-08、U12-09、U12-10、U12-11、U12-12</w:t>
       </w:r>
     </w:p>
     <w:sectPr>

</xml_diff>

<commit_message>
Normalize W-03 submission handoff and correct writing responsibility
</commit_message>
<xml_diff>
--- a/human/project-review.docx
+++ b/human/project-review.docx
@@ -2426,6 +2426,49 @@
         <w:pStyle w:val="Heading1"/>
       </w:pPr>
       <w:r>
+        <w:t>W-03 投稿复现</w:t>
+      </w:r>
+    </w:p>
+    <w:p>
+      <w:r>
+        <w:t>W-03仍WAIT_DEP，未领取未签收。旧投稿检查表及第12步两文件实际归档，当前投稿和独立复现交接已规范；期刊专属说明、真实稿件与权限、干净重建和作者授权仍缺。</w:t>
+      </w:r>
+    </w:p>
+    <w:p>
+      <w:r>
+        <w:t>W-02交真人主稿和主张来源，A-06交实际范围，Z-01交匹配制品/完整锁/许可，G-05交实际公开和受限访问批准。合成运行、获准真实分析、设备/画面行为分别留证，缺权限则说明不能复现哪部分。</w:t>
+      </w:r>
+    </w:p>
+    <w:p>
+      <w:r>
+        <w:t>W-04/U12-12接精确制品/稿版、公开范围、实际提交回执和责任人。核心不要求未开展扩展假DONE，已有扩展必须披露；接收和发表只按实际回执，不作可保证的任务结果。</w:t>
+      </w:r>
+    </w:p>
+    <w:p>
+      <w:r>
+        <w:t>W03-N01 FIXED_ARCHIVE_AND_WRITING_HANDOFF：三旧文件实际归档，当前投稿及真人起草职责进入Agent和Word</w:t>
+      </w:r>
+    </w:p>
+    <w:p>
+      <w:r>
+        <w:t>W03-N02 OPEN_IJHCI_SPECIFIC_POLICY：一般政策已读，期刊专属页403及提交当天核验仍待</w:t>
+      </w:r>
+    </w:p>
+    <w:p>
+      <w:r>
+        <w:t>W03-N03 OPEN_REAL_PACKAGE_AND_REPRODUCTION：真实稿件权限、独立干净重建、数字图表和作者授权仍缺</w:t>
+      </w:r>
+    </w:p>
+    <w:p>
+      <w:r>
+        <w:t>W03-N04 OPEN_G05_ACTIVITY_DEPENDENCY：全包关闭与未开展阶段三资格/核心活动准入差异保留待裁定</w:t>
+      </w:r>
+    </w:p>
+    <w:p>
+      <w:pPr>
+        <w:pStyle w:val="Heading1"/>
+      </w:pPr>
+      <w:r>
         <w:t>待整理队列</w:t>
       </w:r>
     </w:p>
@@ -2434,7 +2477,7 @@
         <w:keepNext/>
       </w:pPr>
       <w:r>
-        <w:t>已整理57包，待整理14包；根目录双层迁移未完成。下一项W-03。</w:t>
+        <w:t>已整理58包，待整理13包；根目录双层迁移未完成。下一项W-04。</w:t>
       </w:r>
     </w:p>
     <w:p>
@@ -2442,7 +2485,7 @@
         <w:keepLines/>
       </w:pPr>
       <w:r>
-        <w:t>W-03、W-04、U12-01、U12-02、U12-03、U12-04、U12-05、U12-06、U12-07、U12-08、U12-09、U12-10、U12-11、U12-12</w:t>
+        <w:t>W-04、U12-01、U12-02、U12-03、U12-04、U12-05、U12-06、U12-07、U12-08、U12-09、U12-10、U12-11、U12-12</w:t>
       </w:r>
     </w:p>
     <w:sectPr>

</xml_diff>

<commit_message>
Normalize W-04 handover and human review
</commit_message>
<xml_diff>
--- a/human/project-review.docx
+++ b/human/project-review.docx
@@ -2469,6 +2469,44 @@
         <w:pStyle w:val="Heading1"/>
       </w:pPr>
       <w:r>
+        <w:t>W-04 成果交接</w:t>
+      </w:r>
+    </w:p>
+    <w:p>
+      <w:r>
+        <w:t>W-04仍WAIT_DEP，未领取未签收。已将旧成果/公开方案实际归档，明确八项交付、真实部署与公开决定和新成员演练；最终制品、权属材料及接收证据仍缺。</w:t>
+      </w:r>
+    </w:p>
+    <w:p>
+      <w:r>
+        <w:t>W-03交精确稿版与公开/受限决定，Z-01交匹配候选、锁及许可，U12-12交基于A-06实际结果的部署选择。输入仍缺，不能完成最终交付或默认选获胜产品。</w:t>
+      </w:r>
+    </w:p>
+    <w:p>
+      <w:r>
+        <w:t>接收者实际重建/运行，区分合成、获准真实分析、设备和画面各自范围，留下命令/结果/缺口与维护责任。独立复现已有真实日志可引用，但不能代替新成员实际演练；核心不要求未开展阶段三假DONE。</w:t>
+      </w:r>
+    </w:p>
+    <w:p>
+      <w:r>
+        <w:t>W04-N01 FIXED_ACTUAL_ARCHIVE_AND_HANDOVER：旧公开方案原文归档，八对象及真实部署/公开与接收范围明确</w:t>
+      </w:r>
+    </w:p>
+    <w:p>
+      <w:r>
+        <w:t>W04-N02 OPEN_REAL_PRODUCTS_RIGHTS_AND_RECEIVERS：匹配成品、权属与公开决定、新成员演练和维护责任仍缺</w:t>
+      </w:r>
+    </w:p>
+    <w:p>
+      <w:r>
+        <w:t>W04-N03 OPEN_ROOT_MIGRATION：逐包归档已执行，共享工程媒体治理等业务目录尚未整体迁入双层</w:t>
+      </w:r>
+    </w:p>
+    <w:p>
+      <w:pPr>
+        <w:pStyle w:val="Heading1"/>
+      </w:pPr>
+      <w:r>
         <w:t>待整理队列</w:t>
       </w:r>
     </w:p>
@@ -2477,7 +2515,7 @@
         <w:keepNext/>
       </w:pPr>
       <w:r>
-        <w:t>已整理58包，待整理13包；根目录双层迁移未完成。下一项W-04。</w:t>
+        <w:t>已整理59包，待整理12包；根目录双层迁移未完成。下一项U12-01。</w:t>
       </w:r>
     </w:p>
     <w:p>
@@ -2485,7 +2523,7 @@
         <w:keepLines/>
       </w:pPr>
       <w:r>
-        <w:t>W-04、U12-01、U12-02、U12-03、U12-04、U12-05、U12-06、U12-07、U12-08、U12-09、U12-10、U12-11、U12-12</w:t>
+        <w:t>U12-01、U12-02、U12-03、U12-04、U12-05、U12-06、U12-07、U12-08、U12-09、U12-10、U12-11、U12-12</w:t>
       </w:r>
     </w:p>
     <w:sectPr>

</xml_diff>

<commit_message>
Normalize U12-01 governance and preserve frozen consumers
</commit_message>
<xml_diff>
--- a/human/project-review.docx
+++ b/human/project-review.docx
@@ -2507,6 +2507,49 @@
         <w:pStyle w:val="Heading1"/>
       </w:pPr>
       <w:r>
+        <w:t>U12-01 研究治理</w:t>
+      </w:r>
+    </w:p>
+    <w:p>
+      <w:r>
+        <w:t>U12-01原治理实现保持DONE。旧说明、消费者清单与一次性签收工具已实际归档；两个已签收候选的滞后状态已修正，在研冻结输入仍核对原件。正式运行接线、真实准入和参数冻结未完成。</w:t>
+      </w:r>
+    </w:p>
+    <w:p>
+      <w:r>
+        <w:t>U12-02交步骤测量，U12-03交公平教学，U12-04交新SAP候选，U12-06补六正式入口，U12-09追溯六处旧工作区字节身份，U12-11冻结真实参数。清单false不会自动成为旧程序运行保护。</w:t>
+      </w:r>
+    </w:p>
+    <w:p>
+      <w:r>
+        <w:t>核心A-05→U12-10→A-06→W-02→W-03；实际扩展另需A-04/U12-08及真实活动记录。W-04消费U12-12部署决定；路线元数据PASS仍authorization=false，不代替活动和投稿批准。</w:t>
+      </w:r>
+    </w:p>
+    <w:p>
+      <w:r>
+        <w:t>U1201-N01 FIXED_SCOPED_CONSUMER_STATUS_AND_ARCHIVE：两个已签收候选的滞后状态修正；旧说明、清单和一次性工具实际归档</w:t>
+      </w:r>
+    </w:p>
+    <w:p>
+      <w:r>
+        <w:t>U1201-N02 FIXED_FROZEN_SOURCE_RESOLUTION：两个在研包继续核对原件，当前清单独立消费，未改快照ID</w:t>
+      </w:r>
+    </w:p>
+    <w:p>
+      <w:r>
+        <w:t>U1201-N03 OPEN_REAL_GATES_AND_LEGACY_BYTES：六个正式入口、六处旧字节追溯及真实参数/活动准入仍缺</w:t>
+      </w:r>
+    </w:p>
+    <w:p>
+      <w:r>
+        <w:t>U1201-N04 OPEN_ROOT_MIGRATION：共享治理、工程、资料等业务目录尚未整体迁入human/agent</w:t>
+      </w:r>
+    </w:p>
+    <w:p>
+      <w:pPr>
+        <w:pStyle w:val="Heading1"/>
+      </w:pPr>
+      <w:r>
         <w:t>待整理队列</w:t>
       </w:r>
     </w:p>
@@ -2515,7 +2558,7 @@
         <w:keepNext/>
       </w:pPr>
       <w:r>
-        <w:t>已整理59包，待整理12包；根目录双层迁移未完成。下一项U12-01。</w:t>
+        <w:t>已整理60包，待整理11包；根目录双层迁移未完成。下一项U12-02。</w:t>
       </w:r>
     </w:p>
     <w:p>
@@ -2523,7 +2566,7 @@
         <w:keepLines/>
       </w:pPr>
       <w:r>
-        <w:t>U12-01、U12-02、U12-03、U12-04、U12-05、U12-06、U12-07、U12-08、U12-09、U12-10、U12-11、U12-12</w:t>
+        <w:t>U12-02、U12-03、U12-04、U12-05、U12-06、U12-07、U12-08、U12-09、U12-10、U12-11、U12-12</w:t>
       </w:r>
     </w:p>
     <w:sectPr>

</xml_diff>

<commit_message>
Normalize U12-02 measurement materials and execution
</commit_message>
<xml_diff>
--- a/human/project-review.docx
+++ b/human/project-review.docx
@@ -2550,6 +2550,49 @@
         <w:pStyle w:val="Heading1"/>
       </w:pPr>
       <w:r>
+        <w:t>U12-02 测量实现</w:t>
+      </w:r>
+    </w:p>
+    <w:p>
+      <w:r>
+        <w:t>U12-02保持原限定候选签收DONE。生成器、标注计划与合成材料已实际归入Agent层，F-02/Q-02/E-02消费者已修复；运行测量接口不改，真实片段、独立标注与测量有效性仍未完成。</w:t>
+      </w:r>
+    </w:p>
+    <w:p>
+      <w:r>
+        <w:t>S-02给独立真实标签/原始记录/时钟；U-02/U-07给双条件同事件视频；Q-01/Q-02核验逐题等值、无片段/替代片段和可读性。原生未显示信息时先修订呈现与题库，不从答案反推可读。</w:t>
+      </w:r>
+    </w:p>
+    <w:p>
+      <w:r>
+        <w:t>RESPONDED为0/1；跳过、超时、技术未呈现保留null。U12-04/U12-11冻结分母和缺失分析，U12-09消费来源复算。真实标注人员、规模、阈值与活动许可尚未落实。</w:t>
+      </w:r>
+    </w:p>
+    <w:p>
+      <w:r>
+        <w:t>U1202-N01 FIXED_EXECUTION_AND_MATERIAL_RELOCATION：生成器、标注计划与旧证据实际归入Agent，新输出不覆盖旧签收</w:t>
+      </w:r>
+    </w:p>
+    <w:p>
+      <w:r>
+        <w:t>U1202-N02 FIXED_DOWNSTREAM_CONSUMERS：F-02/Q-02/E-02与测量测试读取新入口，题面/键/输入保持字节一致</w:t>
+      </w:r>
+    </w:p>
+    <w:p>
+      <w:r>
+        <w:t>U1202-N03 OPEN_REAL_ANNOTATION_AND_VALIDITY：真实片段、独立标签、双条件可读等值及测量有效性仍未验证</w:t>
+      </w:r>
+    </w:p>
+    <w:p>
+      <w:r>
+        <w:t>U1202-N04 OPEN_ROOT_MIGRATION：共享运行模块及资料尚未整体迁入双层</w:t>
+      </w:r>
+    </w:p>
+    <w:p>
+      <w:pPr>
+        <w:pStyle w:val="Heading1"/>
+      </w:pPr>
+      <w:r>
         <w:t>待整理队列</w:t>
       </w:r>
     </w:p>
@@ -2558,7 +2601,7 @@
         <w:keepNext/>
       </w:pPr>
       <w:r>
-        <w:t>已整理60包，待整理11包；根目录双层迁移未完成。下一项U12-02。</w:t>
+        <w:t>已整理61包，待整理10包；根目录双层迁移未完成。下一项U12-03。</w:t>
       </w:r>
     </w:p>
     <w:p>
@@ -2566,7 +2609,7 @@
         <w:keepLines/>
       </w:pPr>
       <w:r>
-        <w:t>U12-02、U12-03、U12-04、U12-05、U12-06、U12-07、U12-08、U12-09、U12-10、U12-11、U12-12</w:t>
+        <w:t>U12-03、U12-04、U12-05、U12-06、U12-07、U12-08、U12-09、U12-10、U12-11、U12-12</w:t>
       </w:r>
     </w:p>
     <w:sectPr>

</xml_diff>

<commit_message>
Normalize U12-03 teaching package and preserve review candidate
</commit_message>
<xml_diff>
--- a/human/project-review.docx
+++ b/human/project-review.docx
@@ -2593,6 +2593,49 @@
         <w:pStyle w:val="Heading1"/>
       </w:pPr>
       <w:r>
+        <w:t>U12-03 教学设计</w:t>
+      </w:r>
+    </w:p>
+    <w:p>
+      <w:r>
+        <w:t>U12-03保持IN_REVIEW。教学四文件及工具已归入Agent固定目录，原完整候选与冻结输入保留，五个实际消费者修复；180秒及教学时序仍是候选，真实片段、理解与正式冻结尚未完成。</w:t>
+      </w:r>
+    </w:p>
+    <w:p>
+      <w:r>
+        <w:t>U12-01给主线，R-01给四层，F-05给storm 3/3/3/3、heat 4/6、snow 5/5、fade 2.5/1.5/6；旧天气文字不覆盖步骤合同，独立实际不借目标补值。</w:t>
+      </w:r>
+    </w:p>
+    <w:p>
+      <w:r>
+        <w:t>U-02/U-07/U12-09供同事件配对实片，Q-01/Q-02核验理解/帮助成本；U12-04/U12-11冻结处理估计、预算时序、阈值及回执，U12-06/X-01落实时间记录接线。真实观察未完成。</w:t>
+      </w:r>
+    </w:p>
+    <w:p>
+      <w:r>
+        <w:t>U1203-N01 FIXED_ACTUAL_RELOCATION：原13文件归档，活动材料与工具分离，历史身份不被新生成器覆盖</w:t>
+      </w:r>
+    </w:p>
+    <w:p>
+      <w:r>
+        <w:t>U1203-N02 FIXED_FIVE_CONSUMERS：G-01/E-02/Q-02/R-01/V-01读取新合同，冻结输入保持不变</w:t>
+      </w:r>
+    </w:p>
+    <w:p>
+      <w:r>
+        <w:t>U1203-N03 OPEN_REAL_TRAINING_AND_SIGNOFF：实际语音/片段、理解与活动回执、正式预算时序和真人签署仍缺</w:t>
+      </w:r>
+    </w:p>
+    <w:p>
+      <w:r>
+        <w:t>U1203-N04 OPEN_ROOT_MIGRATION：旧根业务目录尚未整体迁入双层</w:t>
+      </w:r>
+    </w:p>
+    <w:p>
+      <w:pPr>
+        <w:pStyle w:val="Heading1"/>
+      </w:pPr>
+      <w:r>
         <w:t>待整理队列</w:t>
       </w:r>
     </w:p>
@@ -2601,7 +2644,7 @@
         <w:keepNext/>
       </w:pPr>
       <w:r>
-        <w:t>已整理61包，待整理10包；根目录双层迁移未完成。下一项U12-03。</w:t>
+        <w:t>已整理62包，待整理9包；根目录双层迁移未完成。下一项U12-04。</w:t>
       </w:r>
     </w:p>
     <w:p>
@@ -2609,7 +2652,7 @@
         <w:keepLines/>
       </w:pPr>
       <w:r>
-        <w:t>U12-03、U12-04、U12-05、U12-06、U12-07、U12-08、U12-09、U12-10、U12-11、U12-12</w:t>
+        <w:t>U12-04、U12-05、U12-06、U12-07、U12-08、U12-09、U12-10、U12-11、U12-12</w:t>
       </w:r>
     </w:p>
     <w:sectPr>

</xml_diff>

<commit_message>
Normalize U12-04 SAP package and repair active power calculation
</commit_message>
<xml_diff>
--- a/human/project-review.docx
+++ b/human/project-review.docx
@@ -2122,7 +2122,7 @@
     </w:p>
     <w:p>
       <w:r>
-        <w:t>A05-N02 OPEN_CANDIDATE_SAP_WORDING_REVISION：观测集资格与48块表述和实现不同，保留签收原件并登记受控修订</w:t>
+        <w:t>A05-N02 FIXED_ACTIVE_SAP_WORDING_REVIEW_PENDING：活动SAP观测集与48总人数已订正，原签收保留，正式分析与新修订复核仍待完成</w:t>
       </w:r>
     </w:p>
     <w:p>
@@ -2636,6 +2636,54 @@
         <w:pStyle w:val="Heading1"/>
       </w:pPr>
       <w:r>
+        <w:t>U12-04 统计规格</w:t>
+      </w:r>
+    </w:p>
+    <w:p>
+      <w:r>
+        <w:t>U12-04保留原限定候选DONE。实际工具与12原文件已归入Agent层，活动SAP及功效实现纠错、六个消费者修复；新修订不继承原签名，正式缺失分析、样本量和研究冻结仍未完成。</w:t>
+      </w:r>
+    </w:p>
+    <w:p>
+      <w:r>
+        <w:t>A-02负责真实分析集、MI合并/MNAR及敏感性；A-03负责真实计分和盲态校准，U12-11冻结效应/界值/N及15项条件，G-03落实研究准入，A-05正式分析主比较。</w:t>
+      </w:r>
+    </w:p>
+    <w:p>
+      <w:r>
+        <w:t>F-02消费未改的合同，A-04仅复用HC3数学辅助而不继承阶段一SAP；U12-07/U12-10按独立PANAS、功能与操纵分类。原在研输入不刷新，合成两个随机层不代替24序列分配或真实数据。</w:t>
+      </w:r>
+    </w:p>
+    <w:p>
+      <w:r>
+        <w:t>U1204-N01 FIXED_ACTUAL_RELOCATION：12原文件实际归档，活动合同与原签署保留，当前输出和工具分离</w:t>
+      </w:r>
+    </w:p>
+    <w:p>
+      <w:r>
+        <w:t>U1204-N02 FIXED_ACTIVE_SAP_AND_POWER_REVIEW_PENDING：观测/完成集、48总人数、实际拟合自由度、效应标度和排他输出订正，活动复核待完成</w:t>
+      </w:r>
+    </w:p>
+    <w:p>
+      <w:r>
+        <w:t>U1204-N03 PREEXISTING_README_IDENTITY_MISMATCH_PRESERVED：原清单README指纹本轮前已不吻合，8核心交付吻合，原件不覆盖</w:t>
+      </w:r>
+    </w:p>
+    <w:p>
+      <w:r>
+        <w:t>U1204-N04 OPEN_FORMAL_ANALYSIS_AND_FREEZE：正式MI/MNAR、联合功效、真实计分及N/界值和15项条件仍未完成</w:t>
+      </w:r>
+    </w:p>
+    <w:p>
+      <w:r>
+        <w:t>U1204-N05 OPEN_ROOT_MIGRATION：共享模块与旧根业务目录尚未整体迁入双层</w:t>
+      </w:r>
+    </w:p>
+    <w:p>
+      <w:pPr>
+        <w:pStyle w:val="Heading1"/>
+      </w:pPr>
+      <w:r>
         <w:t>待整理队列</w:t>
       </w:r>
     </w:p>
@@ -2644,7 +2692,7 @@
         <w:keepNext/>
       </w:pPr>
       <w:r>
-        <w:t>已整理62包，待整理9包；根目录双层迁移未完成。下一项U12-04。</w:t>
+        <w:t>已整理63包，待整理8包；根目录双层迁移未完成。下一项U12-05。</w:t>
       </w:r>
     </w:p>
     <w:p>
@@ -2652,7 +2700,7 @@
         <w:keepLines/>
       </w:pPr>
       <w:r>
-        <w:t>U12-04、U12-05、U12-06、U12-07、U12-08、U12-09、U12-10、U12-11、U12-12</w:t>
+        <w:t>U12-05、U12-06、U12-07、U12-08、U12-09、U12-10、U12-11、U12-12</w:t>
       </w:r>
     </w:p>
     <w:sectPr>

</xml_diff>

<commit_message>
Normalize U12-05 early activity admission package and human review
</commit_message>
<xml_diff>
--- a/human/project-review.docx
+++ b/human/project-review.docx
@@ -2684,6 +2684,49 @@
         <w:pStyle w:val="Heading1"/>
       </w:pPr>
       <w:r>
+        <w:t>U12-05 外部准入</w:t>
+      </w:r>
+    </w:p>
+    <w:p>
+      <w:r>
+        <w:t>U12-05完成目录与当前范围整理，业务仍WAIT_DEP_EXTERNAL。四份旧候选实际归档，三个消费者连接当前入口；真实批准、角色、同意许可与第二人签收均未完成，软件通过不放行真人活动。</w:t>
+      </w:r>
+    </w:p>
+    <w:p>
+      <w:r>
+        <w:t>G-01供当前研究材料、G-02供隐私和去重规则，U12-01供当前治理。E-01按真实Level A范围执行，E-02另核真实设备与自己的许可，G-05维护其他活动资格与专机。</w:t>
+      </w:r>
+    </w:p>
+    <w:p>
+      <w:r>
+        <w:t>U12-03/U12-06落实首次核心材料暴露起点，不能以未start释放已暴露参与者。Q-01实际15角色人选、Q-02人数冲突及研究冻结仍由对应任务落实，不在本包伪填。</w:t>
+      </w:r>
+    </w:p>
+    <w:p>
+      <w:r>
+        <w:t>U1205-N01 FIXED_ACTUAL_RELOCATION_AND_NAVIGATION：四候选原件实际归档，未注册旧说明订正，原manifest与输入身份保留</w:t>
+      </w:r>
+    </w:p>
+    <w:p>
+      <w:r>
+        <w:t>U1205-N02 FIXED_SCOPED_CONSUMER_HANDOFF：E-01/E-02/G-05连接当前交接，既有接口按活动范围消费，不要求无关整体DONE</w:t>
+      </w:r>
+    </w:p>
+    <w:p>
+      <w:r>
+        <w:t>U1205-N03 OPEN_REAL_APPROVAL_ROLES_AND_ACCEPTANCE：真实批准、同意许可、角色、范围回执与独立/第二人尚未落实，业务WAIT_DEP_EXTERNAL不改</w:t>
+      </w:r>
+    </w:p>
+    <w:p>
+      <w:r>
+        <w:t>U1205-N04 OPEN_ROOT_MIGRATION：共享治理与旧根业务目录仍未整体迁入双层</w:t>
+      </w:r>
+    </w:p>
+    <w:p>
+      <w:pPr>
+        <w:pStyle w:val="Heading1"/>
+      </w:pPr>
+      <w:r>
         <w:t>待整理队列</w:t>
       </w:r>
     </w:p>
@@ -2692,7 +2735,7 @@
         <w:keepNext/>
       </w:pPr>
       <w:r>
-        <w:t>已整理63包，待整理8包；根目录双层迁移未完成。下一项U12-05。</w:t>
+        <w:t>已整理64包，待整理7包；根目录双层迁移未完成。下一项U12-06。</w:t>
       </w:r>
     </w:p>
     <w:p>
@@ -2700,7 +2743,7 @@
         <w:keepLines/>
       </w:pPr>
       <w:r>
-        <w:t>U12-05、U12-06、U12-07、U12-08、U12-09、U12-10、U12-11、U12-12</w:t>
+        <w:t>U12-06、U12-07、U12-08、U12-09、U12-10、U12-11、U12-12</w:t>
       </w:r>
     </w:p>
     <w:sectPr>

</xml_diff>

<commit_message>
Normalize U12-06 runtime admission handoff and preserve claimed inputs
</commit_message>
<xml_diff>
--- a/human/project-review.docx
+++ b/human/project-review.docx
@@ -2727,6 +2727,54 @@
         <w:pStyle w:val="Heading1"/>
       </w:pPr>
       <w:r>
+        <w:t>U12-06 运行准入</w:t>
+      </w:r>
+    </w:p>
+    <w:p>
+      <w:r>
+        <w:t>U12-06由傅钧烨领取且仍IN_PROGRESS。五份旧原文已归档，当前范围与六消费者缺口明确，领取包字节及身份保持；本轮规范化和旧软件复测不等于研究v1.2正式接线完成。</w:t>
+      </w:r>
+    </w:p>
+    <w:p>
+      <w:r>
+        <w:t>P-01/F-05/G-02/P-02供已有底座，U12-01供研究与消费者合同，U12-11供真实数值冻结，G-03供研究准入，I-01供真实完整链。U12-06不能用空模板或合成回执代替这些证据。</w:t>
+      </w:r>
+    </w:p>
+    <w:p>
+      <w:r>
+        <w:t>U12-09核对实际接线覆盖，U12-03与本包统一首核心材料暴露；T-02不得旁路Python权威，A-01/P-02离线重放不得发送控制或重新揭示/登记暴露。当前研究接线仍交领取人完成。</w:t>
+      </w:r>
+    </w:p>
+    <w:p>
+      <w:r>
+        <w:t>U1206-N01 FIXED_ACTUAL_RELOCATION_AND_CURRENT_STATUS：五旧原文实际归档，候选与旧READY核验入口修正，作者核查不继承独立身份</w:t>
+      </w:r>
+    </w:p>
+    <w:p>
+      <w:r>
+        <w:t>U1206-N02 PRESERVED_FROZEN_MEMBER_INPUT：全部领取字节和输入/候选身份保持，原task_input精确迁移后继续核对</w:t>
+      </w:r>
+    </w:p>
+    <w:p>
+      <w:r>
+        <w:t>U1206-N03 OPEN_SIX_RUNTIME_CONSUMERS：六入口研究v1.2接线未验收，旧formal_capable合成适配器不证明真实准入</w:t>
+      </w:r>
+    </w:p>
+    <w:p>
+      <w:r>
+        <w:t>U1206-N04 OPEN_IMPLEMENTATION_REVIEW_AND_SIGNOFF：实际实现候选、独立复核、真实第二人和对应外部研究证据仍缺，IN_PROGRESS不改</w:t>
+      </w:r>
+    </w:p>
+    <w:p>
+      <w:r>
+        <w:t>U1206-N05 OPEN_ROOT_MIGRATION：共享模块与旧根业务目录尚未整体迁入人类/Agent双层</w:t>
+      </w:r>
+    </w:p>
+    <w:p>
+      <w:pPr>
+        <w:pStyle w:val="Heading1"/>
+      </w:pPr>
+      <w:r>
         <w:t>待整理队列</w:t>
       </w:r>
     </w:p>
@@ -2735,7 +2783,7 @@
         <w:keepNext/>
       </w:pPr>
       <w:r>
-        <w:t>已整理64包，待整理7包；根目录双层迁移未完成。下一项U12-06。</w:t>
+        <w:t>已整理65包，待整理6包；根目录双层迁移未完成。下一项U12-07。</w:t>
       </w:r>
     </w:p>
     <w:p>
@@ -2743,7 +2791,7 @@
         <w:keepLines/>
       </w:pPr>
       <w:r>
-        <w:t>U12-06、U12-07、U12-08、U12-09、U12-10、U12-11、U12-12</w:t>
+        <w:t>U12-07、U12-08、U12-09、U12-10、U12-11、U12-12</w:t>
       </w:r>
     </w:p>
     <w:sectPr>

</xml_diff>

<commit_message>
refactor: normalize U12-07 neutral writing specifications and consumers
</commit_message>
<xml_diff>
--- a/human/project-review.docx
+++ b/human/project-review.docx
@@ -1446,7 +1446,7 @@
     </w:p>
     <w:p>
       <w:r>
-        <w:t>W-02依赖W-01|A-06|U12-07；核心写作不等A-04。U12-07旧RQ/句式需要新候选，签名不转移；A-06供实际范围、锁库和主张—结果—图表关联，W-03再消费同一证据。</w:t>
+        <w:t>W-02依赖W-01|A-06|U12-07；核心写作不等A-04。U12-07当前规格已修，待新复核而不转移签名；A-06供实际范围、锁库和主张—结果—图表关联，W-03再消费同一证据。</w:t>
       </w:r>
     </w:p>
     <w:p>
@@ -1471,7 +1471,7 @@
     </w:p>
     <w:p>
       <w:r>
-        <w:t>W01-N04 HANDOFF_U12_07_SIGNED_TEXT_REVISION：已签收U12-07仍含旧RQ/有序门/八题写法，隔离当前权威并需其新候选修订，不改签名</w:t>
+        <w:t>W01-N04 FIXED_CURRENT_U1207_SPECIFICATION_REVIEW_PENDING：U12-07当前方法与表/解释规格已修且原稿归档，新复核签收仍待完成，不改签名</w:t>
       </w:r>
     </w:p>
     <w:p>
@@ -2398,7 +2398,7 @@
     </w:p>
     <w:p>
       <w:r>
-        <w:t>A-05交同版锁定结果/图表，A-06交全部活动和范围回执，W-01交全文页段及文献增量，U12-07交当前适用稿，U12-10交真实分类。上述输入仍未齐，不写观测效果或宣布主稿完成。</w:t>
+        <w:t>A-05交同版锁定结果/图表，A-06交全部活动和范围回执，W-01交全文页段及文献增量，U12-07交当前写作规格而非论文第一稿，U12-10交真实分类。完整输入仍未齐，不写观测效果或宣布主稿完成。</w:t>
       </w:r>
     </w:p>
     <w:p>
@@ -2413,7 +2413,7 @@
     </w:p>
     <w:p>
       <w:r>
-        <w:t>W02-N02 OPEN_SIGNED_U1207_REVISION：历史签署稿仍含旧RQ八题和有序门，原件不改，当前修订待完成</w:t>
+        <w:t>W02-N02 FIXED_CURRENT_U1207_SPECIFICATION_REVIEW_PENDING：旧稿归档、当前方法与11表/规则已修，真实来源测试已改；新复核签收仍缺</w:t>
       </w:r>
     </w:p>
     <w:p>
@@ -2775,6 +2775,54 @@
         <w:pStyle w:val="Heading1"/>
       </w:pPr>
       <w:r>
+        <w:t>U12-07 论文写作</w:t>
+      </w:r>
+    </w:p>
+    <w:p>
+      <w:r>
+        <w:t>U12-07历史三件套保持DONE及原签收范围。当前方法、11空表和两向结果解释规则已按PANAS主比较修订，旧原件实际归档、W-01/W-02真实消费者同步；新规格非论文正文，新复核和真实签收仍待完成。</w:t>
+      </w:r>
+    </w:p>
+    <w:p>
+      <w:r>
+        <w:t>U12-02交真实步骤测量，U12-03教学与时序，U12-04/A-03统计与冻结，U/V/I交实际呈现与完整链。W-01真实全文、A-05同版数字图表和A-06实际范围仍未齐。</w:t>
+      </w:r>
+    </w:p>
+    <w:p>
+      <w:r>
+        <w:t>W-02消费当前三个规格，U12-10消费结果分类规则；真实作者写主稿，W-03核生成式工具政策与真实投稿授权。实际部分扩展仍须披露，不等未开展阶段三。</w:t>
+      </w:r>
+    </w:p>
+    <w:p>
+      <w:r>
+        <w:t>U1207-N01 FIXED_CURRENT_METHOD_TABLES_AND_RULES：旧RQ门序和缺PANAS表由当前方法、11表和两向规则替代，签收原文实际归档</w:t>
+      </w:r>
+    </w:p>
+    <w:p>
+      <w:r>
+        <w:t>U1207-N02 FIXED_ACTUAL_CONSUMERS：W-01/W-02当前入口及W-02历史测试来源修复，关联Word同步</w:t>
+      </w:r>
+    </w:p>
+    <w:p>
+      <w:r>
+        <w:t>U1207-N03 OPEN_NEW_REVIEW_AND_REAL_WRITING：新规格非论文正文，独立/真人新签收、真实主稿/结果/冻结仍缺</w:t>
+      </w:r>
+    </w:p>
+    <w:p>
+      <w:r>
+        <w:t>U1207-N05 PREEXISTING_HASH_POLICY_DESCRIPTION_MISMATCH_PRESERVED：两历史输出无末尾LF且原哈希未补LF，与声明算法不同；原正文及证据保留</w:t>
+      </w:r>
+    </w:p>
+    <w:p>
+      <w:r>
+        <w:t>U1207-N04 OPEN_ROOT_MIGRATION：根共享治理及工程尚未全部迁入双层</w:t>
+      </w:r>
+    </w:p>
+    <w:p>
+      <w:pPr>
+        <w:pStyle w:val="Heading1"/>
+      </w:pPr>
+      <w:r>
         <w:t>待整理队列</w:t>
       </w:r>
     </w:p>
@@ -2783,7 +2831,7 @@
         <w:keepNext/>
       </w:pPr>
       <w:r>
-        <w:t>已整理65包，待整理6包；根目录双层迁移未完成。下一项U12-07。</w:t>
+        <w:t>已整理66包，待整理5包；根目录双层迁移未完成。下一项U12-08。</w:t>
       </w:r>
     </w:p>
     <w:p>
@@ -2791,7 +2839,7 @@
         <w:keepLines/>
       </w:pPr>
       <w:r>
-        <w:t>U12-07、U12-08、U12-09、U12-10、U12-11、U12-12</w:t>
+        <w:t>U12-08、U12-09、U12-10、U12-11、U12-12</w:t>
       </w:r>
     </w:p>
     <w:sectPr>

</xml_diff>

<commit_message>
Normalize U12-08 appendix handoff and human review
</commit_message>
<xml_diff>
--- a/human/project-review.docx
+++ b/human/project-review.docx
@@ -2823,6 +2823,49 @@
         <w:pStyle w:val="Heading1"/>
       </w:pPr>
       <w:r>
+        <w:t>U12-08 扩展分析</w:t>
+      </w:r>
+    </w:p>
+    <w:p>
+      <w:r>
+        <w:t>U12-08仍WAIT_DEP，未领取、未分析、未签收。四旧候选原件实际归档，当前附录与四结果族交接明确；策略冻结归E-05，真实估计归A-04。规范化不等于真实扩展分析或论文附录已完成。</w:t>
+      </w:r>
+    </w:p>
+    <w:p>
+      <w:r>
+        <w:t>E-05提供冻结策略全组件与支持，E-06供全部实例及精确锁库/授权，A-04供独立SAP、真实估计、缺失分析和复现。本包按三活动来源核对分配、暴露与部分运行，不用完成48分配块掩盖停止或退出。</w:t>
+      </w:r>
+    </w:p>
+    <w:p>
+      <w:r>
+        <w:t>U12-08把stage3_results、deviations、stop_records、fallback_exposure交A-06；W-02/W-03消费同一锁定范围。未开展可由真实NO_STAGE3裁定走核心路线，已有活动不能因结果未完成切回未开展；不能估计时说明实际原因，不填虚构零值。</w:t>
+      </w:r>
+    </w:p>
+    <w:p>
+      <w:r>
+        <w:t>U1208-N01 FIXED_ACTUAL_RELOCATION_AND_CURRENT_STATUS：四原候选实际归档，旧未注册入口订正；原字节、manifest与输入ID保持</w:t>
+      </w:r>
+    </w:p>
+    <w:p>
+      <w:r>
+        <w:t>U1208-N02 FIXED_CURRENT_RESPONSIBILITIES_AND_CONSUMERS：独立附录非策略冻结，两影响记录订正，A-04/A-06连接当前附录</w:t>
+      </w:r>
+    </w:p>
+    <w:p>
+      <w:r>
+        <w:t>U1208-N03 OPEN_REAL_INPUTS_APPENDIX_AND_SIGNOFF：真实SAP/锁库/结果/全部活动/附录/独立复现与真人责任签收仍缺，WAIT_DEP保持</w:t>
+      </w:r>
+    </w:p>
+    <w:p>
+      <w:r>
+        <w:t>U1208-N04 OPEN_ROOT_MIGRATION：共享业务与旧根目录尚未整体迁入人类和Agent双层</w:t>
+      </w:r>
+    </w:p>
+    <w:p>
+      <w:pPr>
+        <w:pStyle w:val="Heading1"/>
+      </w:pPr>
+      <w:r>
         <w:t>待整理队列</w:t>
       </w:r>
     </w:p>
@@ -2831,7 +2874,7 @@
         <w:keepNext/>
       </w:pPr>
       <w:r>
-        <w:t>已整理66包，待整理5包；根目录双层迁移未完成。下一项U12-08。</w:t>
+        <w:t>已整理67包，待整理4包；根目录双层迁移未完成。下一项U12-09。</w:t>
       </w:r>
     </w:p>
     <w:p>
@@ -2839,7 +2882,7 @@
         <w:keepLines/>
       </w:pPr>
       <w:r>
-        <w:t>U12-08、U12-09、U12-10、U12-11、U12-12</w:t>
+        <w:t>U12-09、U12-10、U12-11、U12-12</w:t>
       </w:r>
     </w:p>
     <w:sectPr>

</xml_diff>

<commit_message>
Normalize U12-09 upgrade consistency and human review
</commit_message>
<xml_diff>
--- a/human/project-review.docx
+++ b/human/project-review.docx
@@ -2866,6 +2866,54 @@
         <w:pStyle w:val="Heading1"/>
       </w:pPr>
       <w:r>
+        <w:t>U12-09 一致性验收</w:t>
+      </w:r>
+    </w:p>
+    <w:p>
+      <w:r>
+        <w:t>U12-09仍WAIT_DEP、未领取、未签署。四旧候选实际归档，已形成15消费者矩阵、24 DONE影响索引和六条旧字节的有限来源比对；静态路径均存在，但正式研究接线、真实证据与新签收仍缺，不能认定业务一致性验收完成。</w:t>
+      </w:r>
+    </w:p>
+    <w:p>
+      <w:r>
+        <w:t>U12-02交步骤材料和真实标注缺口，U12-03交真实片段及教学冻结，U12-04交当前SAP和正式功效/缺失缺口，U12-06交六实际研究入口。历史签收只覆盖相应候选，正式教学预算/效应阈值/关键错误/N/MNAR仍空。</w:t>
+      </w:r>
+    </w:p>
+    <w:p>
+      <w:r>
+        <w:t>当前覆盖交U12-06接线、U12-11数值、G-03冻结、I-01真实链和Z-01候选交付；旧字节恢复仍需真实匹配原件或有据范围裁定。作者复测不代独立复核/第二人，静态矩阵不解除研究设计或投稿授权。</w:t>
+      </w:r>
+    </w:p>
+    <w:p>
+      <w:r>
+        <w:t>U1209-N01 FIXED_ACTUAL_RELOCATION_AND_CURRENT_ENTRY：四旧候选实际归档，原字节/输入ID保留，旧未注册入口订正</w:t>
+      </w:r>
+    </w:p>
+    <w:p>
+      <w:r>
+        <w:t>U1209-N02 DELIVERED_CURRENT_STATIC_INDICES_NOT_FORMAL_ACCEPTANCE：15消费者与24 DONE影响可重建，真实接线与签收不从路径存在推定</w:t>
+      </w:r>
+    </w:p>
+    <w:p>
+      <w:r>
+        <w:t>U1209-N03 OPEN_SIX_ORIGINAL_WORKTREE_BYTE_IDENTITIES：六引用四源Git身份匹配，但检查的可访问来源未匹配旧声明字节，原binding不改</w:t>
+      </w:r>
+    </w:p>
+    <w:p>
+      <w:r>
+        <w:t>U1209-N04 OPEN_REAL_CONSISTENCY_REVIEW_AND_SIGNOFF：真实测量/教学/统计冻结/运行接线与独立及真人签收仍缺，业务WAIT_DEP保持</w:t>
+      </w:r>
+    </w:p>
+    <w:p>
+      <w:r>
+        <w:t>U1209-N05 OPEN_ROOT_MIGRATION：旧根业务与共享模块未整体迁入双层</w:t>
+      </w:r>
+    </w:p>
+    <w:p>
+      <w:pPr>
+        <w:pStyle w:val="Heading1"/>
+      </w:pPr>
+      <w:r>
         <w:t>待整理队列</w:t>
       </w:r>
     </w:p>
@@ -2874,7 +2922,7 @@
         <w:keepNext/>
       </w:pPr>
       <w:r>
-        <w:t>已整理67包，待整理4包；根目录双层迁移未完成。下一项U12-09。</w:t>
+        <w:t>已整理68包，待整理3包；根目录双层迁移未完成。下一项U12-10。</w:t>
       </w:r>
     </w:p>
     <w:p>
@@ -2882,7 +2930,7 @@
         <w:keepLines/>
       </w:pPr>
       <w:r>
-        <w:t>U12-09、U12-10、U12-11、U12-12</w:t>
+        <w:t>U12-10、U12-11、U12-12</w:t>
       </w:r>
     </w:p>
     <w:sectPr>

</xml_diff>

<commit_message>
Normalize U12-10 result classification and repair candidate CLI
</commit_message>
<xml_diff>
--- a/human/project-review.docx
+++ b/human/project-review.docx
@@ -2914,6 +2914,54 @@
         <w:pStyle w:val="Heading1"/>
       </w:pPr>
       <w:r>
+        <w:t>U12-10 结果复核</w:t>
+      </w:r>
+    </w:p>
+    <w:p>
+      <w:r>
+        <w:t>U12-10仍WAIT_DEP、未领取未签署。四旧候选实际归档，复用外部分类算法并修Python3.14帮助文字启动报错；15合成案例和主张规则已交付，但A-05真实结果、正式阈值、独立复核及第二人签收仍缺，不认定正式分类完成。</w:t>
+      </w:r>
+    </w:p>
+    <w:p>
+      <w:r>
+        <w:t>A-05交真实锁库/SAP关联和完整主结果，U12-11/G-03交事前阈值和冻结，U12-07交中立解释规格。当前空报告及候选分类工具各自标注，不靠软件标签证明来源有效。</w:t>
+      </w:r>
+    </w:p>
+    <w:p>
+      <w:r>
+        <w:t>真实分轴分类与允许主张交A-06关闭范围、W-02/W-03写作复现；情绪收益、功能代价和设计边界并列，正反结果均可报告。可选阶段三有独立估计目标，不能混入阶段一提示比较。</w:t>
+      </w:r>
+    </w:p>
+    <w:p>
+      <w:r>
+        <w:t>U1210-N01 FIXED_ACTUAL_ARCHIVE_AND_CURRENT_ENTRY：四候选实际归档，原输入ID/三文件字节保留，未注册旧入口订正</w:t>
+      </w:r>
+    </w:p>
+    <w:p>
+      <w:r>
+        <w:t>U1210-N02 FIXED_PYTHON314_CLI_HELP_AND_RETESTED：两处裸百分号帮助文字导致CLI启动错误，原件/初始失败保留，算法不改且实际CLI复测</w:t>
+      </w:r>
+    </w:p>
+    <w:p>
+      <w:r>
+        <w:t>U1210-N03 DELIVERED_SYNTHETIC_CLASSIFIER_NOT_FORMAL_REVIEW：15合成案例和主张规则可重跑，A-05候选可用性订正，不填真实结果</w:t>
+      </w:r>
+    </w:p>
+    <w:p>
+      <w:r>
+        <w:t>U1210-N04 OPEN_REAL_RESULTS_FROZEN_RULES_AND_SIGNOFF：正式结果/SAP/阈值、独立复算和真实第二人未交付，WAIT_DEP保持</w:t>
+      </w:r>
+    </w:p>
+    <w:p>
+      <w:r>
+        <w:t>U1210-N05 OPEN_ROOT_MIGRATION：旧根业务与共享模块尚未整体迁入双层</w:t>
+      </w:r>
+    </w:p>
+    <w:p>
+      <w:pPr>
+        <w:pStyle w:val="Heading1"/>
+      </w:pPr>
+      <w:r>
         <w:t>待整理队列</w:t>
       </w:r>
     </w:p>
@@ -2922,7 +2970,7 @@
         <w:keepNext/>
       </w:pPr>
       <w:r>
-        <w:t>已整理68包，待整理3包；根目录双层迁移未完成。下一项U12-10。</w:t>
+        <w:t>已整理69包，待整理2包；根目录双层迁移未完成。下一项U12-11。</w:t>
       </w:r>
     </w:p>
     <w:p>
@@ -2930,7 +2978,7 @@
         <w:keepLines/>
       </w:pPr>
       <w:r>
-        <w:t>U12-10、U12-11、U12-12</w:t>
+        <w:t>U12-11、U12-12</w:t>
       </w:r>
     </w:p>
     <w:sectPr>

</xml_diff>

<commit_message>
Normalize U12-11 research parameter and resource freeze handoff
</commit_message>
<xml_diff>
--- a/human/project-review.docx
+++ b/human/project-review.docx
@@ -2962,6 +2962,54 @@
         <w:pStyle w:val="Heading1"/>
       </w:pPr>
       <w:r>
+        <w:t>U12-11 研究冻结</w:t>
+      </w:r>
+    </w:p>
+    <w:p>
+      <w:r>
+        <w:t>U12-11仍WAIT_DEP_EXTERNAL、未领取未签署。四原候选实际归档，15项冻结材料与当前空索引已对齐，G-03交接订正；真实盲态校准、参数、机构/资源回执和第二人仍缺，本轮不冻结N或界值，不放行正式研究。</w:t>
+      </w:r>
+    </w:p>
+    <w:p>
+      <w:r>
+        <w:t>E-03交真实Level C技术关闭，A-03-CAL交盲态版本和证据，U12-09交真实一致性，G-05交对应批准/专机/期限/工位回执。数值裁定需真实统计与研究责任人，教学时序和首次教学暴露由U12-03/X-01/P-01/U12-06落实。</w:t>
+      </w:r>
+    </w:p>
+    <w:p>
+      <w:r>
+        <w:t>同版冻结交G-03预注册、B-02运行和A-05/U12-10分析规则；800秒仅核心，资源还需安装/QC/量表/教学/清理和实际排班。有效PANAS不因PF/SCCI失败隐去，等效默认关闭，可选扩展独立处理。</w:t>
+      </w:r>
+    </w:p>
+    <w:p>
+      <w:r>
+        <w:t>U1211-N01 FIXED_ORIGINAL_ARCHIVE_AND_CURRENT_ENTRY：四旧候选实际归档，原字节/输入ID保留，旧未注册入口改活动导航</w:t>
+      </w:r>
+    </w:p>
+    <w:p>
+      <w:r>
+        <w:t>U1211-N02 DELIVERED_FIFTEEN_ITEM_HANDOFF_NOT_APPROVAL：15项材料与G-03既有空索引对齐，不建批准台账、不冻结候选数值</w:t>
+      </w:r>
+    </w:p>
+    <w:p>
+      <w:r>
+        <w:t>U1211-N03 FIXED_NAVIGATION_AND_RETESTED：TASK映射漏outputs前缀已修，失败日志保留，G-03消费当前交接</w:t>
+      </w:r>
+    </w:p>
+    <w:p>
+      <w:r>
+        <w:t>U1211-N04 OPEN_REAL_CAL_PARAMETERS_RESOURCES_AND_SIGNOFF：真实CAL/N/界值/规则、机构和资源、独立第二人未交付；整体与活动资格冲突待裁定</w:t>
+      </w:r>
+    </w:p>
+    <w:p>
+      <w:r>
+        <w:t>U1211-N05 OPEN_ROOT_MIGRATION：旧根业务与共享模块尚未整体迁入双层</w:t>
+      </w:r>
+    </w:p>
+    <w:p>
+      <w:pPr>
+        <w:pStyle w:val="Heading1"/>
+      </w:pPr>
+      <w:r>
         <w:t>待整理队列</w:t>
       </w:r>
     </w:p>
@@ -2970,7 +3018,7 @@
         <w:keepNext/>
       </w:pPr>
       <w:r>
-        <w:t>已整理69包，待整理2包；根目录双层迁移未完成。下一项U12-11。</w:t>
+        <w:t>已整理70包，待整理1包；根目录双层迁移未完成。下一项U12-12。</w:t>
       </w:r>
     </w:p>
     <w:p>
@@ -2978,7 +3026,7 @@
         <w:keepLines/>
       </w:pPr>
       <w:r>
-        <w:t>U12-11、U12-12</w:t>
+        <w:t>U12-12</w:t>
       </w:r>
     </w:p>
     <w:sectPr>

</xml_diff>

<commit_message>
Normalize U12-12 deployment and publication handoff
</commit_message>
<xml_diff>
--- a/human/project-review.docx
+++ b/human/project-review.docx
@@ -3010,6 +3010,54 @@
         <w:pStyle w:val="Heading1"/>
       </w:pPr>
       <w:r>
+        <w:t>U12-12 成果交接</w:t>
+      </w:r>
+    </w:p>
+    <w:p>
+      <w:r>
+        <w:t>U12-12仍WAIT_DEP_EXTERNAL、未领取未签署。四原候选实际归档，方案选择与逐对象公开工作表、现状核查和W-04入口已对齐；真实结果、范围关闭、作者及权利人批准和最终成品尚缺。本轮没有选择获胜方案，也没有批准公开。</w:t>
+      </w:r>
+    </w:p>
+    <w:p>
+      <w:r>
+        <w:t>A-06交真实范围和全部实际活动，A-05/U12-10交真实比较，W-03交同版主稿、作者与公开权限，Z-01交匹配成品和独立干净重建；权利人和机构确认素材、SDK、量表及数据的实际许可。</w:t>
+      </w:r>
+    </w:p>
+    <w:p>
+      <w:r>
+        <w:t>U12-12交同版选择理由、未选原因、逐对象范围与批准给W-04，W-04实际打包、接收演练及维护。Unity完整体验独立于TD；V-04预演不替代最终旅程或真实链。有效预设情绪结果不因功能失败隐去，等效默认不开启。</w:t>
+      </w:r>
+    </w:p>
+    <w:p>
+      <w:r>
+        <w:t>U1212-N01 FIXED_ORIGINAL_ARCHIVE_AND_CURRENT_ENTRY：四原候选实际归档，原字节及snapshot保持，旧入口改当前导航</w:t>
+      </w:r>
+    </w:p>
+    <w:p>
+      <w:r>
+        <w:t>U1212-N02 DELIVERED_HANDOFF_NOT_PRODUCT_OR_PUBLIC_APPROVAL：三方案八维与十二对象工作表对齐W-04八对象，未默认胜者或批准公开</w:t>
+      </w:r>
+    </w:p>
+    <w:p>
+      <w:r>
+        <w:t>U1212-N03 FIXED_LINKS_AND_RETESTED：TASK工作表前缀修正，W-04消费活动入口，专项检查通过</w:t>
+      </w:r>
+    </w:p>
+    <w:p>
+      <w:r>
+        <w:t>U1212-N04 OPEN_REAL_RESULTS_APPROVAL_ARTIFACTS_AND_SIGNOFF：真实决定、权属及作者批准、匹配成品和真实接收签署仍缺</w:t>
+      </w:r>
+    </w:p>
+    <w:p>
+      <w:r>
+        <w:t>U1212-N05 OPEN_ROOT_MIGRATION：逐包71/71不替代旧业务目录整体迁移和运行验证</w:t>
+      </w:r>
+    </w:p>
+    <w:p>
+      <w:pPr>
+        <w:pStyle w:val="Heading1"/>
+      </w:pPr>
+      <w:r>
         <w:t>待整理队列</w:t>
       </w:r>
     </w:p>
@@ -3018,16 +3066,13 @@
         <w:keepNext/>
       </w:pPr>
       <w:r>
-        <w:t>已整理70包，待整理1包；根目录双层迁移未完成。下一项U12-12。</w:t>
+        <w:t>已整理71包，待整理0包；根目录双层迁移未完成。下一项目录整体迁移。</w:t>
       </w:r>
     </w:p>
     <w:p>
       <w:pPr>
         <w:keepLines/>
       </w:pPr>
-      <w:r>
-        <w:t>U12-12</w:t>
-      </w:r>
     </w:p>
     <w:sectPr>
       <w:footerReference w:type="default" r:id="rId9"/>

</xml_diff>

<commit_message>
Move project overviews and retire legacy root runbooks
</commit_message>
<xml_diff>
--- a/human/project-review.docx
+++ b/human/project-review.docx
@@ -3071,8 +3071,41 @@
     </w:p>
     <w:p>
       <w:pPr>
-        <w:keepLines/>
+        <w:pStyle w:val="Heading1"/>
       </w:pPr>
+      <w:r>
+        <w:t>根目录物理迁移</w:t>
+      </w:r>
+    </w:p>
+    <w:p>
+      <w:r>
+        <w:t>实际迁移4/19项，尚余15项；整体迁移未完成。逐包整理不代替运行入口、生成器、历史原件及当前Word来源检查。</w:t>
+      </w:r>
+    </w:p>
+    <w:p>
+      <w:r>
+        <w:t>work → agent/work</w:t>
+      </w:r>
+    </w:p>
+    <w:p>
+      <w:r>
+        <w:t>PROJECT_FRAMEWORK.md → agent/archive/project/PROJECT_FRAMEWORK.md</w:t>
+      </w:r>
+    </w:p>
+    <w:p>
+      <w:r>
+        <w:t>PROJECT_MODULES.md → human/project/PROJECT_MODULES.md</w:t>
+      </w:r>
+    </w:p>
+    <w:p>
+      <w:r>
+        <w:t>README_run.md → agent/archive/runtime/README_run.md</w:t>
+      </w:r>
+    </w:p>
+    <w:p>
+      <w:r>
+        <w:t>旧框架及Mock/Spout手册已原样归档，当前人类概览位于human/project/README.md，运行入口位于agent/runtime/README.md。业务签署和进行中分发不因迁移而改变。</w:t>
+      </w:r>
     </w:p>
     <w:sectPr>
       <w:footerReference w:type="default" r:id="rId9"/>

</xml_diff>

<commit_message>
Move governance tools and refresh human delivery artifacts
</commit_message>
<xml_diff>
--- a/human/project-review.docx
+++ b/human/project-review.docx
@@ -3079,22 +3079,22 @@
     </w:p>
     <w:p>
       <w:r>
-        <w:t>实际迁移4/19项，尚余15项；整体迁移未完成。逐包整理不代替运行入口、生成器、历史原件及当前Word来源检查。</w:t>
-      </w:r>
-    </w:p>
-    <w:p>
-      <w:r>
-        <w:t>work → agent/work</w:t>
-      </w:r>
-    </w:p>
-    <w:p>
-      <w:r>
-        <w:t>PROJECT_FRAMEWORK.md → agent/archive/project/PROJECT_FRAMEWORK.md</w:t>
-      </w:r>
-    </w:p>
-    <w:p>
-      <w:r>
-        <w:t>PROJECT_MODULES.md → human/project/PROJECT_MODULES.md</w:t>
+        <w:t>实际迁移7/19项，尚余12项；整体迁移未完成。逐包整理不代替运行入口、生成器、历史原件及当前Word来源检查。</w:t>
+      </w:r>
+    </w:p>
+    <w:p>
+      <w:r>
+        <w:t>work → agent/work；Tools → agent/tools/governance</w:t>
+      </w:r>
+    </w:p>
+    <w:p>
+      <w:r>
+        <w:t>assets → human/assets；output → human/deliverables</w:t>
+      </w:r>
+    </w:p>
+    <w:p>
+      <w:r>
+        <w:t>PROJECT_FRAMEWORK.md → agent/archive/project/PROJECT_FRAMEWORK.md；PROJECT_MODULES.md → human/project/PROJECT_MODULES.md</w:t>
       </w:r>
     </w:p>
     <w:p>
@@ -3105,6 +3105,11 @@
     <w:p>
       <w:r>
         <w:t>旧框架及Mock/Spout手册已原样归档，当前人类概览位于human/project/README.md，运行入口位于agent/runtime/README.md。业务签署和进行中分发不因迁移而改变。</w:t>
+      </w:r>
+    </w:p>
+    <w:p>
+      <w:r>
+        <w:t>治理工具和首页SVG已实际迁入双层；旧任务PDF的DONE=22与当前24不符，旧目标/流程PDF仍含退役机制，均已归档。当前六页任务概要由同版Markdown重建并核对注册表，不是参与者研究结果。</w:t>
       </w:r>
     </w:p>
     <w:sectPr>

</xml_diff>

<commit_message>
Move delivery sources into Agent layer and repair actual PDF build
</commit_message>
<xml_diff>
--- a/human/project-review.docx
+++ b/human/project-review.docx
@@ -3072,6 +3072,7 @@
     <w:p>
       <w:pPr>
         <w:pStyle w:val="Heading1"/>
+        <w:pageBreakBefore/>
       </w:pPr>
       <w:r>
         <w:t>根目录物理迁移</w:t>
@@ -3079,27 +3080,27 @@
     </w:p>
     <w:p>
       <w:r>
-        <w:t>实际迁移7/19项，尚余12项；整体迁移未完成。逐包整理不代替运行入口、生成器、历史原件及当前Word来源检查。</w:t>
-      </w:r>
-    </w:p>
-    <w:p>
-      <w:r>
-        <w:t>work → agent/work；Tools → agent/tools/governance</w:t>
-      </w:r>
-    </w:p>
-    <w:p>
-      <w:r>
-        <w:t>assets → human/assets；output → human/deliverables</w:t>
-      </w:r>
-    </w:p>
-    <w:p>
-      <w:r>
-        <w:t>PROJECT_FRAMEWORK.md → agent/archive/project/PROJECT_FRAMEWORK.md；PROJECT_MODULES.md → human/project/PROJECT_MODULES.md</w:t>
-      </w:r>
-    </w:p>
-    <w:p>
-      <w:r>
-        <w:t>README_run.md → agent/archive/runtime/README_run.md</w:t>
+        <w:t>实际迁移8/19项，尚余11项；整体迁移未完成。逐包整理不代替运行入口、生成器、历史原件及当前Word来源检查。</w:t>
+      </w:r>
+    </w:p>
+    <w:p>
+      <w:r>
+        <w:t>work → agent/work；04-成果与交付 → agent/delivery</w:t>
+      </w:r>
+    </w:p>
+    <w:p>
+      <w:r>
+        <w:t>Tools → agent/tools/governance；assets → human/assets</w:t>
+      </w:r>
+    </w:p>
+    <w:p>
+      <w:r>
+        <w:t>output → human/deliverables；PROJECT_FRAMEWORK.md → agent/archive/project/PROJECT_FRAMEWORK.md</w:t>
+      </w:r>
+    </w:p>
+    <w:p>
+      <w:r>
+        <w:t>PROJECT_MODULES.md → human/project/PROJECT_MODULES.md；README_run.md → agent/archive/runtime/README_run.md</w:t>
       </w:r>
     </w:p>
     <w:p>
@@ -3110,6 +3111,11 @@
     <w:p>
       <w:r>
         <w:t>治理工具和首页SVG已实际迁入双层；旧任务PDF的DONE=22与当前24不符，旧目标/流程PDF仍含退役机制，均已归档。当前六页任务概要由同版Markdown重建并核对注册表，不是参与者研究结果。</w:t>
+      </w:r>
+    </w:p>
+    <w:p>
+      <w:r>
+        <w:t>成果构建源码已实际迁入agent/delivery/briefs，两张团队SVG/PNG进入human/assets/diagrams。旧Unity压缩包仅保留为本机历史来源；当前构建和图生成器已改为双层目标。</w:t>
       </w:r>
     </w:p>
     <w:sectPr>

</xml_diff>

<commit_message>
Normalize governance root and repair task consumers
</commit_message>
<xml_diff>
--- a/human/project-review.docx
+++ b/human/project-review.docx
@@ -3080,27 +3080,32 @@
     </w:p>
     <w:p>
       <w:r>
-        <w:t>实际迁移8/19项，尚余11项；整体迁移未完成。逐包整理不代替运行入口、生成器、历史原件及当前Word来源检查。</w:t>
-      </w:r>
-    </w:p>
-    <w:p>
-      <w:r>
-        <w:t>work → agent/work；04-成果与交付 → agent/delivery</w:t>
-      </w:r>
-    </w:p>
-    <w:p>
-      <w:r>
-        <w:t>Tools → agent/tools/governance；assets → human/assets</w:t>
-      </w:r>
-    </w:p>
-    <w:p>
-      <w:r>
-        <w:t>output → human/deliverables；PROJECT_FRAMEWORK.md → agent/archive/project/PROJECT_FRAMEWORK.md</w:t>
-      </w:r>
-    </w:p>
-    <w:p>
-      <w:r>
-        <w:t>PROJECT_MODULES.md → human/project/PROJECT_MODULES.md；README_run.md → agent/archive/runtime/README_run.md</w:t>
+        <w:t>实际迁移9/19项，尚余10项；整体迁移未完成。逐包整理不代替运行入口、生成器、历史原件及当前Word来源检查。</w:t>
+      </w:r>
+    </w:p>
+    <w:p>
+      <w:r>
+        <w:t>work → agent/work；00-项目管理 → agent/governance</w:t>
+      </w:r>
+    </w:p>
+    <w:p>
+      <w:r>
+        <w:t>04-成果与交付 → agent/delivery；Tools → agent/tools/governance</w:t>
+      </w:r>
+    </w:p>
+    <w:p>
+      <w:r>
+        <w:t>assets → human/assets；output → human/deliverables</w:t>
+      </w:r>
+    </w:p>
+    <w:p>
+      <w:r>
+        <w:t>PROJECT_FRAMEWORK.md → agent/archive/project/PROJECT_FRAMEWORK.md；PROJECT_MODULES.md → human/project/PROJECT_MODULES.md</w:t>
+      </w:r>
+    </w:p>
+    <w:p>
+      <w:r>
+        <w:t>README_run.md → agent/archive/runtime/README_run.md</w:t>
       </w:r>
     </w:p>
     <w:p>
@@ -3116,6 +3121,11 @@
     <w:p>
       <w:r>
         <w:t>成果构建源码已实际迁入agent/delivery/briefs，两张团队SVG/PNG进入human/assets/diagrams。旧Unity压缩包仅保留为本机历史来源；当前构建和图生成器已改为双层目标。</w:t>
+      </w:r>
+    </w:p>
+    <w:p>
+      <w:r>
+        <w:t>治理权威已实际迁入agent/governance。813个原文件中750个字节未变，其余为当前读取器或导航修正；历史签署、五个分发包与外部来源原件未改。60个有测试入口的任务包全部通过，根回归635项通过；71包、330个Word来源链接和5分发61快照校验通过。15份Word仅修正24个来源链接，正文和其余内部文件未改。业务状态与正式研究资格不变。</w:t>
       </w:r>
     </w:p>
     <w:sectPr>

</xml_diff>

<commit_message>
Move design validation and references into Agent layer
</commit_message>
<xml_diff>
--- a/human/project-review.docx
+++ b/human/project-review.docx
@@ -3080,7 +3080,7 @@
     </w:p>
     <w:p>
       <w:r>
-        <w:t>实际迁移9/19项，尚余10项；整体迁移未完成。逐包整理不代替运行入口、生成器、历史原件及当前Word来源检查。</w:t>
+        <w:t>实际迁移12/19项，尚余7项；整体迁移未完成。逐包整理不代替运行入口、生成器、历史原件及当前Word来源检查。</w:t>
       </w:r>
     </w:p>
     <w:p>
@@ -3090,22 +3090,27 @@
     </w:p>
     <w:p>
       <w:r>
-        <w:t>04-成果与交付 → agent/delivery；Tools → agent/tools/governance</w:t>
-      </w:r>
-    </w:p>
-    <w:p>
-      <w:r>
-        <w:t>assets → human/assets；output → human/deliverables</w:t>
-      </w:r>
-    </w:p>
-    <w:p>
-      <w:r>
-        <w:t>PROJECT_FRAMEWORK.md → agent/archive/project/PROJECT_FRAMEWORK.md；PROJECT_MODULES.md → human/project/PROJECT_MODULES.md</w:t>
-      </w:r>
-    </w:p>
-    <w:p>
-      <w:r>
-        <w:t>README_run.md → agent/archive/runtime/README_run.md</w:t>
+        <w:t>01-需求与设计 → agent/design；03-测试与实验 → agent/validation</w:t>
+      </w:r>
+    </w:p>
+    <w:p>
+      <w:r>
+        <w:t>04-成果与交付 → agent/delivery；srp参考文献 → agent/references</w:t>
+      </w:r>
+    </w:p>
+    <w:p>
+      <w:r>
+        <w:t>Tools → agent/tools/governance；assets → human/assets</w:t>
+      </w:r>
+    </w:p>
+    <w:p>
+      <w:r>
+        <w:t>output → human/deliverables；PROJECT_FRAMEWORK.md → agent/archive/project/PROJECT_FRAMEWORK.md</w:t>
+      </w:r>
+    </w:p>
+    <w:p>
+      <w:r>
+        <w:t>PROJECT_MODULES.md → human/project/PROJECT_MODULES.md；README_run.md → agent/archive/runtime/README_run.md</w:t>
       </w:r>
     </w:p>
     <w:p>
@@ -3126,6 +3131,11 @@
     <w:p>
       <w:r>
         <w:t>治理权威已实际迁入agent/governance。813个原文件中750个字节未变，其余为当前读取器或导航修正；历史签署、五个分发包与外部来源原件未改。60个有测试入口的任务包全部通过，根回归635项通过；71包、330个Word来源链接和5分发61快照校验通过。15份Word仅修正24个来源链接，正文和其余内部文件未改。业务状态与正式研究资格不变。</w:t>
+      </w:r>
+    </w:p>
+    <w:p>
+      <w:r>
+        <w:t>设计来源、验证原件和参考文献已实际迁入Agent层。297个已跟踪原文件中295个字节未变，两份当前导航修正；5份Word仅改来源链接。历史签署与冻结分发保持原件。文献库仍隔离：库存106条、实际101份PDF，缺少来源字段等问题未解除；目录迁移不产生新的论文证据。</w:t>
       </w:r>
     </w:p>
     <w:sectPr>

</xml_diff>

<commit_message>
refactor: relocate shared runtime modules into Agent layer
</commit_message>
<xml_diff>
--- a/human/project-review.docx
+++ b/human/project-review.docx
@@ -3080,7 +3080,7 @@
     </w:p>
     <w:p>
       <w:r>
-        <w:t>实际迁移12/19项，尚余7项；整体迁移未完成。逐包整理不代替运行入口、生成器、历史原件及当前Word来源检查。</w:t>
+        <w:t>实际迁移13/19项，尚余6项；整体迁移未完成。逐包整理不代替运行入口、生成器、历史原件及当前Word来源检查。</w:t>
       </w:r>
     </w:p>
     <w:p>
@@ -3090,27 +3090,32 @@
     </w:p>
     <w:p>
       <w:r>
-        <w:t>01-需求与设计 → agent/design；03-测试与实验 → agent/validation</w:t>
-      </w:r>
-    </w:p>
-    <w:p>
-      <w:r>
-        <w:t>04-成果与交付 → agent/delivery；srp参考文献 → agent/references</w:t>
-      </w:r>
-    </w:p>
-    <w:p>
-      <w:r>
-        <w:t>Tools → agent/tools/governance；assets → human/assets</w:t>
-      </w:r>
-    </w:p>
-    <w:p>
-      <w:r>
-        <w:t>output → human/deliverables；PROJECT_FRAMEWORK.md → agent/archive/project/PROJECT_FRAMEWORK.md</w:t>
-      </w:r>
-    </w:p>
-    <w:p>
-      <w:r>
-        <w:t>PROJECT_MODULES.md → human/project/PROJECT_MODULES.md；README_run.md → agent/archive/runtime/README_run.md</w:t>
+        <w:t>01-需求与设计 → agent/design；02-技术研发 → agent/modules</w:t>
+      </w:r>
+    </w:p>
+    <w:p>
+      <w:r>
+        <w:t>03-测试与实验 → agent/validation；04-成果与交付 → agent/delivery</w:t>
+      </w:r>
+    </w:p>
+    <w:p>
+      <w:r>
+        <w:t>srp参考文献 → agent/references；Tools → agent/tools/governance</w:t>
+      </w:r>
+    </w:p>
+    <w:p>
+      <w:r>
+        <w:t>assets → human/assets；output → human/deliverables</w:t>
+      </w:r>
+    </w:p>
+    <w:p>
+      <w:r>
+        <w:t>PROJECT_FRAMEWORK.md → agent/archive/project/PROJECT_FRAMEWORK.md；PROJECT_MODULES.md → human/project/PROJECT_MODULES.md</w:t>
+      </w:r>
+    </w:p>
+    <w:p>
+      <w:r>
+        <w:t>README_run.md → agent/archive/runtime/README_run.md</w:t>
       </w:r>
     </w:p>
     <w:p>
@@ -3136,6 +3141,11 @@
     <w:p>
       <w:r>
         <w:t>设计来源、验证原件和参考文献已实际迁入Agent层。297个已跟踪原文件中295个字节未变，两份当前导航修正；5份Word仅改来源链接。历史签署与冻结分发保持原件。文献库仍隔离：库存106条、实际101份PDF，缺少来源字段等问题未解除；目录迁移不产生新的论文证据。</w:t>
+      </w:r>
+    </w:p>
+    <w:p>
+      <w:r>
+        <w:t>共享Python、Unity和TD工程已实际迁入agent/modules，修正仓库定位、测试与启动路径。根Python635项、Unity EditMode105项及PlayMode4项通过；TD2025.32820隔离重开12项与UDP恢复8项通过。889个原文件与23个分发输入引用留存原始身份，签署和冻结快照不改写；当前文档链接随迁移修正。实际设备链、正式准入和研究结果仍不在本次验证范围。</w:t>
       </w:r>
     </w:p>
     <w:sectPr>

</xml_diff>

<commit_message>
refactor: migrate final local roots and preserve preview consumers
</commit_message>
<xml_diff>
--- a/human/project-review.docx
+++ b/human/project-review.docx
@@ -3058,7 +3058,7 @@
         <w:pStyle w:val="Heading1"/>
       </w:pPr>
       <w:r>
-        <w:t>待整理队列</w:t>
+        <w:t>逐包整理结果</w:t>
       </w:r>
     </w:p>
     <w:p>
@@ -3066,7 +3066,7 @@
         <w:keepNext/>
       </w:pPr>
       <w:r>
-        <w:t>已整理71包，待整理0包；根目录双层迁移未完成。下一项目录整体迁移。</w:t>
+        <w:t>已整理71包，待整理0包；根目录双层整理尚待整体完成审计。下一项当前总结刷新与整体完成审计。</w:t>
       </w:r>
     </w:p>
     <w:p>
@@ -3080,7 +3080,7 @@
     </w:p>
     <w:p>
       <w:r>
-        <w:t>实际迁移13/19项，尚余6项；整体迁移未完成。逐包整理不代替运行入口、生成器、历史原件及当前Word来源检查。</w:t>
+        <w:t>实际迁移19/19项，尚余0项；整体双层整理尚待整体完成审计。逐包整理不代替运行入口、生成器、历史原件及当前Word来源检查。</w:t>
       </w:r>
     </w:p>
     <w:p>
@@ -3115,7 +3115,22 @@
     </w:p>
     <w:p>
       <w:r>
-        <w:t>README_run.md → agent/archive/runtime/README_run.md</w:t>
+        <w:t>README_run.md → agent/archive/runtime/README_run.md；_archive → agent/archive/local</w:t>
+      </w:r>
+    </w:p>
+    <w:p>
+      <w:r>
+        <w:t>_worktrees → agent/local/worktrees；tmp → agent/local/tmp</w:t>
+      </w:r>
+    </w:p>
+    <w:p>
+      <w:r>
+        <w:t>.tools → agent/local/tools；.artifacts-local → agent/local/artifacts</w:t>
+      </w:r>
+    </w:p>
+    <w:p>
+      <w:r>
+        <w:t>.pytest_cache → agent/local/pytest-cache</w:t>
       </w:r>
     </w:p>
     <w:p>
@@ -3146,6 +3161,11 @@
     <w:p>
       <w:r>
         <w:t>共享Python、Unity和TD工程已实际迁入agent/modules，修正仓库定位、测试与启动路径。根Python635项、Unity EditMode105项及PlayMode4项通过；TD2025.32820隔离重开12项与UDP恢复8项通过。889个原文件与23个分发输入引用留存原始身份，签署和冻结快照不改写；当前文档链接随迁移修正。实际设备链、正式准入和研究结果仍不在本次验证范围。</w:t>
+      </w:r>
+    </w:p>
+    <w:p>
+      <w:r>
+        <w:t>六类本机目录已实际迁入Agent层，48件已跟踪样片逐字节保留；本机历史、工具、缓存和其他QA材料仍不发布。历史媒体配置通过当前读取入口解析新位置，不改原件或业务签收。V-04八项媒体门及800秒深度解码通过，根Python635项、60包专项通过；TD隔离重开12项和UDP恢复8项通过，五分发包61快照保持。根目录19/19已实际迁移，当前单包历史进度表述待从Agent源刷新；整体目标暂不标完成。</w:t>
       </w:r>
     </w:p>
     <w:sectPr>

</xml_diff>

<commit_message>
Finalize task package normalization and source-backed Word reviews
</commit_message>
<xml_diff>
--- a/human/project-review.docx
+++ b/human/project-review.docx
@@ -12,7 +12,7 @@
     </w:p>
     <w:p>
       <w:r>
-        <w:t>本文件由已整理包的Agent层总结串联生成。用于检查任务完成范围和下游交接；未整理包不推定已核验。</w:t>
+        <w:t>本文件由71包Agent层总结串联生成，检查实际交付、上下游衔接及项目偏离。规范化与任务业务状态分开；未完成的运行、研究和审批仍由原任务承担。</w:t>
       </w:r>
     </w:p>
     <w:p>
@@ -45,7 +45,7 @@
     </w:p>
     <w:p>
       <w:r>
-        <w:t>F01-N02 OPEN_PROJECT_MIGRATION：根目录旧业务目录仍待逐包归属与最终迁移</w:t>
+        <w:t>F01-N02 FIXED_PHYSICAL_ROOT_MIGRATION_AND_RUNTIME_CHECKS：19项根目录已实际迁入双层，当前运行消费者及Word来源经验证；业务状态不变</w:t>
       </w:r>
     </w:p>
     <w:p>
@@ -2499,7 +2499,7 @@
     </w:p>
     <w:p>
       <w:r>
-        <w:t>W04-N03 OPEN_ROOT_MIGRATION：逐包归档已执行，共享工程媒体治理等业务目录尚未整体迁入双层</w:t>
+        <w:t>W04-N03 FIXED_PHYSICAL_ROOT_MIGRATION_AND_RUNTIME_CHECKS：19项根目录已实际迁入双层，当前运行消费者及Word来源经验证；业务状态不变</w:t>
       </w:r>
     </w:p>
     <w:p>
@@ -2542,7 +2542,7 @@
     </w:p>
     <w:p>
       <w:r>
-        <w:t>U1201-N04 OPEN_ROOT_MIGRATION：共享治理、工程、资料等业务目录尚未整体迁入human/agent</w:t>
+        <w:t>U1201-N04 FIXED_PHYSICAL_ROOT_MIGRATION_AND_RUNTIME_CHECKS：19项根目录已实际迁入双层，当前运行消费者及Word来源经验证；业务状态不变</w:t>
       </w:r>
     </w:p>
     <w:p>
@@ -2585,7 +2585,7 @@
     </w:p>
     <w:p>
       <w:r>
-        <w:t>U1202-N04 OPEN_ROOT_MIGRATION：共享运行模块及资料尚未整体迁入双层</w:t>
+        <w:t>U1202-N04 FIXED_PHYSICAL_ROOT_MIGRATION_AND_RUNTIME_CHECKS：19项根目录已实际迁入双层，当前运行消费者及Word来源经验证；业务状态不变</w:t>
       </w:r>
     </w:p>
     <w:p>
@@ -2628,7 +2628,7 @@
     </w:p>
     <w:p>
       <w:r>
-        <w:t>U1203-N04 OPEN_ROOT_MIGRATION：旧根业务目录尚未整体迁入双层</w:t>
+        <w:t>U1203-N04 FIXED_PHYSICAL_ROOT_MIGRATION_AND_RUNTIME_CHECKS：19项根目录已实际迁入双层，当前运行消费者及Word来源经验证；业务状态不变</w:t>
       </w:r>
     </w:p>
     <w:p>
@@ -2676,7 +2676,7 @@
     </w:p>
     <w:p>
       <w:r>
-        <w:t>U1204-N05 OPEN_ROOT_MIGRATION：共享模块与旧根业务目录尚未整体迁入双层</w:t>
+        <w:t>U1204-N05 FIXED_PHYSICAL_ROOT_MIGRATION_AND_RUNTIME_CHECKS：19项根目录已实际迁入双层，当前运行消费者及Word来源经验证；业务状态不变</w:t>
       </w:r>
     </w:p>
     <w:p>
@@ -2719,7 +2719,7 @@
     </w:p>
     <w:p>
       <w:r>
-        <w:t>U1205-N04 OPEN_ROOT_MIGRATION：共享治理与旧根业务目录仍未整体迁入双层</w:t>
+        <w:t>U1205-N04 FIXED_PHYSICAL_ROOT_MIGRATION_AND_RUNTIME_CHECKS：19项根目录已实际迁入双层，当前运行消费者及Word来源经验证；业务状态不变</w:t>
       </w:r>
     </w:p>
     <w:p>
@@ -2767,7 +2767,7 @@
     </w:p>
     <w:p>
       <w:r>
-        <w:t>U1206-N05 OPEN_ROOT_MIGRATION：共享模块与旧根业务目录尚未整体迁入人类/Agent双层</w:t>
+        <w:t>U1206-N05 FIXED_PHYSICAL_ROOT_MIGRATION_AND_RUNTIME_CHECKS：19项根目录已实际迁入双层，当前运行消费者及Word来源经验证；业务状态不变</w:t>
       </w:r>
     </w:p>
     <w:p>
@@ -2815,7 +2815,7 @@
     </w:p>
     <w:p>
       <w:r>
-        <w:t>U1207-N04 OPEN_ROOT_MIGRATION：根共享治理及工程尚未全部迁入双层</w:t>
+        <w:t>U1207-N04 FIXED_PHYSICAL_ROOT_MIGRATION_AND_RUNTIME_CHECKS：19项根目录已实际迁入双层，当前运行消费者及Word来源经验证；业务状态不变</w:t>
       </w:r>
     </w:p>
     <w:p>
@@ -2858,7 +2858,7 @@
     </w:p>
     <w:p>
       <w:r>
-        <w:t>U1208-N04 OPEN_ROOT_MIGRATION：共享业务与旧根目录尚未整体迁入人类和Agent双层</w:t>
+        <w:t>U1208-N04 FIXED_PHYSICAL_ROOT_MIGRATION_AND_RUNTIME_CHECKS：19项根目录已实际迁入双层，当前运行消费者及Word来源经验证；业务状态不变</w:t>
       </w:r>
     </w:p>
     <w:p>
@@ -2906,7 +2906,7 @@
     </w:p>
     <w:p>
       <w:r>
-        <w:t>U1209-N05 OPEN_ROOT_MIGRATION：旧根业务与共享模块未整体迁入双层</w:t>
+        <w:t>U1209-N05 FIXED_PHYSICAL_ROOT_MIGRATION_AND_RUNTIME_CHECKS：19项根目录已实际迁入双层，当前运行消费者及Word来源经验证；业务状态不变</w:t>
       </w:r>
     </w:p>
     <w:p>
@@ -2954,7 +2954,7 @@
     </w:p>
     <w:p>
       <w:r>
-        <w:t>U1210-N05 OPEN_ROOT_MIGRATION：旧根业务与共享模块尚未整体迁入双层</w:t>
+        <w:t>U1210-N05 FIXED_PHYSICAL_ROOT_MIGRATION_AND_RUNTIME_CHECKS：19项根目录已实际迁入双层，当前运行消费者及Word来源经验证；业务状态不变</w:t>
       </w:r>
     </w:p>
     <w:p>
@@ -3002,7 +3002,7 @@
     </w:p>
     <w:p>
       <w:r>
-        <w:t>U1211-N05 OPEN_ROOT_MIGRATION：旧根业务与共享模块尚未整体迁入双层</w:t>
+        <w:t>U1211-N05 FIXED_PHYSICAL_ROOT_MIGRATION_AND_RUNTIME_CHECKS：19项根目录已实际迁入双层，当前运行消费者及Word来源经验证；业务状态不变</w:t>
       </w:r>
     </w:p>
     <w:p>
@@ -3050,7 +3050,7 @@
     </w:p>
     <w:p>
       <w:r>
-        <w:t>U1212-N05 OPEN_ROOT_MIGRATION：逐包71/71不替代旧业务目录整体迁移和运行验证</w:t>
+        <w:t>U1212-N05 FIXED_PHYSICAL_ROOT_MIGRATION_AND_RUNTIME_CHECKS：19项根目录已实际迁入双层，当前运行消费者及Word来源经验证；业务状态不变</w:t>
       </w:r>
     </w:p>
     <w:p>
@@ -3066,7 +3066,7 @@
         <w:keepNext/>
       </w:pPr>
       <w:r>
-        <w:t>已整理71包，待整理0包；根目录双层整理尚待整体完成审计。下一项当前总结刷新与整体完成审计。</w:t>
+        <w:t>已整理71包，待整理0包；根目录双层整理已完成并验证。下一项业务任务按注册表推进。</w:t>
       </w:r>
     </w:p>
     <w:p>
@@ -3080,7 +3080,7 @@
     </w:p>
     <w:p>
       <w:r>
-        <w:t>实际迁移19/19项，尚余0项；整体双层整理尚待整体完成审计。逐包整理不代替运行入口、生成器、历史原件及当前Word来源检查。</w:t>
+        <w:t>实际迁移19/19项，尚余0项；整体双层整理已完成并验证。逐包整理不代替运行入口、生成器、历史原件及当前Word来源检查。</w:t>
       </w:r>
     </w:p>
     <w:p>
@@ -3136,6 +3136,19 @@
     <w:p>
       <w:r>
         <w:t>旧框架及Mock/Spout手册已原样归档，当前人类概览位于human/project/README.md，运行入口位于agent/runtime/README.md。业务签署和进行中分发不因迁移而改变。</w:t>
+      </w:r>
+    </w:p>
+    <w:p>
+      <w:pPr>
+        <w:pStyle w:val="Heading2"/>
+      </w:pPr>
+      <w:r>
+        <w:t>迁移批次历史记录</w:t>
+      </w:r>
+    </w:p>
+    <w:p>
+      <w:r>
+        <w:t>以下为各批完成时的原始记录，其中下一步和未完成表述保留当时语境；当前结果以上方逐包整理结果及根目录归属表为准。</w:t>
       </w:r>
     </w:p>
     <w:p>

</xml_diff>